<commit_message>
kubernetes - objects file updated
</commit_message>
<xml_diff>
--- a/Kubernetes/3-objects.docx
+++ b/Kubernetes/3-objects.docx
@@ -333,47 +333,7 @@
           <w:sz w:val="32"/>
           <w:szCs w:val="32"/>
         </w:rPr>
-        <w:t>M</w:t>
-      </w:r>
-      <w:r>
-        <w:rPr>
-          <w:rFonts w:asciiTheme="majorBidi" w:hAnsiTheme="majorBidi" w:cstheme="majorBidi"/>
-          <w:b/>
-          <w:bCs/>
-          <w:sz w:val="32"/>
-          <w:szCs w:val="32"/>
-        </w:rPr>
-        <w:t>anifest</w:t>
-      </w:r>
-      <w:r>
-        <w:rPr>
-          <w:rFonts w:asciiTheme="majorBidi" w:hAnsiTheme="majorBidi" w:cstheme="majorBidi"/>
-          <w:b/>
-          <w:bCs/>
-          <w:sz w:val="32"/>
-          <w:szCs w:val="32"/>
-        </w:rPr>
-        <w:t xml:space="preserve"> </w:t>
-      </w:r>
-      <w:r>
-        <w:rPr>
-          <w:rFonts w:asciiTheme="majorBidi" w:hAnsiTheme="majorBidi" w:cstheme="majorBidi"/>
-          <w:b/>
-          <w:bCs/>
-          <w:sz w:val="32"/>
-          <w:szCs w:val="32"/>
-        </w:rPr>
-        <w:t>top‑level fields</w:t>
-      </w:r>
-      <w:r>
-        <w:rPr>
-          <w:rFonts w:asciiTheme="majorBidi" w:hAnsiTheme="majorBidi" w:cstheme="majorBidi"/>
-          <w:b/>
-          <w:bCs/>
-          <w:sz w:val="32"/>
-          <w:szCs w:val="32"/>
-        </w:rPr>
-        <w:t>:</w:t>
+        <w:t>Manifest top‑level fields:</w:t>
       </w:r>
     </w:p>
     <w:p>
@@ -1420,27 +1380,7 @@
           <w:szCs w:val="40"/>
         </w:rPr>
         <w:lastRenderedPageBreak/>
-        <w:t>N</w:t>
-      </w:r>
-      <w:r>
-        <w:rPr>
-          <w:rFonts w:asciiTheme="majorBidi" w:hAnsiTheme="majorBidi" w:cstheme="majorBidi"/>
-          <w:b/>
-          <w:bCs/>
-          <w:sz w:val="40"/>
-          <w:szCs w:val="40"/>
-        </w:rPr>
-        <w:t>amespace</w:t>
-      </w:r>
-      <w:r>
-        <w:rPr>
-          <w:rFonts w:asciiTheme="majorBidi" w:hAnsiTheme="majorBidi" w:cstheme="majorBidi"/>
-          <w:b/>
-          <w:bCs/>
-          <w:sz w:val="40"/>
-          <w:szCs w:val="40"/>
-        </w:rPr>
-        <w:t>:</w:t>
+        <w:t>Namespace:</w:t>
       </w:r>
     </w:p>
     <w:p>
@@ -1459,6 +1399,96 @@
           <w:szCs w:val="28"/>
         </w:rPr>
         <w:t>A namespace in Kubernetes is a mechanism used to logically divide a cluster into separate virtual environments so that resources can be organized and isolated.</w:t>
+      </w:r>
+    </w:p>
+    <w:p>
+      <w:pPr>
+        <w:spacing w:after="60"/>
+        <w:rPr>
+          <w:rFonts w:asciiTheme="majorBidi" w:hAnsiTheme="majorBidi" w:cstheme="majorBidi"/>
+          <w:sz w:val="28"/>
+          <w:szCs w:val="28"/>
+        </w:rPr>
+      </w:pPr>
+      <w:r>
+        <w:rPr>
+          <w:rFonts w:asciiTheme="majorBidi" w:hAnsiTheme="majorBidi" w:cstheme="majorBidi"/>
+          <w:sz w:val="28"/>
+          <w:szCs w:val="28"/>
+        </w:rPr>
+        <w:t xml:space="preserve">Namespaces allow a single Kubernetes cluster to be logically divided into multiple isolated environments, which is why instructors often describe them as creating “virtual clusters” inside a cluster. Each namespace acts like a separate workspace where resources such as Pods, Services, Deployments, </w:t>
+      </w:r>
+      <w:proofErr w:type="spellStart"/>
+      <w:r>
+        <w:rPr>
+          <w:rFonts w:asciiTheme="majorBidi" w:hAnsiTheme="majorBidi" w:cstheme="majorBidi"/>
+          <w:sz w:val="28"/>
+          <w:szCs w:val="28"/>
+        </w:rPr>
+        <w:t>ConfigMaps</w:t>
+      </w:r>
+      <w:proofErr w:type="spellEnd"/>
+      <w:r>
+        <w:rPr>
+          <w:rFonts w:asciiTheme="majorBidi" w:hAnsiTheme="majorBidi" w:cstheme="majorBidi"/>
+          <w:sz w:val="28"/>
+          <w:szCs w:val="28"/>
+        </w:rPr>
+        <w:t>, and Secrets exist independently from resources in other namespaces. This means different teams, applications, or environments (for example development, testing, and production) can operate in the same physical cluster without their resources interfering with each other.</w:t>
+      </w:r>
+    </w:p>
+    <w:p>
+      <w:pPr>
+        <w:spacing w:after="60"/>
+        <w:rPr>
+          <w:rFonts w:asciiTheme="majorBidi" w:hAnsiTheme="majorBidi" w:cstheme="majorBidi"/>
+          <w:sz w:val="28"/>
+          <w:szCs w:val="28"/>
+        </w:rPr>
+      </w:pPr>
+      <w:r>
+        <w:rPr>
+          <w:rFonts w:asciiTheme="majorBidi" w:hAnsiTheme="majorBidi" w:cstheme="majorBidi"/>
+          <w:sz w:val="28"/>
+          <w:szCs w:val="28"/>
+        </w:rPr>
+        <w:t xml:space="preserve">Although namespaces do not create a real separate cluster, they provide logical isolation. Kubernetes can enforce this isolation using mechanisms such as RBAC (role-based access control) to restrict who can access a namespace, </w:t>
+      </w:r>
+      <w:proofErr w:type="spellStart"/>
+      <w:r>
+        <w:rPr>
+          <w:rFonts w:asciiTheme="majorBidi" w:hAnsiTheme="majorBidi" w:cstheme="majorBidi"/>
+          <w:sz w:val="28"/>
+          <w:szCs w:val="28"/>
+        </w:rPr>
+        <w:t>ResourceQuota</w:t>
+      </w:r>
+      <w:proofErr w:type="spellEnd"/>
+      <w:r>
+        <w:rPr>
+          <w:rFonts w:asciiTheme="majorBidi" w:hAnsiTheme="majorBidi" w:cstheme="majorBidi"/>
+          <w:sz w:val="28"/>
+          <w:szCs w:val="28"/>
+        </w:rPr>
+        <w:t xml:space="preserve"> to limit how much CPU, memory, or storage a namespace can use, and </w:t>
+      </w:r>
+      <w:proofErr w:type="spellStart"/>
+      <w:r>
+        <w:rPr>
+          <w:rFonts w:asciiTheme="majorBidi" w:hAnsiTheme="majorBidi" w:cstheme="majorBidi"/>
+          <w:sz w:val="28"/>
+          <w:szCs w:val="28"/>
+        </w:rPr>
+        <w:t>NetworkPolicies</w:t>
+      </w:r>
+      <w:proofErr w:type="spellEnd"/>
+      <w:r>
+        <w:rPr>
+          <w:rFonts w:asciiTheme="majorBidi" w:hAnsiTheme="majorBidi" w:cstheme="majorBidi"/>
+          <w:sz w:val="28"/>
+          <w:szCs w:val="28"/>
+        </w:rPr>
+        <w:t xml:space="preserve"> to control communication between namespaces. Because of these controls, namespaces can behave similarly to independent clusters while still sharing the same underlying Kubernetes infrastructure.</w:t>
       </w:r>
     </w:p>
     <w:p>
@@ -1565,23 +1595,7 @@
           <w:sz w:val="28"/>
           <w:szCs w:val="28"/>
         </w:rPr>
-        <w:t>Resource names must be unique within the same namespace, but the same name can exist in different namespaces.</w:t>
-      </w:r>
-      <w:r>
-        <w:rPr>
-          <w:rFonts w:asciiTheme="majorBidi" w:hAnsiTheme="majorBidi" w:cstheme="majorBidi"/>
-          <w:sz w:val="28"/>
-          <w:szCs w:val="28"/>
-        </w:rPr>
-        <w:t xml:space="preserve"> </w:t>
-      </w:r>
-      <w:r>
-        <w:rPr>
-          <w:rFonts w:asciiTheme="majorBidi" w:hAnsiTheme="majorBidi" w:cstheme="majorBidi"/>
-          <w:sz w:val="28"/>
-          <w:szCs w:val="28"/>
-        </w:rPr>
-        <w:t xml:space="preserve">Two different namespaces can both have a Pod named </w:t>
+        <w:t xml:space="preserve">Resource names must be unique within the same namespace, but the same name can exist in different namespaces. Two different namespaces can both have a Pod named </w:t>
       </w:r>
       <w:proofErr w:type="spellStart"/>
       <w:r>
@@ -1968,23 +1982,7 @@
           <w:sz w:val="28"/>
           <w:szCs w:val="28"/>
         </w:rPr>
-        <w:t>Using a command</w:t>
-      </w:r>
-      <w:r>
-        <w:rPr>
-          <w:rFonts w:asciiTheme="majorBidi" w:hAnsiTheme="majorBidi" w:cstheme="majorBidi"/>
-          <w:sz w:val="28"/>
-          <w:szCs w:val="28"/>
-        </w:rPr>
-        <w:t xml:space="preserve"> </w:t>
-      </w:r>
-      <w:r>
-        <w:rPr>
-          <w:rFonts w:asciiTheme="majorBidi" w:hAnsiTheme="majorBidi" w:cstheme="majorBidi"/>
-          <w:sz w:val="28"/>
-          <w:szCs w:val="28"/>
-        </w:rPr>
-        <w:t xml:space="preserve">→ </w:t>
+        <w:t xml:space="preserve">Using a command → </w:t>
       </w:r>
       <w:proofErr w:type="spellStart"/>
       <w:r>
@@ -2030,23 +2028,41 @@
       <w:r>
         <w:rPr>
           <w:rFonts w:asciiTheme="majorBidi" w:hAnsiTheme="majorBidi" w:cstheme="majorBidi"/>
+          <w:sz w:val="28"/>
+          <w:szCs w:val="28"/>
+        </w:rPr>
+        <w:t>Using a manifest file:</w:t>
+      </w:r>
+    </w:p>
+    <w:p>
+      <w:pPr>
+        <w:rPr>
+          <w:rFonts w:asciiTheme="majorBidi" w:hAnsiTheme="majorBidi" w:cstheme="majorBidi"/>
+          <w:sz w:val="28"/>
+          <w:szCs w:val="28"/>
+        </w:rPr>
+      </w:pPr>
+      <w:r>
+        <w:rPr>
+          <w:rFonts w:asciiTheme="majorBidi" w:hAnsiTheme="majorBidi" w:cstheme="majorBidi"/>
           <w:noProof/>
           <w:sz w:val="28"/>
           <w:szCs w:val="28"/>
         </w:rPr>
+        <w:lastRenderedPageBreak/>
         <mc:AlternateContent>
           <mc:Choice Requires="wps">
             <w:drawing>
-              <wp:anchor distT="0" distB="0" distL="114300" distR="114300" simplePos="0" relativeHeight="251659264" behindDoc="0" locked="0" layoutInCell="1" allowOverlap="1" wp14:anchorId="7EB8A059" wp14:editId="6891AB9F">
+              <wp:anchor distT="0" distB="0" distL="114300" distR="114300" simplePos="0" relativeHeight="251659264" behindDoc="0" locked="0" layoutInCell="1" allowOverlap="1" wp14:anchorId="7EB8A059" wp14:editId="7596B5DA">
                 <wp:simplePos x="0" y="0"/>
                 <wp:positionH relativeFrom="column">
-                  <wp:posOffset>236220</wp:posOffset>
+                  <wp:posOffset>259080</wp:posOffset>
                 </wp:positionH>
                 <wp:positionV relativeFrom="paragraph">
-                  <wp:posOffset>306705</wp:posOffset>
+                  <wp:posOffset>0</wp:posOffset>
                 </wp:positionV>
-                <wp:extent cx="2552700" cy="1059180"/>
-                <wp:effectExtent l="0" t="0" r="19050" b="26670"/>
+                <wp:extent cx="2552700" cy="1005840"/>
+                <wp:effectExtent l="0" t="0" r="19050" b="22860"/>
                 <wp:wrapNone/>
                 <wp:docPr id="1388763638" name="Rectangle 1"/>
                 <wp:cNvGraphicFramePr/>
@@ -2057,7 +2073,7 @@
                       <wps:spPr>
                         <a:xfrm>
                           <a:off x="0" y="0"/>
-                          <a:ext cx="2552700" cy="1059180"/>
+                          <a:ext cx="2552700" cy="1005840"/>
                         </a:xfrm>
                         <a:prstGeom prst="rect">
                           <a:avLst/>
@@ -2245,7 +2261,7 @@
           </mc:Choice>
           <mc:Fallback>
             <w:pict>
-              <v:rect w14:anchorId="7EB8A059" id="Rectangle 1" o:spid="_x0000_s1026" style="position:absolute;left:0;text-align:left;margin-left:18.6pt;margin-top:24.15pt;width:201pt;height:83.4pt;z-index:251659264;visibility:visible;mso-wrap-style:square;mso-width-percent:0;mso-height-percent:0;mso-wrap-distance-left:9pt;mso-wrap-distance-top:0;mso-wrap-distance-right:9pt;mso-wrap-distance-bottom:0;mso-position-horizontal:absolute;mso-position-horizontal-relative:text;mso-position-vertical:absolute;mso-position-vertical-relative:text;mso-width-percent:0;mso-height-percent:0;mso-width-relative:margin;mso-height-relative:margin;v-text-anchor:middle" o:gfxdata="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" fillcolor="black [3200]" strokecolor="black [480]" strokeweight="1pt">
+              <v:rect w14:anchorId="7EB8A059" id="Rectangle 1" o:spid="_x0000_s1026" style="position:absolute;margin-left:20.4pt;margin-top:0;width:201pt;height:79.2pt;z-index:251659264;visibility:visible;mso-wrap-style:square;mso-width-percent:0;mso-height-percent:0;mso-wrap-distance-left:9pt;mso-wrap-distance-top:0;mso-wrap-distance-right:9pt;mso-wrap-distance-bottom:0;mso-position-horizontal:absolute;mso-position-horizontal-relative:text;mso-position-vertical:absolute;mso-position-vertical-relative:text;mso-width-percent:0;mso-height-percent:0;mso-width-relative:margin;mso-height-relative:margin;v-text-anchor:middle" o:gfxdata="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" fillcolor="black [3200]" strokecolor="black [480]" strokeweight="1pt">
                 <v:textbox>
                   <w:txbxContent>
                     <w:p>
@@ -2397,23 +2413,6 @@
           </mc:Fallback>
         </mc:AlternateContent>
       </w:r>
-      <w:r>
-        <w:rPr>
-          <w:rFonts w:asciiTheme="majorBidi" w:hAnsiTheme="majorBidi" w:cstheme="majorBidi"/>
-          <w:sz w:val="28"/>
-          <w:szCs w:val="28"/>
-        </w:rPr>
-        <w:t>Using a manifest file:</w:t>
-      </w:r>
-    </w:p>
-    <w:p>
-      <w:pPr>
-        <w:rPr>
-          <w:rFonts w:asciiTheme="majorBidi" w:hAnsiTheme="majorBidi" w:cstheme="majorBidi"/>
-          <w:sz w:val="28"/>
-          <w:szCs w:val="28"/>
-        </w:rPr>
-      </w:pPr>
     </w:p>
     <w:p>
       <w:pPr>
@@ -2697,23 +2696,7 @@
           <w:sz w:val="28"/>
           <w:szCs w:val="28"/>
         </w:rPr>
-        <w:t>To list all namespaces in the cluster</w:t>
-      </w:r>
-      <w:r>
-        <w:rPr>
-          <w:rFonts w:asciiTheme="majorBidi" w:hAnsiTheme="majorBidi" w:cstheme="majorBidi"/>
-          <w:sz w:val="28"/>
-          <w:szCs w:val="28"/>
-        </w:rPr>
-        <w:t xml:space="preserve"> </w:t>
-      </w:r>
-      <w:r>
-        <w:rPr>
-          <w:rFonts w:asciiTheme="majorBidi" w:hAnsiTheme="majorBidi" w:cstheme="majorBidi"/>
-          <w:sz w:val="28"/>
-          <w:szCs w:val="28"/>
-        </w:rPr>
-        <w:t xml:space="preserve">→ </w:t>
+        <w:t xml:space="preserve">To list all namespaces in the cluster → </w:t>
       </w:r>
       <w:proofErr w:type="spellStart"/>
       <w:r>
@@ -2796,31 +2779,7 @@
           <w:sz w:val="28"/>
           <w:szCs w:val="28"/>
         </w:rPr>
-        <w:t>To see resources inside a specific namespace, use the -n or --namespace flag.</w:t>
-      </w:r>
-      <w:r>
-        <w:rPr>
-          <w:rFonts w:asciiTheme="majorBidi" w:hAnsiTheme="majorBidi" w:cstheme="majorBidi"/>
-          <w:sz w:val="28"/>
-          <w:szCs w:val="28"/>
-        </w:rPr>
-        <w:t xml:space="preserve"> </w:t>
-      </w:r>
-      <w:r>
-        <w:rPr>
-          <w:rFonts w:asciiTheme="majorBidi" w:hAnsiTheme="majorBidi" w:cstheme="majorBidi"/>
-          <w:sz w:val="28"/>
-          <w:szCs w:val="28"/>
-        </w:rPr>
-        <w:t>Example</w:t>
-      </w:r>
-      <w:r>
-        <w:rPr>
-          <w:rFonts w:asciiTheme="majorBidi" w:hAnsiTheme="majorBidi" w:cstheme="majorBidi"/>
-          <w:sz w:val="28"/>
-          <w:szCs w:val="28"/>
-        </w:rPr>
-        <w:t>:</w:t>
+        <w:t>To see resources inside a specific namespace, use the -n or --namespace flag. Example:</w:t>
       </w:r>
       <w:r>
         <w:rPr>
@@ -2877,32 +2836,7 @@
           <w:sz w:val="28"/>
           <w:szCs w:val="28"/>
         </w:rPr>
-        <w:lastRenderedPageBreak/>
-        <w:t xml:space="preserve">For </w:t>
-      </w:r>
-      <w:r>
-        <w:rPr>
-          <w:rFonts w:asciiTheme="majorBidi" w:hAnsiTheme="majorBidi" w:cstheme="majorBidi"/>
-          <w:sz w:val="28"/>
-          <w:szCs w:val="28"/>
-        </w:rPr>
-        <w:t>Viewing All Resources in a Namespace</w:t>
-      </w:r>
-      <w:r>
-        <w:rPr>
-          <w:rFonts w:asciiTheme="majorBidi" w:hAnsiTheme="majorBidi" w:cstheme="majorBidi"/>
-          <w:sz w:val="28"/>
-          <w:szCs w:val="28"/>
-        </w:rPr>
-        <w:t xml:space="preserve"> </w:t>
-      </w:r>
-      <w:r>
-        <w:rPr>
-          <w:rFonts w:asciiTheme="majorBidi" w:hAnsiTheme="majorBidi" w:cstheme="majorBidi"/>
-          <w:sz w:val="28"/>
-          <w:szCs w:val="28"/>
-        </w:rPr>
-        <w:t xml:space="preserve">→ </w:t>
+        <w:t xml:space="preserve">For Viewing All Resources in a Namespace → </w:t>
       </w:r>
       <w:proofErr w:type="spellStart"/>
       <w:r>
@@ -3701,6 +3635,7 @@
     </w:p>
     <w:p>
       <w:pPr>
+        <w:spacing w:after="120"/>
         <w:rPr>
           <w:rFonts w:asciiTheme="majorBidi" w:hAnsiTheme="majorBidi" w:cstheme="majorBidi"/>
           <w:b/>
@@ -3784,6 +3719,7 @@
     </w:p>
     <w:p>
       <w:pPr>
+        <w:spacing w:after="60"/>
         <w:rPr>
           <w:rFonts w:asciiTheme="majorBidi" w:hAnsiTheme="majorBidi" w:cstheme="majorBidi"/>
           <w:sz w:val="28"/>
@@ -3801,6 +3737,7 @@
           <w:sz w:val="28"/>
           <w:szCs w:val="28"/>
         </w:rPr>
+        <w:lastRenderedPageBreak/>
         <w:t>kubectl</w:t>
       </w:r>
       <w:proofErr w:type="spellEnd"/>

</xml_diff>

<commit_message>
kubernetes - kubectl & objects file created
</commit_message>
<xml_diff>
--- a/Kubernetes/3-objects.docx
+++ b/Kubernetes/3-objects.docx
@@ -10311,31 +10311,7 @@
                                 <w:sz w:val="28"/>
                                 <w:szCs w:val="28"/>
                               </w:rPr>
-                              <w:t xml:space="preserve">        </w:t>
-                            </w:r>
-                            <w:r>
-                              <w:rPr>
-                                <w:rFonts w:asciiTheme="majorBidi" w:hAnsiTheme="majorBidi" w:cstheme="majorBidi"/>
-                                <w:b/>
-                                <w:bCs/>
-                                <w:i/>
-                                <w:iCs/>
-                                <w:sz w:val="28"/>
-                                <w:szCs w:val="28"/>
-                              </w:rPr>
-                              <w:t>-</w:t>
-                            </w:r>
-                            <w:r>
-                              <w:rPr>
-                                <w:rFonts w:asciiTheme="majorBidi" w:hAnsiTheme="majorBidi" w:cstheme="majorBidi"/>
-                                <w:b/>
-                                <w:bCs/>
-                                <w:i/>
-                                <w:iCs/>
-                                <w:sz w:val="28"/>
-                                <w:szCs w:val="28"/>
-                              </w:rPr>
-                              <w:t xml:space="preserve"> </w:t>
+                              <w:t xml:space="preserve">        - </w:t>
                             </w:r>
                             <w:r>
                               <w:rPr>
@@ -10465,31 +10441,7 @@
                                 <w:sz w:val="28"/>
                                 <w:szCs w:val="28"/>
                               </w:rPr>
-                              <w:t xml:space="preserve">             </w:t>
-                            </w:r>
-                            <w:r>
-                              <w:rPr>
-                                <w:rFonts w:asciiTheme="majorBidi" w:hAnsiTheme="majorBidi" w:cstheme="majorBidi"/>
-                                <w:b/>
-                                <w:bCs/>
-                                <w:i/>
-                                <w:iCs/>
-                                <w:sz w:val="28"/>
-                                <w:szCs w:val="28"/>
-                              </w:rPr>
-                              <w:t>-</w:t>
-                            </w:r>
-                            <w:r>
-                              <w:rPr>
-                                <w:rFonts w:asciiTheme="majorBidi" w:hAnsiTheme="majorBidi" w:cstheme="majorBidi"/>
-                                <w:b/>
-                                <w:bCs/>
-                                <w:i/>
-                                <w:iCs/>
-                                <w:sz w:val="28"/>
-                                <w:szCs w:val="28"/>
-                              </w:rPr>
-                              <w:t xml:space="preserve"> </w:t>
+                              <w:t xml:space="preserve">             - </w:t>
                             </w:r>
                             <w:proofErr w:type="spellStart"/>
                             <w:r>
@@ -10848,31 +10800,7 @@
                           <w:sz w:val="28"/>
                           <w:szCs w:val="28"/>
                         </w:rPr>
-                        <w:t xml:space="preserve">        </w:t>
-                      </w:r>
-                      <w:r>
-                        <w:rPr>
-                          <w:rFonts w:asciiTheme="majorBidi" w:hAnsiTheme="majorBidi" w:cstheme="majorBidi"/>
-                          <w:b/>
-                          <w:bCs/>
-                          <w:i/>
-                          <w:iCs/>
-                          <w:sz w:val="28"/>
-                          <w:szCs w:val="28"/>
-                        </w:rPr>
-                        <w:t>-</w:t>
-                      </w:r>
-                      <w:r>
-                        <w:rPr>
-                          <w:rFonts w:asciiTheme="majorBidi" w:hAnsiTheme="majorBidi" w:cstheme="majorBidi"/>
-                          <w:b/>
-                          <w:bCs/>
-                          <w:i/>
-                          <w:iCs/>
-                          <w:sz w:val="28"/>
-                          <w:szCs w:val="28"/>
-                        </w:rPr>
-                        <w:t xml:space="preserve"> </w:t>
+                        <w:t xml:space="preserve">        - </w:t>
                       </w:r>
                       <w:r>
                         <w:rPr>
@@ -11002,31 +10930,7 @@
                           <w:sz w:val="28"/>
                           <w:szCs w:val="28"/>
                         </w:rPr>
-                        <w:t xml:space="preserve">             </w:t>
-                      </w:r>
-                      <w:r>
-                        <w:rPr>
-                          <w:rFonts w:asciiTheme="majorBidi" w:hAnsiTheme="majorBidi" w:cstheme="majorBidi"/>
-                          <w:b/>
-                          <w:bCs/>
-                          <w:i/>
-                          <w:iCs/>
-                          <w:sz w:val="28"/>
-                          <w:szCs w:val="28"/>
-                        </w:rPr>
-                        <w:t>-</w:t>
-                      </w:r>
-                      <w:r>
-                        <w:rPr>
-                          <w:rFonts w:asciiTheme="majorBidi" w:hAnsiTheme="majorBidi" w:cstheme="majorBidi"/>
-                          <w:b/>
-                          <w:bCs/>
-                          <w:i/>
-                          <w:iCs/>
-                          <w:sz w:val="28"/>
-                          <w:szCs w:val="28"/>
-                        </w:rPr>
-                        <w:t xml:space="preserve"> </w:t>
+                        <w:t xml:space="preserve">             - </w:t>
                       </w:r>
                       <w:proofErr w:type="spellStart"/>
                       <w:r>
@@ -11856,7 +11760,7 @@
           <w:sz w:val="32"/>
           <w:szCs w:val="32"/>
         </w:rPr>
-        <w:t>C</w:t>
+        <w:t>Characteristics</w:t>
       </w:r>
       <w:r>
         <w:rPr>
@@ -11866,61 +11770,7 @@
           <w:sz w:val="32"/>
           <w:szCs w:val="32"/>
         </w:rPr>
-        <w:t>haracteristics</w:t>
-      </w:r>
-      <w:r>
-        <w:rPr>
-          <w:rFonts w:asciiTheme="majorBidi" w:hAnsiTheme="majorBidi" w:cstheme="majorBidi"/>
-          <w:b/>
-          <w:bCs/>
-          <w:sz w:val="32"/>
-          <w:szCs w:val="32"/>
-        </w:rPr>
         <w:t>:</w:t>
-      </w:r>
-    </w:p>
-    <w:p>
-      <w:pPr>
-        <w:pStyle w:val="ListParagraph"/>
-        <w:numPr>
-          <w:ilvl w:val="0"/>
-          <w:numId w:val="30"/>
-        </w:numPr>
-        <w:ind w:left="504"/>
-        <w:jc w:val="both"/>
-        <w:rPr>
-          <w:rFonts w:asciiTheme="majorBidi" w:hAnsiTheme="majorBidi" w:cstheme="majorBidi"/>
-          <w:sz w:val="28"/>
-          <w:szCs w:val="28"/>
-        </w:rPr>
-      </w:pPr>
-      <w:r>
-        <w:rPr>
-          <w:rFonts w:asciiTheme="majorBidi" w:hAnsiTheme="majorBidi" w:cstheme="majorBidi"/>
-          <w:b/>
-          <w:bCs/>
-          <w:sz w:val="28"/>
-          <w:szCs w:val="28"/>
-        </w:rPr>
-        <w:t>Sequential execution</w:t>
-      </w:r>
-      <w:r>
-        <w:rPr>
-          <w:rFonts w:asciiTheme="majorBidi" w:hAnsiTheme="majorBidi" w:cstheme="majorBidi"/>
-          <w:b/>
-          <w:bCs/>
-          <w:sz w:val="28"/>
-          <w:szCs w:val="28"/>
-        </w:rPr>
-        <w:t>:</w:t>
-      </w:r>
-      <w:r>
-        <w:rPr>
-          <w:rFonts w:asciiTheme="majorBidi" w:hAnsiTheme="majorBidi" w:cstheme="majorBidi"/>
-          <w:sz w:val="28"/>
-          <w:szCs w:val="28"/>
-        </w:rPr>
-        <w:t xml:space="preserve"> means Init Containers run one after another in a defined order. If a Pod has multiple Init Containers, Kubernetes starts the first one and waits until it finishes successfully. Only after it completes does the second Init Container start. The main application containers will not start until all Init Containers have finished successfully.</w:t>
       </w:r>
     </w:p>
     <w:p>
@@ -11946,25 +11796,15 @@
           <w:sz w:val="28"/>
           <w:szCs w:val="28"/>
         </w:rPr>
-        <w:t>One‑time execution</w:t>
-      </w:r>
-      <w:r>
-        <w:rPr>
-          <w:rFonts w:asciiTheme="majorBidi" w:hAnsiTheme="majorBidi" w:cstheme="majorBidi"/>
-          <w:b/>
-          <w:bCs/>
-          <w:sz w:val="28"/>
-          <w:szCs w:val="28"/>
-        </w:rPr>
-        <w:t>:</w:t>
-      </w:r>
-      <w:r>
-        <w:rPr>
-          <w:rFonts w:asciiTheme="majorBidi" w:hAnsiTheme="majorBidi" w:cstheme="majorBidi"/>
-          <w:sz w:val="28"/>
-          <w:szCs w:val="28"/>
-        </w:rPr>
-        <w:t xml:space="preserve"> means an Init Container runs only during Pod initialization. It performs its task and then exits. After it completes successfully, it does not run again during the normal life of the Pod. Its purpose is only to prepare the environment before the main containers start.</w:t>
+        <w:t>Sequential execution:</w:t>
+      </w:r>
+      <w:r>
+        <w:rPr>
+          <w:rFonts w:asciiTheme="majorBidi" w:hAnsiTheme="majorBidi" w:cstheme="majorBidi"/>
+          <w:sz w:val="28"/>
+          <w:szCs w:val="28"/>
+        </w:rPr>
+        <w:t xml:space="preserve"> means Init Containers run one after another in a defined order. If a Pod has multiple Init Containers, Kubernetes starts the first one and waits until it finishes successfully. Only after it completes does the second Init Container start. The main application containers will not start until all Init Containers have finished successfully.</w:t>
       </w:r>
     </w:p>
     <w:p>
@@ -11990,25 +11830,15 @@
           <w:sz w:val="28"/>
           <w:szCs w:val="28"/>
         </w:rPr>
-        <w:t>Independence from the main container</w:t>
-      </w:r>
-      <w:r>
-        <w:rPr>
-          <w:rFonts w:asciiTheme="majorBidi" w:hAnsiTheme="majorBidi" w:cstheme="majorBidi"/>
-          <w:b/>
-          <w:bCs/>
-          <w:sz w:val="28"/>
-          <w:szCs w:val="28"/>
-        </w:rPr>
-        <w:t>:</w:t>
-      </w:r>
-      <w:r>
-        <w:rPr>
-          <w:rFonts w:asciiTheme="majorBidi" w:hAnsiTheme="majorBidi" w:cstheme="majorBidi"/>
-          <w:sz w:val="28"/>
-          <w:szCs w:val="28"/>
-        </w:rPr>
-        <w:t xml:space="preserve"> means Init Containers can use different container images, tools, or dependencies than the main application container. This is useful because the main container can stay small and focused on running the application, while the Init Container can include tools such as scripts, utilities, or debugging tools that are only needed during the setup phase.</w:t>
+        <w:t>One‑time execution:</w:t>
+      </w:r>
+      <w:r>
+        <w:rPr>
+          <w:rFonts w:asciiTheme="majorBidi" w:hAnsiTheme="majorBidi" w:cstheme="majorBidi"/>
+          <w:sz w:val="28"/>
+          <w:szCs w:val="28"/>
+        </w:rPr>
+        <w:t xml:space="preserve"> means an Init Container runs only during Pod initialization. It performs its task and then exits. After it completes successfully, it does not run again during the normal life of the Pod. Its purpose is only to prepare the environment before the main containers start.</w:t>
       </w:r>
     </w:p>
     <w:p>
@@ -12034,6 +11864,40 @@
           <w:sz w:val="28"/>
           <w:szCs w:val="28"/>
         </w:rPr>
+        <w:t>Independence from the main container:</w:t>
+      </w:r>
+      <w:r>
+        <w:rPr>
+          <w:rFonts w:asciiTheme="majorBidi" w:hAnsiTheme="majorBidi" w:cstheme="majorBidi"/>
+          <w:sz w:val="28"/>
+          <w:szCs w:val="28"/>
+        </w:rPr>
+        <w:t xml:space="preserve"> means Init Containers can use different container images, tools, or dependencies than the main application container. This is useful because the main container can stay small and focused on running the application, while the Init Container can include tools such as scripts, utilities, or debugging tools that are only needed during the setup phase.</w:t>
+      </w:r>
+    </w:p>
+    <w:p>
+      <w:pPr>
+        <w:pStyle w:val="ListParagraph"/>
+        <w:numPr>
+          <w:ilvl w:val="0"/>
+          <w:numId w:val="30"/>
+        </w:numPr>
+        <w:ind w:left="360"/>
+        <w:jc w:val="both"/>
+        <w:rPr>
+          <w:rFonts w:asciiTheme="majorBidi" w:hAnsiTheme="majorBidi" w:cstheme="majorBidi"/>
+          <w:sz w:val="28"/>
+          <w:szCs w:val="28"/>
+        </w:rPr>
+      </w:pPr>
+      <w:r>
+        <w:rPr>
+          <w:rFonts w:asciiTheme="majorBidi" w:hAnsiTheme="majorBidi" w:cstheme="majorBidi"/>
+          <w:b/>
+          <w:bCs/>
+          <w:sz w:val="28"/>
+          <w:szCs w:val="28"/>
+        </w:rPr>
         <w:lastRenderedPageBreak/>
         <w:t>Environment Preparation:</w:t>
       </w:r>
@@ -12043,15 +11907,7 @@
           <w:sz w:val="28"/>
           <w:szCs w:val="28"/>
         </w:rPr>
-        <w:t xml:space="preserve"> </w:t>
-      </w:r>
-      <w:r>
-        <w:rPr>
-          <w:rFonts w:asciiTheme="majorBidi" w:hAnsiTheme="majorBidi" w:cstheme="majorBidi"/>
-          <w:sz w:val="28"/>
-          <w:szCs w:val="28"/>
-        </w:rPr>
-        <w:t>Environment preparation is the most common use case. Init Containers prepare everything the main container needs before it starts running. For example, they can download required data, generate configuration files, perform database checks, wait for another service to become available, or verify that certain conditions in the system are satisfied. Once these preparation tasks are complete, the main container starts in a properly configured environment.</w:t>
+        <w:t xml:space="preserve"> Environment preparation is the most common use case. Init Containers prepare everything the main container needs before it starts running. For example, they can download required data, generate configuration files, perform database checks, wait for another service to become available, or verify that certain conditions in the system are satisfied. Once these preparation tasks are complete, the main container starts in a properly configured environment.</w:t>
       </w:r>
     </w:p>
     <w:p>
@@ -12861,19 +12717,7 @@
                                 <w:sz w:val="28"/>
                                 <w:szCs w:val="28"/>
                               </w:rPr>
-                              <w:t xml:space="preserve">     </w:t>
-                            </w:r>
-                            <w:r>
-                              <w:rPr>
-                                <w:rFonts w:asciiTheme="majorBidi" w:hAnsiTheme="majorBidi" w:cstheme="majorBidi"/>
-                                <w:b/>
-                                <w:bCs/>
-                                <w:i/>
-                                <w:iCs/>
-                                <w:sz w:val="28"/>
-                                <w:szCs w:val="28"/>
-                              </w:rPr>
-                              <w:t>name: webapp-pod</w:t>
+                              <w:t xml:space="preserve">     name: webapp-pod</w:t>
                             </w:r>
                           </w:p>
                           <w:p>
@@ -13041,19 +12885,7 @@
                                 <w:sz w:val="28"/>
                                 <w:szCs w:val="28"/>
                               </w:rPr>
-                              <w:t xml:space="preserve">          </w:t>
-                            </w:r>
-                            <w:r>
-                              <w:rPr>
-                                <w:rFonts w:asciiTheme="majorBidi" w:hAnsiTheme="majorBidi" w:cstheme="majorBidi"/>
-                                <w:b/>
-                                <w:bCs/>
-                                <w:i/>
-                                <w:iCs/>
-                                <w:sz w:val="28"/>
-                                <w:szCs w:val="28"/>
-                              </w:rPr>
-                              <w:t xml:space="preserve">  </w:t>
+                              <w:t xml:space="preserve">            </w:t>
                             </w:r>
                             <w:r>
                               <w:rPr>
@@ -13105,19 +12937,7 @@
                                 <w:sz w:val="28"/>
                                 <w:szCs w:val="28"/>
                               </w:rPr>
-                              <w:t xml:space="preserve">          </w:t>
-                            </w:r>
-                            <w:r>
-                              <w:rPr>
-                                <w:rFonts w:asciiTheme="majorBidi" w:hAnsiTheme="majorBidi" w:cstheme="majorBidi"/>
-                                <w:b/>
-                                <w:bCs/>
-                                <w:i/>
-                                <w:iCs/>
-                                <w:sz w:val="28"/>
-                                <w:szCs w:val="28"/>
-                              </w:rPr>
-                              <w:t xml:space="preserve">  </w:t>
+                              <w:t xml:space="preserve">            </w:t>
                             </w:r>
                             <w:r>
                               <w:rPr>
@@ -13257,19 +13077,7 @@
                                 <w:sz w:val="28"/>
                                 <w:szCs w:val="28"/>
                               </w:rPr>
-                              <w:t xml:space="preserve">          </w:t>
-                            </w:r>
-                            <w:r>
-                              <w:rPr>
-                                <w:rFonts w:asciiTheme="majorBidi" w:hAnsiTheme="majorBidi" w:cstheme="majorBidi"/>
-                                <w:b/>
-                                <w:bCs/>
-                                <w:i/>
-                                <w:iCs/>
-                                <w:sz w:val="28"/>
-                                <w:szCs w:val="28"/>
-                              </w:rPr>
-                              <w:t xml:space="preserve">  </w:t>
+                              <w:t xml:space="preserve">            </w:t>
                             </w:r>
                             <w:r>
                               <w:rPr>
@@ -13436,19 +13244,7 @@
                           <w:sz w:val="28"/>
                           <w:szCs w:val="28"/>
                         </w:rPr>
-                        <w:t xml:space="preserve">     </w:t>
-                      </w:r>
-                      <w:r>
-                        <w:rPr>
-                          <w:rFonts w:asciiTheme="majorBidi" w:hAnsiTheme="majorBidi" w:cstheme="majorBidi"/>
-                          <w:b/>
-                          <w:bCs/>
-                          <w:i/>
-                          <w:iCs/>
-                          <w:sz w:val="28"/>
-                          <w:szCs w:val="28"/>
-                        </w:rPr>
-                        <w:t>name: webapp-pod</w:t>
+                        <w:t xml:space="preserve">     name: webapp-pod</w:t>
                       </w:r>
                     </w:p>
                     <w:p>
@@ -13616,19 +13412,7 @@
                           <w:sz w:val="28"/>
                           <w:szCs w:val="28"/>
                         </w:rPr>
-                        <w:t xml:space="preserve">          </w:t>
-                      </w:r>
-                      <w:r>
-                        <w:rPr>
-                          <w:rFonts w:asciiTheme="majorBidi" w:hAnsiTheme="majorBidi" w:cstheme="majorBidi"/>
-                          <w:b/>
-                          <w:bCs/>
-                          <w:i/>
-                          <w:iCs/>
-                          <w:sz w:val="28"/>
-                          <w:szCs w:val="28"/>
-                        </w:rPr>
-                        <w:t xml:space="preserve">  </w:t>
+                        <w:t xml:space="preserve">            </w:t>
                       </w:r>
                       <w:r>
                         <w:rPr>
@@ -13680,19 +13464,7 @@
                           <w:sz w:val="28"/>
                           <w:szCs w:val="28"/>
                         </w:rPr>
-                        <w:t xml:space="preserve">          </w:t>
-                      </w:r>
-                      <w:r>
-                        <w:rPr>
-                          <w:rFonts w:asciiTheme="majorBidi" w:hAnsiTheme="majorBidi" w:cstheme="majorBidi"/>
-                          <w:b/>
-                          <w:bCs/>
-                          <w:i/>
-                          <w:iCs/>
-                          <w:sz w:val="28"/>
-                          <w:szCs w:val="28"/>
-                        </w:rPr>
-                        <w:t xml:space="preserve">  </w:t>
+                        <w:t xml:space="preserve">            </w:t>
                       </w:r>
                       <w:r>
                         <w:rPr>
@@ -13832,19 +13604,7 @@
                           <w:sz w:val="28"/>
                           <w:szCs w:val="28"/>
                         </w:rPr>
-                        <w:t xml:space="preserve">          </w:t>
-                      </w:r>
-                      <w:r>
-                        <w:rPr>
-                          <w:rFonts w:asciiTheme="majorBidi" w:hAnsiTheme="majorBidi" w:cstheme="majorBidi"/>
-                          <w:b/>
-                          <w:bCs/>
-                          <w:i/>
-                          <w:iCs/>
-                          <w:sz w:val="28"/>
-                          <w:szCs w:val="28"/>
-                        </w:rPr>
-                        <w:t xml:space="preserve">  </w:t>
+                        <w:t xml:space="preserve">            </w:t>
                       </w:r>
                       <w:r>
                         <w:rPr>
@@ -13886,16 +13646,7 @@
           <w:szCs w:val="28"/>
           <w:u w:val="single"/>
         </w:rPr>
-        <w:t>Example Manifest with Init Containers</w:t>
-      </w:r>
-      <w:r>
-        <w:rPr>
-          <w:rFonts w:asciiTheme="majorBidi" w:hAnsiTheme="majorBidi" w:cstheme="majorBidi"/>
-          <w:sz w:val="28"/>
-          <w:szCs w:val="28"/>
-          <w:u w:val="single"/>
-        </w:rPr>
-        <w:t>:</w:t>
+        <w:t>Example Manifest with Init Containers:</w:t>
       </w:r>
     </w:p>
     <w:p>
@@ -14013,6 +13764,7 @@
     </w:p>
     <w:p>
       <w:pPr>
+        <w:spacing w:after="120"/>
         <w:jc w:val="both"/>
         <w:rPr>
           <w:rFonts w:asciiTheme="majorBidi" w:hAnsiTheme="majorBidi" w:cstheme="majorBidi"/>
@@ -14274,8 +14026,17 @@
     </w:p>
     <w:p>
       <w:pPr>
+        <w:spacing w:after="120"/>
         <w:ind w:left="360"/>
         <w:jc w:val="both"/>
+        <w:rPr>
+          <w:rFonts w:asciiTheme="majorBidi" w:hAnsiTheme="majorBidi" w:cstheme="majorBidi"/>
+          <w:sz w:val="28"/>
+          <w:szCs w:val="28"/>
+        </w:rPr>
+      </w:pPr>
+      <w:proofErr w:type="spellStart"/>
+      <w:r>
         <w:rPr>
           <w:rFonts w:asciiTheme="majorBidi" w:hAnsiTheme="majorBidi" w:cstheme="majorBidi"/>
           <w:b/>
@@ -14285,8 +14046,9 @@
           <w:sz w:val="28"/>
           <w:szCs w:val="28"/>
         </w:rPr>
-      </w:pPr>
-      <w:proofErr w:type="spellStart"/>
+        <w:t>kubectl</w:t>
+      </w:r>
+      <w:proofErr w:type="spellEnd"/>
       <w:r>
         <w:rPr>
           <w:rFonts w:asciiTheme="majorBidi" w:hAnsiTheme="majorBidi" w:cstheme="majorBidi"/>
@@ -14297,9 +14059,1401 @@
           <w:sz w:val="28"/>
           <w:szCs w:val="28"/>
         </w:rPr>
-        <w:t>kubectl</w:t>
+        <w:t xml:space="preserve"> describe pod &lt;pod-name&gt;</w:t>
+      </w:r>
+      <w:r>
+        <w:rPr>
+          <w:rFonts w:asciiTheme="majorBidi" w:hAnsiTheme="majorBidi" w:cstheme="majorBidi"/>
+          <w:sz w:val="28"/>
+          <w:szCs w:val="28"/>
+        </w:rPr>
+        <w:t xml:space="preserve"> </w:t>
+      </w:r>
+      <w:r>
+        <w:rPr>
+          <w:rFonts w:asciiTheme="majorBidi" w:hAnsiTheme="majorBidi" w:cstheme="majorBidi"/>
+          <w:sz w:val="28"/>
+          <w:szCs w:val="28"/>
+        </w:rPr>
+        <w:t xml:space="preserve">→ </w:t>
+      </w:r>
+      <w:r>
+        <w:rPr>
+          <w:rFonts w:asciiTheme="majorBidi" w:hAnsiTheme="majorBidi" w:cstheme="majorBidi"/>
+          <w:sz w:val="28"/>
+          <w:szCs w:val="28"/>
+        </w:rPr>
+        <w:t xml:space="preserve">check </w:t>
+      </w:r>
+      <w:r>
+        <w:rPr>
+          <w:rFonts w:asciiTheme="majorBidi" w:hAnsiTheme="majorBidi" w:cstheme="majorBidi"/>
+          <w:sz w:val="28"/>
+          <w:szCs w:val="28"/>
+        </w:rPr>
+        <w:t>under “Init Containers”.</w:t>
+      </w:r>
+    </w:p>
+    <w:p>
+      <w:pPr>
+        <w:spacing w:after="60"/>
+        <w:rPr>
+          <w:rFonts w:asciiTheme="majorBidi" w:hAnsiTheme="majorBidi" w:cstheme="majorBidi"/>
+          <w:b/>
+          <w:bCs/>
+          <w:sz w:val="36"/>
+          <w:szCs w:val="36"/>
+        </w:rPr>
+      </w:pPr>
+      <w:r>
+        <w:rPr>
+          <w:rFonts w:asciiTheme="majorBidi" w:hAnsiTheme="majorBidi" w:cstheme="majorBidi"/>
+          <w:b/>
+          <w:bCs/>
+          <w:sz w:val="36"/>
+          <w:szCs w:val="36"/>
+        </w:rPr>
+        <w:t>Pod Lifecycle</w:t>
+      </w:r>
+      <w:r>
+        <w:rPr>
+          <w:rFonts w:asciiTheme="majorBidi" w:hAnsiTheme="majorBidi" w:cstheme="majorBidi"/>
+          <w:b/>
+          <w:bCs/>
+          <w:sz w:val="36"/>
+          <w:szCs w:val="36"/>
+        </w:rPr>
+        <w:t>:</w:t>
+      </w:r>
+    </w:p>
+    <w:p>
+      <w:pPr>
+        <w:spacing w:after="60"/>
+        <w:jc w:val="both"/>
+        <w:rPr>
+          <w:rFonts w:asciiTheme="majorBidi" w:hAnsiTheme="majorBidi" w:cstheme="majorBidi"/>
+          <w:sz w:val="28"/>
+          <w:szCs w:val="28"/>
+        </w:rPr>
+      </w:pPr>
+      <w:r>
+        <w:rPr>
+          <w:rFonts w:asciiTheme="majorBidi" w:hAnsiTheme="majorBidi" w:cstheme="majorBidi"/>
+          <w:sz w:val="28"/>
+          <w:szCs w:val="28"/>
+        </w:rPr>
+        <w:t xml:space="preserve">The Pod lifecycle describes the sequence of states a Pod goes through from the moment it is created until it is terminated. The lifecycle of a Pod is managed by Kubernetes components such as the </w:t>
+      </w:r>
+      <w:proofErr w:type="spellStart"/>
+      <w:r>
+        <w:rPr>
+          <w:rFonts w:asciiTheme="majorBidi" w:hAnsiTheme="majorBidi" w:cstheme="majorBidi"/>
+          <w:sz w:val="28"/>
+          <w:szCs w:val="28"/>
+        </w:rPr>
+        <w:t>kube-apiserver</w:t>
       </w:r>
       <w:proofErr w:type="spellEnd"/>
+      <w:r>
+        <w:rPr>
+          <w:rFonts w:asciiTheme="majorBidi" w:hAnsiTheme="majorBidi" w:cstheme="majorBidi"/>
+          <w:sz w:val="28"/>
+          <w:szCs w:val="28"/>
+        </w:rPr>
+        <w:t xml:space="preserve">, scheduler, </w:t>
+      </w:r>
+      <w:proofErr w:type="spellStart"/>
+      <w:r>
+        <w:rPr>
+          <w:rFonts w:asciiTheme="majorBidi" w:hAnsiTheme="majorBidi" w:cstheme="majorBidi"/>
+          <w:sz w:val="28"/>
+          <w:szCs w:val="28"/>
+        </w:rPr>
+        <w:t>kubelet</w:t>
+      </w:r>
+      <w:proofErr w:type="spellEnd"/>
+      <w:r>
+        <w:rPr>
+          <w:rFonts w:asciiTheme="majorBidi" w:hAnsiTheme="majorBidi" w:cstheme="majorBidi"/>
+          <w:sz w:val="28"/>
+          <w:szCs w:val="28"/>
+        </w:rPr>
+        <w:t>, and controllers.</w:t>
+      </w:r>
+    </w:p>
+    <w:p>
+      <w:pPr>
+        <w:spacing w:after="120"/>
+        <w:jc w:val="both"/>
+        <w:rPr>
+          <w:rFonts w:asciiTheme="majorBidi" w:hAnsiTheme="majorBidi" w:cstheme="majorBidi"/>
+          <w:sz w:val="28"/>
+          <w:szCs w:val="28"/>
+        </w:rPr>
+      </w:pPr>
+      <w:r>
+        <w:rPr>
+          <w:rFonts w:asciiTheme="majorBidi" w:hAnsiTheme="majorBidi" w:cstheme="majorBidi"/>
+          <w:sz w:val="28"/>
+          <w:szCs w:val="28"/>
+        </w:rPr>
+        <w:t xml:space="preserve">When a Pod is created, its specification is submitted to the </w:t>
+      </w:r>
+      <w:proofErr w:type="spellStart"/>
+      <w:r>
+        <w:rPr>
+          <w:rFonts w:asciiTheme="majorBidi" w:hAnsiTheme="majorBidi" w:cstheme="majorBidi"/>
+          <w:sz w:val="28"/>
+          <w:szCs w:val="28"/>
+        </w:rPr>
+        <w:t>kube‑apiserver</w:t>
+      </w:r>
+      <w:proofErr w:type="spellEnd"/>
+      <w:r>
+        <w:rPr>
+          <w:rFonts w:asciiTheme="majorBidi" w:hAnsiTheme="majorBidi" w:cstheme="majorBidi"/>
+          <w:sz w:val="28"/>
+          <w:szCs w:val="28"/>
+        </w:rPr>
+        <w:t xml:space="preserve">, which stores the desired state of the Pod in </w:t>
+      </w:r>
+      <w:proofErr w:type="spellStart"/>
+      <w:r>
+        <w:rPr>
+          <w:rFonts w:asciiTheme="majorBidi" w:hAnsiTheme="majorBidi" w:cstheme="majorBidi"/>
+          <w:sz w:val="28"/>
+          <w:szCs w:val="28"/>
+        </w:rPr>
+        <w:t>etcd</w:t>
+      </w:r>
+      <w:proofErr w:type="spellEnd"/>
+      <w:r>
+        <w:rPr>
+          <w:rFonts w:asciiTheme="majorBidi" w:hAnsiTheme="majorBidi" w:cstheme="majorBidi"/>
+          <w:sz w:val="28"/>
+          <w:szCs w:val="28"/>
+        </w:rPr>
+        <w:t xml:space="preserve">. The scheduler then selects an appropriate node for the Pod based on available resources and scheduling policies. After a node is selected, the </w:t>
+      </w:r>
+      <w:proofErr w:type="spellStart"/>
+      <w:r>
+        <w:rPr>
+          <w:rFonts w:asciiTheme="majorBidi" w:hAnsiTheme="majorBidi" w:cstheme="majorBidi"/>
+          <w:sz w:val="28"/>
+          <w:szCs w:val="28"/>
+        </w:rPr>
+        <w:t>kubelet</w:t>
+      </w:r>
+      <w:proofErr w:type="spellEnd"/>
+      <w:r>
+        <w:rPr>
+          <w:rFonts w:asciiTheme="majorBidi" w:hAnsiTheme="majorBidi" w:cstheme="majorBidi"/>
+          <w:sz w:val="28"/>
+          <w:szCs w:val="28"/>
+        </w:rPr>
+        <w:t xml:space="preserve"> on that node receives the Pod specification and is responsible for creating and managing the containers defined in the Pod.</w:t>
+      </w:r>
+      <w:r>
+        <w:rPr>
+          <w:rFonts w:asciiTheme="majorBidi" w:hAnsiTheme="majorBidi" w:cstheme="majorBidi"/>
+          <w:sz w:val="28"/>
+          <w:szCs w:val="28"/>
+        </w:rPr>
+        <w:t xml:space="preserve"> </w:t>
+      </w:r>
+      <w:r>
+        <w:rPr>
+          <w:rFonts w:asciiTheme="majorBidi" w:hAnsiTheme="majorBidi" w:cstheme="majorBidi"/>
+          <w:sz w:val="28"/>
+          <w:szCs w:val="28"/>
+        </w:rPr>
+        <w:t xml:space="preserve">A Pod remains bound to a node once scheduled and normally runs until it is deleted or terminated. If a node fails, the Pod itself is not automatically moved; instead, controllers such as Deployments or </w:t>
+      </w:r>
+      <w:proofErr w:type="spellStart"/>
+      <w:r>
+        <w:rPr>
+          <w:rFonts w:asciiTheme="majorBidi" w:hAnsiTheme="majorBidi" w:cstheme="majorBidi"/>
+          <w:sz w:val="28"/>
+          <w:szCs w:val="28"/>
+        </w:rPr>
+        <w:t>ReplicaSets</w:t>
+      </w:r>
+      <w:proofErr w:type="spellEnd"/>
+      <w:r>
+        <w:rPr>
+          <w:rFonts w:asciiTheme="majorBidi" w:hAnsiTheme="majorBidi" w:cstheme="majorBidi"/>
+          <w:sz w:val="28"/>
+          <w:szCs w:val="28"/>
+        </w:rPr>
+        <w:t xml:space="preserve"> create replacement Pods.</w:t>
+      </w:r>
+    </w:p>
+    <w:p>
+      <w:pPr>
+        <w:spacing w:after="60"/>
+        <w:rPr>
+          <w:rFonts w:asciiTheme="majorBidi" w:hAnsiTheme="majorBidi" w:cstheme="majorBidi"/>
+          <w:b/>
+          <w:bCs/>
+          <w:sz w:val="32"/>
+          <w:szCs w:val="32"/>
+        </w:rPr>
+      </w:pPr>
+      <w:r>
+        <w:rPr>
+          <w:rFonts w:asciiTheme="majorBidi" w:hAnsiTheme="majorBidi" w:cstheme="majorBidi"/>
+          <w:b/>
+          <w:bCs/>
+          <w:sz w:val="32"/>
+          <w:szCs w:val="32"/>
+        </w:rPr>
+        <w:t>Pod Phases</w:t>
+      </w:r>
+      <w:r>
+        <w:rPr>
+          <w:rFonts w:asciiTheme="majorBidi" w:hAnsiTheme="majorBidi" w:cstheme="majorBidi"/>
+          <w:b/>
+          <w:bCs/>
+          <w:sz w:val="32"/>
+          <w:szCs w:val="32"/>
+        </w:rPr>
+        <w:t>:</w:t>
+      </w:r>
+    </w:p>
+    <w:p>
+      <w:pPr>
+        <w:rPr>
+          <w:rFonts w:asciiTheme="majorBidi" w:hAnsiTheme="majorBidi" w:cstheme="majorBidi"/>
+          <w:sz w:val="28"/>
+          <w:szCs w:val="28"/>
+        </w:rPr>
+      </w:pPr>
+      <w:r>
+        <w:rPr>
+          <w:rFonts w:asciiTheme="majorBidi" w:hAnsiTheme="majorBidi" w:cstheme="majorBidi"/>
+          <w:sz w:val="28"/>
+          <w:szCs w:val="28"/>
+        </w:rPr>
+        <w:t>Kubernetes tracks the high-level state of a Pod through a field called Pod Phase, which represents the current stage in the Pod’s lifecycle.</w:t>
+      </w:r>
+    </w:p>
+    <w:p>
+      <w:pPr>
+        <w:pStyle w:val="ListParagraph"/>
+        <w:numPr>
+          <w:ilvl w:val="0"/>
+          <w:numId w:val="31"/>
+        </w:numPr>
+        <w:spacing w:after="0"/>
+        <w:ind w:left="360"/>
+        <w:jc w:val="both"/>
+        <w:rPr>
+          <w:rFonts w:asciiTheme="majorBidi" w:hAnsiTheme="majorBidi" w:cstheme="majorBidi"/>
+          <w:b/>
+          <w:bCs/>
+          <w:sz w:val="28"/>
+          <w:szCs w:val="28"/>
+        </w:rPr>
+      </w:pPr>
+      <w:r>
+        <w:rPr>
+          <w:rFonts w:asciiTheme="majorBidi" w:hAnsiTheme="majorBidi" w:cstheme="majorBidi"/>
+          <w:b/>
+          <w:bCs/>
+          <w:sz w:val="28"/>
+          <w:szCs w:val="28"/>
+        </w:rPr>
+        <w:t>Pending</w:t>
+      </w:r>
+    </w:p>
+    <w:p>
+      <w:pPr>
+        <w:spacing w:after="120"/>
+        <w:ind w:left="360"/>
+        <w:jc w:val="both"/>
+        <w:rPr>
+          <w:rFonts w:asciiTheme="majorBidi" w:hAnsiTheme="majorBidi" w:cstheme="majorBidi"/>
+          <w:sz w:val="28"/>
+          <w:szCs w:val="28"/>
+        </w:rPr>
+      </w:pPr>
+      <w:r>
+        <w:rPr>
+          <w:rFonts w:asciiTheme="majorBidi" w:hAnsiTheme="majorBidi" w:cstheme="majorBidi"/>
+          <w:sz w:val="28"/>
+          <w:szCs w:val="28"/>
+        </w:rPr>
+        <w:t xml:space="preserve">The Pod has been accepted by the Kubernetes system but one or more containers have not yet been created. This phase typically includes scheduling and image downloading. During this phase, the scheduler selects a node and the </w:t>
+      </w:r>
+      <w:proofErr w:type="spellStart"/>
+      <w:r>
+        <w:rPr>
+          <w:rFonts w:asciiTheme="majorBidi" w:hAnsiTheme="majorBidi" w:cstheme="majorBidi"/>
+          <w:sz w:val="28"/>
+          <w:szCs w:val="28"/>
+        </w:rPr>
+        <w:t>kubelet</w:t>
+      </w:r>
+      <w:proofErr w:type="spellEnd"/>
+      <w:r>
+        <w:rPr>
+          <w:rFonts w:asciiTheme="majorBidi" w:hAnsiTheme="majorBidi" w:cstheme="majorBidi"/>
+          <w:sz w:val="28"/>
+          <w:szCs w:val="28"/>
+        </w:rPr>
+        <w:t xml:space="preserve"> prepares to start the containers.</w:t>
+      </w:r>
+    </w:p>
+    <w:p>
+      <w:pPr>
+        <w:pStyle w:val="ListParagraph"/>
+        <w:numPr>
+          <w:ilvl w:val="0"/>
+          <w:numId w:val="31"/>
+        </w:numPr>
+        <w:spacing w:after="0"/>
+        <w:ind w:left="360"/>
+        <w:jc w:val="both"/>
+        <w:rPr>
+          <w:rFonts w:asciiTheme="majorBidi" w:hAnsiTheme="majorBidi" w:cstheme="majorBidi"/>
+          <w:b/>
+          <w:bCs/>
+          <w:sz w:val="28"/>
+          <w:szCs w:val="28"/>
+        </w:rPr>
+      </w:pPr>
+      <w:r>
+        <w:rPr>
+          <w:rFonts w:asciiTheme="majorBidi" w:hAnsiTheme="majorBidi" w:cstheme="majorBidi"/>
+          <w:b/>
+          <w:bCs/>
+          <w:sz w:val="28"/>
+          <w:szCs w:val="28"/>
+        </w:rPr>
+        <w:t>Running</w:t>
+      </w:r>
+    </w:p>
+    <w:p>
+      <w:pPr>
+        <w:spacing w:after="120"/>
+        <w:ind w:left="360"/>
+        <w:jc w:val="both"/>
+        <w:rPr>
+          <w:rFonts w:asciiTheme="majorBidi" w:hAnsiTheme="majorBidi" w:cstheme="majorBidi"/>
+          <w:sz w:val="28"/>
+          <w:szCs w:val="28"/>
+        </w:rPr>
+      </w:pPr>
+      <w:r>
+        <w:rPr>
+          <w:rFonts w:asciiTheme="majorBidi" w:hAnsiTheme="majorBidi" w:cstheme="majorBidi"/>
+          <w:sz w:val="28"/>
+          <w:szCs w:val="28"/>
+        </w:rPr>
+        <w:t>The Pod has been successfully scheduled to a node, and all containers have been created. At least one container is running or in the process of starting or restarting.</w:t>
+      </w:r>
+    </w:p>
+    <w:p>
+      <w:pPr>
+        <w:pStyle w:val="ListParagraph"/>
+        <w:numPr>
+          <w:ilvl w:val="0"/>
+          <w:numId w:val="31"/>
+        </w:numPr>
+        <w:spacing w:after="0"/>
+        <w:ind w:left="360"/>
+        <w:jc w:val="both"/>
+        <w:rPr>
+          <w:rFonts w:asciiTheme="majorBidi" w:hAnsiTheme="majorBidi" w:cstheme="majorBidi"/>
+          <w:b/>
+          <w:bCs/>
+          <w:sz w:val="28"/>
+          <w:szCs w:val="28"/>
+        </w:rPr>
+      </w:pPr>
+      <w:r>
+        <w:rPr>
+          <w:rFonts w:asciiTheme="majorBidi" w:hAnsiTheme="majorBidi" w:cstheme="majorBidi"/>
+          <w:b/>
+          <w:bCs/>
+          <w:sz w:val="28"/>
+          <w:szCs w:val="28"/>
+        </w:rPr>
+        <w:t>Succeeded</w:t>
+      </w:r>
+    </w:p>
+    <w:p>
+      <w:pPr>
+        <w:spacing w:after="120"/>
+        <w:ind w:left="360"/>
+        <w:jc w:val="both"/>
+        <w:rPr>
+          <w:rFonts w:asciiTheme="majorBidi" w:hAnsiTheme="majorBidi" w:cstheme="majorBidi"/>
+          <w:sz w:val="28"/>
+          <w:szCs w:val="28"/>
+        </w:rPr>
+      </w:pPr>
+      <w:r>
+        <w:rPr>
+          <w:rFonts w:asciiTheme="majorBidi" w:hAnsiTheme="majorBidi" w:cstheme="majorBidi"/>
+          <w:sz w:val="28"/>
+          <w:szCs w:val="28"/>
+        </w:rPr>
+        <w:t>All containers in the Pod have terminated successfully and will not restart. This state is common for batch jobs or short-lived tasks.</w:t>
+      </w:r>
+    </w:p>
+    <w:p>
+      <w:pPr>
+        <w:pStyle w:val="ListParagraph"/>
+        <w:numPr>
+          <w:ilvl w:val="0"/>
+          <w:numId w:val="31"/>
+        </w:numPr>
+        <w:spacing w:after="0"/>
+        <w:ind w:left="360"/>
+        <w:jc w:val="both"/>
+        <w:rPr>
+          <w:rFonts w:asciiTheme="majorBidi" w:hAnsiTheme="majorBidi" w:cstheme="majorBidi"/>
+          <w:b/>
+          <w:bCs/>
+          <w:sz w:val="28"/>
+          <w:szCs w:val="28"/>
+        </w:rPr>
+      </w:pPr>
+      <w:r>
+        <w:rPr>
+          <w:rFonts w:asciiTheme="majorBidi" w:hAnsiTheme="majorBidi" w:cstheme="majorBidi"/>
+          <w:b/>
+          <w:bCs/>
+          <w:sz w:val="28"/>
+          <w:szCs w:val="28"/>
+        </w:rPr>
+        <w:t>Failed</w:t>
+      </w:r>
+    </w:p>
+    <w:p>
+      <w:pPr>
+        <w:spacing w:after="120"/>
+        <w:ind w:left="360"/>
+        <w:jc w:val="both"/>
+        <w:rPr>
+          <w:rFonts w:asciiTheme="majorBidi" w:hAnsiTheme="majorBidi" w:cstheme="majorBidi"/>
+          <w:sz w:val="28"/>
+          <w:szCs w:val="28"/>
+        </w:rPr>
+      </w:pPr>
+      <w:r>
+        <w:rPr>
+          <w:rFonts w:asciiTheme="majorBidi" w:hAnsiTheme="majorBidi" w:cstheme="majorBidi"/>
+          <w:sz w:val="28"/>
+          <w:szCs w:val="28"/>
+        </w:rPr>
+        <w:t>All containers in the Pod have terminated, and at least one container terminated with a failure.</w:t>
+      </w:r>
+    </w:p>
+    <w:p>
+      <w:pPr>
+        <w:pStyle w:val="ListParagraph"/>
+        <w:numPr>
+          <w:ilvl w:val="0"/>
+          <w:numId w:val="31"/>
+        </w:numPr>
+        <w:spacing w:after="0"/>
+        <w:ind w:left="360"/>
+        <w:jc w:val="both"/>
+        <w:rPr>
+          <w:rFonts w:asciiTheme="majorBidi" w:hAnsiTheme="majorBidi" w:cstheme="majorBidi"/>
+          <w:b/>
+          <w:bCs/>
+          <w:sz w:val="28"/>
+          <w:szCs w:val="28"/>
+        </w:rPr>
+      </w:pPr>
+      <w:r>
+        <w:rPr>
+          <w:rFonts w:asciiTheme="majorBidi" w:hAnsiTheme="majorBidi" w:cstheme="majorBidi"/>
+          <w:b/>
+          <w:bCs/>
+          <w:sz w:val="28"/>
+          <w:szCs w:val="28"/>
+        </w:rPr>
+        <w:t>Unknown</w:t>
+      </w:r>
+    </w:p>
+    <w:p>
+      <w:pPr>
+        <w:ind w:left="360"/>
+        <w:jc w:val="both"/>
+        <w:rPr>
+          <w:rFonts w:asciiTheme="majorBidi" w:hAnsiTheme="majorBidi" w:cstheme="majorBidi"/>
+          <w:sz w:val="28"/>
+          <w:szCs w:val="28"/>
+        </w:rPr>
+      </w:pPr>
+      <w:r>
+        <w:rPr>
+          <w:rFonts w:asciiTheme="majorBidi" w:hAnsiTheme="majorBidi" w:cstheme="majorBidi"/>
+          <w:sz w:val="28"/>
+          <w:szCs w:val="28"/>
+        </w:rPr>
+        <w:t>The state of the Pod cannot be determined, typically due to communication problems between the control plane and the node.</w:t>
+      </w:r>
+    </w:p>
+    <w:p>
+      <w:pPr>
+        <w:rPr>
+          <w:rFonts w:asciiTheme="majorBidi" w:hAnsiTheme="majorBidi" w:cstheme="majorBidi"/>
+          <w:sz w:val="2"/>
+          <w:szCs w:val="2"/>
+        </w:rPr>
+      </w:pPr>
+      <w:r>
+        <w:rPr>
+          <w:rFonts w:asciiTheme="majorBidi" w:hAnsiTheme="majorBidi" w:cstheme="majorBidi"/>
+          <w:noProof/>
+          <w:sz w:val="28"/>
+          <w:szCs w:val="28"/>
+        </w:rPr>
+        <w:lastRenderedPageBreak/>
+        <w:drawing>
+          <wp:anchor distT="0" distB="0" distL="114300" distR="114300" simplePos="0" relativeHeight="251671552" behindDoc="1" locked="0" layoutInCell="1" allowOverlap="1" wp14:anchorId="4033D3BA" wp14:editId="11353610">
+            <wp:simplePos x="0" y="0"/>
+            <wp:positionH relativeFrom="margin">
+              <wp:align>right</wp:align>
+            </wp:positionH>
+            <wp:positionV relativeFrom="paragraph">
+              <wp:posOffset>0</wp:posOffset>
+            </wp:positionV>
+            <wp:extent cx="6858000" cy="2057400"/>
+            <wp:effectExtent l="0" t="0" r="0" b="0"/>
+            <wp:wrapTight wrapText="bothSides">
+              <wp:wrapPolygon edited="0">
+                <wp:start x="0" y="0"/>
+                <wp:lineTo x="0" y="21400"/>
+                <wp:lineTo x="21540" y="21400"/>
+                <wp:lineTo x="21540" y="0"/>
+                <wp:lineTo x="0" y="0"/>
+              </wp:wrapPolygon>
+            </wp:wrapTight>
+            <wp:docPr id="1684743270" name="Picture 12"/>
+            <wp:cNvGraphicFramePr>
+              <a:graphicFrameLocks xmlns:a="http://schemas.openxmlformats.org/drawingml/2006/main" noChangeAspect="1"/>
+            </wp:cNvGraphicFramePr>
+            <a:graphic xmlns:a="http://schemas.openxmlformats.org/drawingml/2006/main">
+              <a:graphicData uri="http://schemas.openxmlformats.org/drawingml/2006/picture">
+                <pic:pic xmlns:pic="http://schemas.openxmlformats.org/drawingml/2006/picture">
+                  <pic:nvPicPr>
+                    <pic:cNvPr id="1684743270" name="Picture 1684743270"/>
+                    <pic:cNvPicPr/>
+                  </pic:nvPicPr>
+                  <pic:blipFill>
+                    <a:blip r:embed="rId5">
+                      <a:grayscl/>
+                      <a:extLst>
+                        <a:ext uri="{28A0092B-C50C-407E-A947-70E740481C1C}">
+                          <a14:useLocalDpi xmlns:a14="http://schemas.microsoft.com/office/drawing/2010/main" val="0"/>
+                        </a:ext>
+                      </a:extLst>
+                    </a:blip>
+                    <a:stretch>
+                      <a:fillRect/>
+                    </a:stretch>
+                  </pic:blipFill>
+                  <pic:spPr>
+                    <a:xfrm>
+                      <a:off x="0" y="0"/>
+                      <a:ext cx="6858000" cy="2057400"/>
+                    </a:xfrm>
+                    <a:prstGeom prst="rect">
+                      <a:avLst/>
+                    </a:prstGeom>
+                  </pic:spPr>
+                </pic:pic>
+              </a:graphicData>
+            </a:graphic>
+            <wp14:sizeRelH relativeFrom="margin">
+              <wp14:pctWidth>0</wp14:pctWidth>
+            </wp14:sizeRelH>
+          </wp:anchor>
+        </w:drawing>
+      </w:r>
+    </w:p>
+    <w:p>
+      <w:pPr>
+        <w:jc w:val="both"/>
+        <w:rPr>
+          <w:rFonts w:asciiTheme="majorBidi" w:hAnsiTheme="majorBidi" w:cstheme="majorBidi"/>
+          <w:sz w:val="28"/>
+          <w:szCs w:val="28"/>
+        </w:rPr>
+      </w:pPr>
+      <w:r>
+        <w:rPr>
+          <w:rFonts w:asciiTheme="majorBidi" w:hAnsiTheme="majorBidi" w:cstheme="majorBidi"/>
+          <w:sz w:val="28"/>
+          <w:szCs w:val="28"/>
+        </w:rPr>
+        <w:t>It is important to note that Pod phase is not a detailed state machine but rather a simple high-level summary.</w:t>
+      </w:r>
+    </w:p>
+    <w:p>
+      <w:pPr>
+        <w:jc w:val="both"/>
+        <w:rPr>
+          <w:rFonts w:asciiTheme="majorBidi" w:hAnsiTheme="majorBidi" w:cstheme="majorBidi"/>
+          <w:b/>
+          <w:bCs/>
+          <w:sz w:val="32"/>
+          <w:szCs w:val="32"/>
+        </w:rPr>
+      </w:pPr>
+      <w:r>
+        <w:rPr>
+          <w:rFonts w:asciiTheme="majorBidi" w:hAnsiTheme="majorBidi" w:cstheme="majorBidi"/>
+          <w:b/>
+          <w:bCs/>
+          <w:sz w:val="32"/>
+          <w:szCs w:val="32"/>
+        </w:rPr>
+        <w:t>Container States within a Pod</w:t>
+      </w:r>
+      <w:r>
+        <w:rPr>
+          <w:rFonts w:asciiTheme="majorBidi" w:hAnsiTheme="majorBidi" w:cstheme="majorBidi"/>
+          <w:b/>
+          <w:bCs/>
+          <w:sz w:val="32"/>
+          <w:szCs w:val="32"/>
+        </w:rPr>
+        <w:t>:</w:t>
+      </w:r>
+    </w:p>
+    <w:p>
+      <w:pPr>
+        <w:spacing w:after="60"/>
+        <w:jc w:val="both"/>
+        <w:rPr>
+          <w:rFonts w:asciiTheme="majorBidi" w:hAnsiTheme="majorBidi" w:cstheme="majorBidi"/>
+          <w:sz w:val="28"/>
+          <w:szCs w:val="28"/>
+        </w:rPr>
+      </w:pPr>
+      <w:r>
+        <w:rPr>
+          <w:rFonts w:asciiTheme="majorBidi" w:hAnsiTheme="majorBidi" w:cstheme="majorBidi"/>
+          <w:sz w:val="28"/>
+          <w:szCs w:val="28"/>
+        </w:rPr>
+        <w:t>Inside a Pod, individual containers have their own container states:</w:t>
+      </w:r>
+    </w:p>
+    <w:p>
+      <w:pPr>
+        <w:pStyle w:val="ListParagraph"/>
+        <w:numPr>
+          <w:ilvl w:val="0"/>
+          <w:numId w:val="31"/>
+        </w:numPr>
+        <w:spacing w:after="0"/>
+        <w:ind w:left="360"/>
+        <w:jc w:val="both"/>
+        <w:rPr>
+          <w:rFonts w:asciiTheme="majorBidi" w:hAnsiTheme="majorBidi" w:cstheme="majorBidi"/>
+          <w:b/>
+          <w:bCs/>
+          <w:sz w:val="28"/>
+          <w:szCs w:val="28"/>
+        </w:rPr>
+      </w:pPr>
+      <w:r>
+        <w:rPr>
+          <w:rFonts w:asciiTheme="majorBidi" w:hAnsiTheme="majorBidi" w:cstheme="majorBidi"/>
+          <w:b/>
+          <w:bCs/>
+          <w:sz w:val="28"/>
+          <w:szCs w:val="28"/>
+        </w:rPr>
+        <w:t>Waiting</w:t>
+      </w:r>
+    </w:p>
+    <w:p>
+      <w:pPr>
+        <w:spacing w:after="120"/>
+        <w:ind w:left="360"/>
+        <w:jc w:val="both"/>
+        <w:rPr>
+          <w:rFonts w:asciiTheme="majorBidi" w:hAnsiTheme="majorBidi" w:cstheme="majorBidi"/>
+          <w:sz w:val="28"/>
+          <w:szCs w:val="28"/>
+        </w:rPr>
+      </w:pPr>
+      <w:r>
+        <w:rPr>
+          <w:rFonts w:asciiTheme="majorBidi" w:hAnsiTheme="majorBidi" w:cstheme="majorBidi"/>
+          <w:sz w:val="28"/>
+          <w:szCs w:val="28"/>
+        </w:rPr>
+        <w:t>The container has not started running yet. This can occur while the container image is being pulled or when dependencies are not yet satisfied.</w:t>
+      </w:r>
+    </w:p>
+    <w:p>
+      <w:pPr>
+        <w:pStyle w:val="ListParagraph"/>
+        <w:numPr>
+          <w:ilvl w:val="0"/>
+          <w:numId w:val="31"/>
+        </w:numPr>
+        <w:spacing w:after="0"/>
+        <w:ind w:left="360"/>
+        <w:jc w:val="both"/>
+        <w:rPr>
+          <w:rFonts w:asciiTheme="majorBidi" w:hAnsiTheme="majorBidi" w:cstheme="majorBidi"/>
+          <w:b/>
+          <w:bCs/>
+          <w:sz w:val="28"/>
+          <w:szCs w:val="28"/>
+        </w:rPr>
+      </w:pPr>
+      <w:r>
+        <w:rPr>
+          <w:rFonts w:asciiTheme="majorBidi" w:hAnsiTheme="majorBidi" w:cstheme="majorBidi"/>
+          <w:b/>
+          <w:bCs/>
+          <w:sz w:val="28"/>
+          <w:szCs w:val="28"/>
+        </w:rPr>
+        <w:t>Running</w:t>
+      </w:r>
+    </w:p>
+    <w:p>
+      <w:pPr>
+        <w:spacing w:after="120"/>
+        <w:ind w:left="360"/>
+        <w:jc w:val="both"/>
+        <w:rPr>
+          <w:rFonts w:asciiTheme="majorBidi" w:hAnsiTheme="majorBidi" w:cstheme="majorBidi"/>
+          <w:sz w:val="28"/>
+          <w:szCs w:val="28"/>
+        </w:rPr>
+      </w:pPr>
+      <w:r>
+        <w:rPr>
+          <w:rFonts w:asciiTheme="majorBidi" w:hAnsiTheme="majorBidi" w:cstheme="majorBidi"/>
+          <w:sz w:val="28"/>
+          <w:szCs w:val="28"/>
+        </w:rPr>
+        <w:t>The container is currently executing.</w:t>
+      </w:r>
+    </w:p>
+    <w:p>
+      <w:pPr>
+        <w:pStyle w:val="ListParagraph"/>
+        <w:numPr>
+          <w:ilvl w:val="0"/>
+          <w:numId w:val="31"/>
+        </w:numPr>
+        <w:spacing w:after="0"/>
+        <w:ind w:left="360"/>
+        <w:jc w:val="both"/>
+        <w:rPr>
+          <w:rFonts w:asciiTheme="majorBidi" w:hAnsiTheme="majorBidi" w:cstheme="majorBidi"/>
+          <w:b/>
+          <w:bCs/>
+          <w:sz w:val="28"/>
+          <w:szCs w:val="28"/>
+        </w:rPr>
+      </w:pPr>
+      <w:r>
+        <w:rPr>
+          <w:rFonts w:asciiTheme="majorBidi" w:hAnsiTheme="majorBidi" w:cstheme="majorBidi"/>
+          <w:b/>
+          <w:bCs/>
+          <w:sz w:val="28"/>
+          <w:szCs w:val="28"/>
+        </w:rPr>
+        <w:t>Terminated</w:t>
+      </w:r>
+    </w:p>
+    <w:p>
+      <w:pPr>
+        <w:spacing w:after="120"/>
+        <w:ind w:left="360"/>
+        <w:jc w:val="both"/>
+        <w:rPr>
+          <w:rFonts w:asciiTheme="majorBidi" w:hAnsiTheme="majorBidi" w:cstheme="majorBidi"/>
+          <w:sz w:val="28"/>
+          <w:szCs w:val="28"/>
+        </w:rPr>
+      </w:pPr>
+      <w:r>
+        <w:rPr>
+          <w:rFonts w:asciiTheme="majorBidi" w:hAnsiTheme="majorBidi" w:cstheme="majorBidi"/>
+          <w:sz w:val="28"/>
+          <w:szCs w:val="28"/>
+        </w:rPr>
+        <w:t>The container has finished execution, either successfully or with an error.</w:t>
+      </w:r>
+    </w:p>
+    <w:p>
+      <w:pPr>
+        <w:jc w:val="both"/>
+        <w:rPr>
+          <w:rFonts w:asciiTheme="majorBidi" w:hAnsiTheme="majorBidi" w:cstheme="majorBidi"/>
+          <w:sz w:val="28"/>
+          <w:szCs w:val="28"/>
+        </w:rPr>
+      </w:pPr>
+      <w:r>
+        <w:rPr>
+          <w:rFonts w:asciiTheme="majorBidi" w:hAnsiTheme="majorBidi" w:cstheme="majorBidi"/>
+          <w:sz w:val="28"/>
+          <w:szCs w:val="28"/>
+        </w:rPr>
+        <w:t>These container states provide more detailed information than the overall Pod phase.</w:t>
+      </w:r>
+    </w:p>
+    <w:p>
+      <w:pPr>
+        <w:spacing w:after="60"/>
+        <w:jc w:val="both"/>
+        <w:rPr>
+          <w:rFonts w:asciiTheme="majorBidi" w:hAnsiTheme="majorBidi" w:cstheme="majorBidi"/>
+          <w:b/>
+          <w:bCs/>
+          <w:sz w:val="32"/>
+          <w:szCs w:val="32"/>
+        </w:rPr>
+      </w:pPr>
+      <w:r>
+        <w:rPr>
+          <w:rFonts w:asciiTheme="majorBidi" w:hAnsiTheme="majorBidi" w:cstheme="majorBidi"/>
+          <w:b/>
+          <w:bCs/>
+          <w:sz w:val="32"/>
+          <w:szCs w:val="32"/>
+        </w:rPr>
+        <w:t>Pod Conditions</w:t>
+      </w:r>
+      <w:r>
+        <w:rPr>
+          <w:rFonts w:asciiTheme="majorBidi" w:hAnsiTheme="majorBidi" w:cstheme="majorBidi"/>
+          <w:b/>
+          <w:bCs/>
+          <w:sz w:val="32"/>
+          <w:szCs w:val="32"/>
+        </w:rPr>
+        <w:t>:</w:t>
+      </w:r>
+    </w:p>
+    <w:p>
+      <w:pPr>
+        <w:spacing w:after="60"/>
+        <w:jc w:val="both"/>
+        <w:rPr>
+          <w:rFonts w:asciiTheme="majorBidi" w:hAnsiTheme="majorBidi" w:cstheme="majorBidi"/>
+          <w:sz w:val="28"/>
+          <w:szCs w:val="28"/>
+        </w:rPr>
+      </w:pPr>
+      <w:r>
+        <w:rPr>
+          <w:rFonts w:asciiTheme="majorBidi" w:hAnsiTheme="majorBidi" w:cstheme="majorBidi"/>
+          <w:sz w:val="28"/>
+          <w:szCs w:val="28"/>
+        </w:rPr>
+        <w:t>Kubernetes also tracks Pod conditions, which give more granular insight into the Pod’s status. Common conditions include:</w:t>
+      </w:r>
+    </w:p>
+    <w:p>
+      <w:pPr>
+        <w:pStyle w:val="ListParagraph"/>
+        <w:numPr>
+          <w:ilvl w:val="0"/>
+          <w:numId w:val="31"/>
+        </w:numPr>
+        <w:ind w:left="360"/>
+        <w:jc w:val="both"/>
+        <w:rPr>
+          <w:rFonts w:asciiTheme="majorBidi" w:hAnsiTheme="majorBidi" w:cstheme="majorBidi"/>
+          <w:sz w:val="28"/>
+          <w:szCs w:val="28"/>
+        </w:rPr>
+      </w:pPr>
+      <w:proofErr w:type="spellStart"/>
+      <w:r>
+        <w:rPr>
+          <w:rFonts w:asciiTheme="majorBidi" w:hAnsiTheme="majorBidi" w:cstheme="majorBidi"/>
+          <w:b/>
+          <w:bCs/>
+          <w:sz w:val="28"/>
+          <w:szCs w:val="28"/>
+        </w:rPr>
+        <w:t>PodScheduled</w:t>
+      </w:r>
+      <w:proofErr w:type="spellEnd"/>
+      <w:r>
+        <w:rPr>
+          <w:rFonts w:asciiTheme="majorBidi" w:hAnsiTheme="majorBidi" w:cstheme="majorBidi"/>
+          <w:sz w:val="28"/>
+          <w:szCs w:val="28"/>
+        </w:rPr>
+        <w:t xml:space="preserve"> </w:t>
+      </w:r>
+      <w:r>
+        <w:rPr>
+          <w:rFonts w:asciiTheme="majorBidi" w:hAnsiTheme="majorBidi" w:cstheme="majorBidi"/>
+          <w:sz w:val="28"/>
+          <w:szCs w:val="28"/>
+        </w:rPr>
+        <w:t xml:space="preserve">→ </w:t>
+      </w:r>
+      <w:r>
+        <w:rPr>
+          <w:rFonts w:asciiTheme="majorBidi" w:hAnsiTheme="majorBidi" w:cstheme="majorBidi"/>
+          <w:sz w:val="28"/>
+          <w:szCs w:val="28"/>
+        </w:rPr>
+        <w:t>Indicates that the Pod has been scheduled to a node.</w:t>
+      </w:r>
+    </w:p>
+    <w:p>
+      <w:pPr>
+        <w:pStyle w:val="ListParagraph"/>
+        <w:numPr>
+          <w:ilvl w:val="0"/>
+          <w:numId w:val="31"/>
+        </w:numPr>
+        <w:ind w:left="360"/>
+        <w:jc w:val="both"/>
+        <w:rPr>
+          <w:rFonts w:asciiTheme="majorBidi" w:hAnsiTheme="majorBidi" w:cstheme="majorBidi"/>
+          <w:sz w:val="28"/>
+          <w:szCs w:val="28"/>
+        </w:rPr>
+      </w:pPr>
+      <w:r>
+        <w:rPr>
+          <w:rFonts w:asciiTheme="majorBidi" w:hAnsiTheme="majorBidi" w:cstheme="majorBidi"/>
+          <w:b/>
+          <w:bCs/>
+          <w:sz w:val="28"/>
+          <w:szCs w:val="28"/>
+        </w:rPr>
+        <w:t>Initialized</w:t>
+      </w:r>
+      <w:r>
+        <w:rPr>
+          <w:rFonts w:asciiTheme="majorBidi" w:hAnsiTheme="majorBidi" w:cstheme="majorBidi"/>
+          <w:sz w:val="28"/>
+          <w:szCs w:val="28"/>
+        </w:rPr>
+        <w:t xml:space="preserve"> </w:t>
+      </w:r>
+      <w:r>
+        <w:rPr>
+          <w:rFonts w:asciiTheme="majorBidi" w:hAnsiTheme="majorBidi" w:cstheme="majorBidi"/>
+          <w:sz w:val="28"/>
+          <w:szCs w:val="28"/>
+        </w:rPr>
+        <w:t xml:space="preserve">→ </w:t>
+      </w:r>
+      <w:r>
+        <w:rPr>
+          <w:rFonts w:asciiTheme="majorBidi" w:hAnsiTheme="majorBidi" w:cstheme="majorBidi"/>
+          <w:sz w:val="28"/>
+          <w:szCs w:val="28"/>
+        </w:rPr>
+        <w:t xml:space="preserve">All </w:t>
+      </w:r>
+      <w:proofErr w:type="spellStart"/>
+      <w:r>
+        <w:rPr>
+          <w:rFonts w:asciiTheme="majorBidi" w:hAnsiTheme="majorBidi" w:cstheme="majorBidi"/>
+          <w:sz w:val="28"/>
+          <w:szCs w:val="28"/>
+        </w:rPr>
+        <w:t>init</w:t>
+      </w:r>
+      <w:proofErr w:type="spellEnd"/>
+      <w:r>
+        <w:rPr>
+          <w:rFonts w:asciiTheme="majorBidi" w:hAnsiTheme="majorBidi" w:cstheme="majorBidi"/>
+          <w:sz w:val="28"/>
+          <w:szCs w:val="28"/>
+        </w:rPr>
+        <w:t xml:space="preserve"> containers have completed successfully.</w:t>
+      </w:r>
+    </w:p>
+    <w:p>
+      <w:pPr>
+        <w:pStyle w:val="ListParagraph"/>
+        <w:numPr>
+          <w:ilvl w:val="0"/>
+          <w:numId w:val="31"/>
+        </w:numPr>
+        <w:ind w:left="360"/>
+        <w:jc w:val="both"/>
+        <w:rPr>
+          <w:rFonts w:asciiTheme="majorBidi" w:hAnsiTheme="majorBidi" w:cstheme="majorBidi"/>
+          <w:sz w:val="28"/>
+          <w:szCs w:val="28"/>
+        </w:rPr>
+      </w:pPr>
+      <w:proofErr w:type="spellStart"/>
+      <w:r>
+        <w:rPr>
+          <w:rFonts w:asciiTheme="majorBidi" w:hAnsiTheme="majorBidi" w:cstheme="majorBidi"/>
+          <w:b/>
+          <w:bCs/>
+          <w:sz w:val="28"/>
+          <w:szCs w:val="28"/>
+        </w:rPr>
+        <w:t>ContainersReady</w:t>
+      </w:r>
+      <w:proofErr w:type="spellEnd"/>
+      <w:r>
+        <w:rPr>
+          <w:rFonts w:asciiTheme="majorBidi" w:hAnsiTheme="majorBidi" w:cstheme="majorBidi"/>
+          <w:sz w:val="28"/>
+          <w:szCs w:val="28"/>
+        </w:rPr>
+        <w:t xml:space="preserve"> </w:t>
+      </w:r>
+      <w:r>
+        <w:rPr>
+          <w:rFonts w:asciiTheme="majorBidi" w:hAnsiTheme="majorBidi" w:cstheme="majorBidi"/>
+          <w:sz w:val="28"/>
+          <w:szCs w:val="28"/>
+        </w:rPr>
+        <w:t xml:space="preserve">→ </w:t>
+      </w:r>
+      <w:r>
+        <w:rPr>
+          <w:rFonts w:asciiTheme="majorBidi" w:hAnsiTheme="majorBidi" w:cstheme="majorBidi"/>
+          <w:sz w:val="28"/>
+          <w:szCs w:val="28"/>
+        </w:rPr>
+        <w:t>All containers in the Pod are ready.</w:t>
+      </w:r>
+    </w:p>
+    <w:p>
+      <w:pPr>
+        <w:pStyle w:val="ListParagraph"/>
+        <w:numPr>
+          <w:ilvl w:val="0"/>
+          <w:numId w:val="31"/>
+        </w:numPr>
+        <w:spacing w:after="120"/>
+        <w:ind w:left="360"/>
+        <w:jc w:val="both"/>
+        <w:rPr>
+          <w:rFonts w:asciiTheme="majorBidi" w:hAnsiTheme="majorBidi" w:cstheme="majorBidi"/>
+          <w:sz w:val="28"/>
+          <w:szCs w:val="28"/>
+        </w:rPr>
+      </w:pPr>
+      <w:r>
+        <w:rPr>
+          <w:rFonts w:asciiTheme="majorBidi" w:hAnsiTheme="majorBidi" w:cstheme="majorBidi"/>
+          <w:b/>
+          <w:bCs/>
+          <w:sz w:val="28"/>
+          <w:szCs w:val="28"/>
+        </w:rPr>
+        <w:t>Ready</w:t>
+      </w:r>
+      <w:r>
+        <w:rPr>
+          <w:rFonts w:asciiTheme="majorBidi" w:hAnsiTheme="majorBidi" w:cstheme="majorBidi"/>
+          <w:sz w:val="28"/>
+          <w:szCs w:val="28"/>
+        </w:rPr>
+        <w:t xml:space="preserve"> </w:t>
+      </w:r>
+      <w:r>
+        <w:rPr>
+          <w:rFonts w:asciiTheme="majorBidi" w:hAnsiTheme="majorBidi" w:cstheme="majorBidi"/>
+          <w:sz w:val="28"/>
+          <w:szCs w:val="28"/>
+        </w:rPr>
+        <w:t xml:space="preserve">→ </w:t>
+      </w:r>
+      <w:r>
+        <w:rPr>
+          <w:rFonts w:asciiTheme="majorBidi" w:hAnsiTheme="majorBidi" w:cstheme="majorBidi"/>
+          <w:sz w:val="28"/>
+          <w:szCs w:val="28"/>
+        </w:rPr>
+        <w:t>The Pod is ready to serve requests and can receive traffic from services.</w:t>
+      </w:r>
+    </w:p>
+    <w:p>
+      <w:pPr>
+        <w:spacing w:after="60"/>
+        <w:jc w:val="both"/>
+        <w:rPr>
+          <w:rFonts w:asciiTheme="majorBidi" w:hAnsiTheme="majorBidi" w:cstheme="majorBidi"/>
+          <w:sz w:val="28"/>
+          <w:szCs w:val="28"/>
+        </w:rPr>
+      </w:pPr>
+      <w:r>
+        <w:rPr>
+          <w:rFonts w:asciiTheme="majorBidi" w:hAnsiTheme="majorBidi" w:cstheme="majorBidi"/>
+          <w:sz w:val="28"/>
+          <w:szCs w:val="28"/>
+        </w:rPr>
+        <w:t>Each condition has one of these values:</w:t>
+      </w:r>
+    </w:p>
+    <w:p>
+      <w:pPr>
+        <w:pStyle w:val="ListParagraph"/>
+        <w:numPr>
+          <w:ilvl w:val="0"/>
+          <w:numId w:val="32"/>
+        </w:numPr>
+        <w:ind w:left="360"/>
+        <w:jc w:val="both"/>
+        <w:rPr>
+          <w:rFonts w:asciiTheme="majorBidi" w:hAnsiTheme="majorBidi" w:cstheme="majorBidi"/>
+          <w:sz w:val="28"/>
+          <w:szCs w:val="28"/>
+        </w:rPr>
+      </w:pPr>
+      <w:r>
+        <w:rPr>
+          <w:rFonts w:asciiTheme="majorBidi" w:hAnsiTheme="majorBidi" w:cstheme="majorBidi"/>
+          <w:sz w:val="28"/>
+          <w:szCs w:val="28"/>
+        </w:rPr>
+        <w:t>True</w:t>
+      </w:r>
+    </w:p>
+    <w:p>
+      <w:pPr>
+        <w:pStyle w:val="ListParagraph"/>
+        <w:numPr>
+          <w:ilvl w:val="0"/>
+          <w:numId w:val="32"/>
+        </w:numPr>
+        <w:ind w:left="360"/>
+        <w:jc w:val="both"/>
+        <w:rPr>
+          <w:rFonts w:asciiTheme="majorBidi" w:hAnsiTheme="majorBidi" w:cstheme="majorBidi"/>
+          <w:sz w:val="28"/>
+          <w:szCs w:val="28"/>
+        </w:rPr>
+      </w:pPr>
+      <w:r>
+        <w:rPr>
+          <w:rFonts w:asciiTheme="majorBidi" w:hAnsiTheme="majorBidi" w:cstheme="majorBidi"/>
+          <w:sz w:val="28"/>
+          <w:szCs w:val="28"/>
+        </w:rPr>
+        <w:t>False</w:t>
+      </w:r>
+    </w:p>
+    <w:p>
+      <w:pPr>
+        <w:pStyle w:val="ListParagraph"/>
+        <w:numPr>
+          <w:ilvl w:val="0"/>
+          <w:numId w:val="32"/>
+        </w:numPr>
+        <w:ind w:left="360"/>
+        <w:jc w:val="both"/>
+        <w:rPr>
+          <w:rFonts w:asciiTheme="majorBidi" w:hAnsiTheme="majorBidi" w:cstheme="majorBidi"/>
+          <w:sz w:val="28"/>
+          <w:szCs w:val="28"/>
+        </w:rPr>
+      </w:pPr>
+      <w:r>
+        <w:rPr>
+          <w:rFonts w:asciiTheme="majorBidi" w:hAnsiTheme="majorBidi" w:cstheme="majorBidi"/>
+          <w:sz w:val="28"/>
+          <w:szCs w:val="28"/>
+        </w:rPr>
+        <w:t>Unknown</w:t>
+      </w:r>
+    </w:p>
+    <w:p>
+      <w:pPr>
+        <w:jc w:val="both"/>
+        <w:rPr>
+          <w:rFonts w:asciiTheme="majorBidi" w:hAnsiTheme="majorBidi" w:cstheme="majorBidi"/>
+          <w:sz w:val="28"/>
+          <w:szCs w:val="28"/>
+        </w:rPr>
+      </w:pPr>
+      <w:r>
+        <w:rPr>
+          <w:rFonts w:asciiTheme="majorBidi" w:hAnsiTheme="majorBidi" w:cstheme="majorBidi"/>
+          <w:sz w:val="28"/>
+          <w:szCs w:val="28"/>
+        </w:rPr>
+        <w:t>These conditions are often used by controllers and load balancers to determine whether a Pod should receive traffic.</w:t>
+      </w:r>
+    </w:p>
+    <w:p>
+      <w:pPr>
+        <w:jc w:val="both"/>
+        <w:rPr>
+          <w:rFonts w:asciiTheme="majorBidi" w:hAnsiTheme="majorBidi" w:cstheme="majorBidi"/>
+          <w:b/>
+          <w:bCs/>
+          <w:sz w:val="36"/>
+          <w:szCs w:val="36"/>
+        </w:rPr>
+      </w:pPr>
+      <w:r>
+        <w:rPr>
+          <w:rFonts w:asciiTheme="majorBidi" w:hAnsiTheme="majorBidi" w:cstheme="majorBidi"/>
+          <w:b/>
+          <w:bCs/>
+          <w:sz w:val="36"/>
+          <w:szCs w:val="36"/>
+        </w:rPr>
+        <w:lastRenderedPageBreak/>
+        <w:t>Pod Restart Policy</w:t>
+      </w:r>
+      <w:r>
+        <w:rPr>
+          <w:rFonts w:asciiTheme="majorBidi" w:hAnsiTheme="majorBidi" w:cstheme="majorBidi"/>
+          <w:b/>
+          <w:bCs/>
+          <w:sz w:val="36"/>
+          <w:szCs w:val="36"/>
+        </w:rPr>
+        <w:t>:</w:t>
+      </w:r>
+    </w:p>
+    <w:p>
+      <w:pPr>
+        <w:spacing w:after="60"/>
+        <w:jc w:val="both"/>
+        <w:rPr>
+          <w:rFonts w:asciiTheme="majorBidi" w:hAnsiTheme="majorBidi" w:cstheme="majorBidi"/>
+          <w:sz w:val="28"/>
+          <w:szCs w:val="28"/>
+        </w:rPr>
+      </w:pPr>
+      <w:r>
+        <w:rPr>
+          <w:rFonts w:asciiTheme="majorBidi" w:hAnsiTheme="majorBidi" w:cstheme="majorBidi"/>
+          <w:sz w:val="28"/>
+          <w:szCs w:val="28"/>
+        </w:rPr>
+        <w:t>Each Pod defines a restart policy that determines what happens when containers exit.</w:t>
+      </w:r>
+      <w:r>
+        <w:rPr>
+          <w:rFonts w:asciiTheme="majorBidi" w:hAnsiTheme="majorBidi" w:cstheme="majorBidi"/>
+          <w:sz w:val="28"/>
+          <w:szCs w:val="28"/>
+        </w:rPr>
+        <w:t xml:space="preserve"> </w:t>
+      </w:r>
+      <w:r>
+        <w:rPr>
+          <w:rFonts w:asciiTheme="majorBidi" w:hAnsiTheme="majorBidi" w:cstheme="majorBidi"/>
+          <w:sz w:val="28"/>
+          <w:szCs w:val="28"/>
+        </w:rPr>
+        <w:t>The Restart Policy is defined at the Pod level and applies to all containers within that Pod. This means you cannot set different Restart Policies for individual containers inside the same Pod.</w:t>
+      </w:r>
+      <w:r>
+        <w:rPr>
+          <w:rFonts w:asciiTheme="majorBidi" w:hAnsiTheme="majorBidi" w:cstheme="majorBidi"/>
+          <w:sz w:val="28"/>
+          <w:szCs w:val="28"/>
+        </w:rPr>
+        <w:t xml:space="preserve"> </w:t>
+      </w:r>
+      <w:r>
+        <w:rPr>
+          <w:rFonts w:asciiTheme="majorBidi" w:hAnsiTheme="majorBidi" w:cstheme="majorBidi"/>
+          <w:sz w:val="28"/>
+          <w:szCs w:val="28"/>
+        </w:rPr>
+        <w:t>The Restart Policy applies only to the main containers inside a Pod. Init containers do not follow this rule because they run only once.</w:t>
+      </w:r>
+    </w:p>
+    <w:p>
+      <w:pPr>
+        <w:pStyle w:val="ListParagraph"/>
+        <w:numPr>
+          <w:ilvl w:val="0"/>
+          <w:numId w:val="37"/>
+        </w:numPr>
+        <w:spacing w:after="60"/>
+        <w:ind w:left="360"/>
+        <w:rPr>
+          <w:rFonts w:asciiTheme="majorBidi" w:hAnsiTheme="majorBidi" w:cstheme="majorBidi"/>
+          <w:sz w:val="28"/>
+          <w:szCs w:val="28"/>
+        </w:rPr>
+      </w:pPr>
+      <w:r>
+        <w:rPr>
+          <w:rFonts w:asciiTheme="majorBidi" w:hAnsiTheme="majorBidi" w:cstheme="majorBidi"/>
+          <w:sz w:val="28"/>
+          <w:szCs w:val="28"/>
+        </w:rPr>
+        <w:t>If a container stops with exit code 0, it means the task completed successfully.</w:t>
+      </w:r>
+      <w:r>
+        <w:rPr>
+          <w:rFonts w:asciiTheme="majorBidi" w:hAnsiTheme="majorBidi" w:cstheme="majorBidi"/>
+          <w:sz w:val="28"/>
+          <w:szCs w:val="28"/>
+        </w:rPr>
+        <w:t xml:space="preserve"> </w:t>
+      </w:r>
+      <w:r>
+        <w:rPr>
+          <w:rFonts w:asciiTheme="majorBidi" w:hAnsiTheme="majorBidi" w:cstheme="majorBidi"/>
+          <w:sz w:val="28"/>
+          <w:szCs w:val="28"/>
+        </w:rPr>
+        <w:t>If a container stops with a non‑zero exit code, it means an error occurred.</w:t>
+      </w:r>
+    </w:p>
+    <w:p>
+      <w:pPr>
+        <w:spacing w:after="60"/>
+        <w:jc w:val="both"/>
+        <w:rPr>
+          <w:rFonts w:asciiTheme="majorBidi" w:hAnsiTheme="majorBidi" w:cstheme="majorBidi"/>
+          <w:sz w:val="28"/>
+          <w:szCs w:val="28"/>
+        </w:rPr>
+      </w:pPr>
+      <w:r>
+        <w:rPr>
+          <w:rFonts w:asciiTheme="majorBidi" w:hAnsiTheme="majorBidi" w:cstheme="majorBidi"/>
+          <w:sz w:val="28"/>
+          <w:szCs w:val="28"/>
+        </w:rPr>
+        <w:t>Possible restart policies include:</w:t>
+      </w:r>
+    </w:p>
+    <w:p>
+      <w:pPr>
+        <w:pStyle w:val="ListParagraph"/>
+        <w:numPr>
+          <w:ilvl w:val="0"/>
+          <w:numId w:val="33"/>
+        </w:numPr>
+        <w:ind w:left="360"/>
+        <w:jc w:val="both"/>
+        <w:rPr>
+          <w:rFonts w:asciiTheme="majorBidi" w:hAnsiTheme="majorBidi" w:cstheme="majorBidi"/>
+          <w:sz w:val="28"/>
+          <w:szCs w:val="28"/>
+        </w:rPr>
+      </w:pPr>
       <w:r>
         <w:rPr>
           <w:rFonts w:asciiTheme="majorBidi" w:hAnsiTheme="majorBidi" w:cstheme="majorBidi"/>
@@ -14310,7 +15464,7 @@
           <w:sz w:val="28"/>
           <w:szCs w:val="28"/>
         </w:rPr>
-        <w:t xml:space="preserve"> describe pod &lt;pod-name&gt;</w:t>
+        <w:t>Always</w:t>
       </w:r>
       <w:r>
         <w:rPr>
@@ -14334,16 +15488,1434 @@
           <w:sz w:val="28"/>
           <w:szCs w:val="28"/>
         </w:rPr>
-        <w:t xml:space="preserve">check </w:t>
-      </w:r>
-      <w:r>
-        <w:rPr>
-          <w:rFonts w:asciiTheme="majorBidi" w:hAnsiTheme="majorBidi" w:cstheme="majorBidi"/>
-          <w:sz w:val="28"/>
-          <w:szCs w:val="28"/>
-        </w:rPr>
-        <w:t>under “Init Containers”.</w:t>
-      </w:r>
+        <w:t>Containers are always restarted when they terminate. This is the default and is typically used by Deployments.</w:t>
+      </w:r>
+    </w:p>
+    <w:p>
+      <w:pPr>
+        <w:pStyle w:val="ListParagraph"/>
+        <w:numPr>
+          <w:ilvl w:val="0"/>
+          <w:numId w:val="33"/>
+        </w:numPr>
+        <w:ind w:left="360"/>
+        <w:jc w:val="both"/>
+        <w:rPr>
+          <w:rFonts w:asciiTheme="majorBidi" w:hAnsiTheme="majorBidi" w:cstheme="majorBidi"/>
+          <w:sz w:val="28"/>
+          <w:szCs w:val="28"/>
+        </w:rPr>
+      </w:pPr>
+      <w:proofErr w:type="spellStart"/>
+      <w:r>
+        <w:rPr>
+          <w:rFonts w:asciiTheme="majorBidi" w:hAnsiTheme="majorBidi" w:cstheme="majorBidi"/>
+          <w:b/>
+          <w:bCs/>
+          <w:i/>
+          <w:iCs/>
+          <w:sz w:val="28"/>
+          <w:szCs w:val="28"/>
+        </w:rPr>
+        <w:t>OnFailure</w:t>
+      </w:r>
+      <w:proofErr w:type="spellEnd"/>
+      <w:r>
+        <w:rPr>
+          <w:rFonts w:asciiTheme="majorBidi" w:hAnsiTheme="majorBidi" w:cstheme="majorBidi"/>
+          <w:sz w:val="28"/>
+          <w:szCs w:val="28"/>
+        </w:rPr>
+        <w:t xml:space="preserve"> </w:t>
+      </w:r>
+      <w:r>
+        <w:rPr>
+          <w:rFonts w:asciiTheme="majorBidi" w:hAnsiTheme="majorBidi" w:cstheme="majorBidi"/>
+          <w:sz w:val="28"/>
+          <w:szCs w:val="28"/>
+        </w:rPr>
+        <w:t xml:space="preserve">→ </w:t>
+      </w:r>
+      <w:r>
+        <w:rPr>
+          <w:rFonts w:asciiTheme="majorBidi" w:hAnsiTheme="majorBidi" w:cstheme="majorBidi"/>
+          <w:sz w:val="28"/>
+          <w:szCs w:val="28"/>
+        </w:rPr>
+        <w:t>Containers restart only if they exit with a failure.</w:t>
+      </w:r>
+    </w:p>
+    <w:p>
+      <w:pPr>
+        <w:pStyle w:val="ListParagraph"/>
+        <w:numPr>
+          <w:ilvl w:val="0"/>
+          <w:numId w:val="33"/>
+        </w:numPr>
+        <w:ind w:left="360"/>
+        <w:jc w:val="both"/>
+        <w:rPr>
+          <w:rFonts w:asciiTheme="majorBidi" w:hAnsiTheme="majorBidi" w:cstheme="majorBidi"/>
+          <w:sz w:val="28"/>
+          <w:szCs w:val="28"/>
+        </w:rPr>
+      </w:pPr>
+      <w:r>
+        <w:rPr>
+          <w:rFonts w:asciiTheme="majorBidi" w:hAnsiTheme="majorBidi" w:cstheme="majorBidi"/>
+          <w:b/>
+          <w:bCs/>
+          <w:i/>
+          <w:iCs/>
+          <w:sz w:val="28"/>
+          <w:szCs w:val="28"/>
+        </w:rPr>
+        <w:t>Never</w:t>
+      </w:r>
+      <w:r>
+        <w:rPr>
+          <w:rFonts w:asciiTheme="majorBidi" w:hAnsiTheme="majorBidi" w:cstheme="majorBidi"/>
+          <w:sz w:val="28"/>
+          <w:szCs w:val="28"/>
+        </w:rPr>
+        <w:t xml:space="preserve"> </w:t>
+      </w:r>
+      <w:r>
+        <w:rPr>
+          <w:rFonts w:asciiTheme="majorBidi" w:hAnsiTheme="majorBidi" w:cstheme="majorBidi"/>
+          <w:sz w:val="28"/>
+          <w:szCs w:val="28"/>
+        </w:rPr>
+        <w:t xml:space="preserve">→ </w:t>
+      </w:r>
+      <w:r>
+        <w:rPr>
+          <w:rFonts w:asciiTheme="majorBidi" w:hAnsiTheme="majorBidi" w:cstheme="majorBidi"/>
+          <w:sz w:val="28"/>
+          <w:szCs w:val="28"/>
+        </w:rPr>
+        <w:t>Containers are not restarted after termination.</w:t>
+      </w:r>
+    </w:p>
+    <w:p>
+      <w:pPr>
+        <w:jc w:val="both"/>
+        <w:rPr>
+          <w:rFonts w:asciiTheme="majorBidi" w:hAnsiTheme="majorBidi" w:cstheme="majorBidi"/>
+          <w:sz w:val="28"/>
+          <w:szCs w:val="28"/>
+        </w:rPr>
+      </w:pPr>
+      <w:r>
+        <w:rPr>
+          <w:rFonts w:asciiTheme="majorBidi" w:hAnsiTheme="majorBidi" w:cstheme="majorBidi"/>
+          <w:sz w:val="28"/>
+          <w:szCs w:val="28"/>
+        </w:rPr>
+        <w:t>Restart policies are especially important for batch jobs and short-lived tasks.</w:t>
+      </w:r>
+    </w:p>
+    <w:p>
+      <w:pPr>
+        <w:jc w:val="both"/>
+        <w:rPr>
+          <w:rFonts w:asciiTheme="majorBidi" w:hAnsiTheme="majorBidi" w:cstheme="majorBidi"/>
+          <w:sz w:val="28"/>
+          <w:szCs w:val="28"/>
+          <w:u w:val="single"/>
+        </w:rPr>
+      </w:pPr>
+      <w:r>
+        <w:rPr>
+          <w:rFonts w:asciiTheme="majorBidi" w:hAnsiTheme="majorBidi" w:cstheme="majorBidi"/>
+          <w:noProof/>
+          <w:sz w:val="28"/>
+          <w:szCs w:val="28"/>
+          <w:u w:val="single"/>
+        </w:rPr>
+        <mc:AlternateContent>
+          <mc:Choice Requires="wps">
+            <w:drawing>
+              <wp:anchor distT="0" distB="0" distL="114300" distR="114300" simplePos="0" relativeHeight="251672576" behindDoc="0" locked="0" layoutInCell="1" allowOverlap="1" wp14:anchorId="57A0EB02" wp14:editId="226B5B59">
+                <wp:simplePos x="0" y="0"/>
+                <wp:positionH relativeFrom="margin">
+                  <wp:align>left</wp:align>
+                </wp:positionH>
+                <wp:positionV relativeFrom="paragraph">
+                  <wp:posOffset>316230</wp:posOffset>
+                </wp:positionV>
+                <wp:extent cx="3063240" cy="2240280"/>
+                <wp:effectExtent l="0" t="0" r="22860" b="26670"/>
+                <wp:wrapNone/>
+                <wp:docPr id="1227296184" name="Rectangle 13"/>
+                <wp:cNvGraphicFramePr/>
+                <a:graphic xmlns:a="http://schemas.openxmlformats.org/drawingml/2006/main">
+                  <a:graphicData uri="http://schemas.microsoft.com/office/word/2010/wordprocessingShape">
+                    <wps:wsp>
+                      <wps:cNvSpPr/>
+                      <wps:spPr>
+                        <a:xfrm>
+                          <a:off x="0" y="0"/>
+                          <a:ext cx="3063240" cy="2240280"/>
+                        </a:xfrm>
+                        <a:prstGeom prst="rect">
+                          <a:avLst/>
+                        </a:prstGeom>
+                      </wps:spPr>
+                      <wps:style>
+                        <a:lnRef idx="2">
+                          <a:schemeClr val="dk1">
+                            <a:shade val="15000"/>
+                          </a:schemeClr>
+                        </a:lnRef>
+                        <a:fillRef idx="1">
+                          <a:schemeClr val="dk1"/>
+                        </a:fillRef>
+                        <a:effectRef idx="0">
+                          <a:schemeClr val="dk1"/>
+                        </a:effectRef>
+                        <a:fontRef idx="minor">
+                          <a:schemeClr val="lt1"/>
+                        </a:fontRef>
+                      </wps:style>
+                      <wps:txbx>
+                        <w:txbxContent>
+                          <w:p>
+                            <w:pPr>
+                              <w:spacing w:after="0"/>
+                              <w:rPr>
+                                <w:rFonts w:asciiTheme="majorBidi" w:hAnsiTheme="majorBidi" w:cstheme="majorBidi"/>
+                                <w:sz w:val="28"/>
+                                <w:szCs w:val="28"/>
+                              </w:rPr>
+                            </w:pPr>
+                            <w:proofErr w:type="spellStart"/>
+                            <w:r>
+                              <w:rPr>
+                                <w:rFonts w:asciiTheme="majorBidi" w:hAnsiTheme="majorBidi" w:cstheme="majorBidi"/>
+                                <w:sz w:val="28"/>
+                                <w:szCs w:val="28"/>
+                              </w:rPr>
+                              <w:t>apiVersion</w:t>
+                            </w:r>
+                            <w:proofErr w:type="spellEnd"/>
+                            <w:r>
+                              <w:rPr>
+                                <w:rFonts w:asciiTheme="majorBidi" w:hAnsiTheme="majorBidi" w:cstheme="majorBidi"/>
+                                <w:sz w:val="28"/>
+                                <w:szCs w:val="28"/>
+                              </w:rPr>
+                              <w:t>: v1</w:t>
+                            </w:r>
+                          </w:p>
+                          <w:p>
+                            <w:pPr>
+                              <w:spacing w:after="0"/>
+                              <w:rPr>
+                                <w:rFonts w:asciiTheme="majorBidi" w:hAnsiTheme="majorBidi" w:cstheme="majorBidi"/>
+                                <w:sz w:val="28"/>
+                                <w:szCs w:val="28"/>
+                              </w:rPr>
+                            </w:pPr>
+                            <w:r>
+                              <w:rPr>
+                                <w:rFonts w:asciiTheme="majorBidi" w:hAnsiTheme="majorBidi" w:cstheme="majorBidi"/>
+                                <w:sz w:val="28"/>
+                                <w:szCs w:val="28"/>
+                              </w:rPr>
+                              <w:t>kind: Pod</w:t>
+                            </w:r>
+                          </w:p>
+                          <w:p>
+                            <w:pPr>
+                              <w:spacing w:after="0"/>
+                              <w:rPr>
+                                <w:rFonts w:asciiTheme="majorBidi" w:hAnsiTheme="majorBidi" w:cstheme="majorBidi"/>
+                                <w:sz w:val="28"/>
+                                <w:szCs w:val="28"/>
+                              </w:rPr>
+                            </w:pPr>
+                            <w:r>
+                              <w:rPr>
+                                <w:rFonts w:asciiTheme="majorBidi" w:hAnsiTheme="majorBidi" w:cstheme="majorBidi"/>
+                                <w:sz w:val="28"/>
+                                <w:szCs w:val="28"/>
+                              </w:rPr>
+                              <w:t>metadata:</w:t>
+                            </w:r>
+                          </w:p>
+                          <w:p>
+                            <w:pPr>
+                              <w:spacing w:after="0"/>
+                              <w:rPr>
+                                <w:rFonts w:asciiTheme="majorBidi" w:hAnsiTheme="majorBidi" w:cstheme="majorBidi"/>
+                                <w:sz w:val="28"/>
+                                <w:szCs w:val="28"/>
+                              </w:rPr>
+                            </w:pPr>
+                            <w:r>
+                              <w:rPr>
+                                <w:rFonts w:asciiTheme="majorBidi" w:hAnsiTheme="majorBidi" w:cstheme="majorBidi"/>
+                                <w:sz w:val="28"/>
+                                <w:szCs w:val="28"/>
+                              </w:rPr>
+                              <w:t xml:space="preserve">     </w:t>
+                            </w:r>
+                            <w:r>
+                              <w:rPr>
+                                <w:rFonts w:asciiTheme="majorBidi" w:hAnsiTheme="majorBidi" w:cstheme="majorBidi"/>
+                                <w:sz w:val="28"/>
+                                <w:szCs w:val="28"/>
+                              </w:rPr>
+                              <w:t>name: example-pod</w:t>
+                            </w:r>
+                          </w:p>
+                          <w:p>
+                            <w:pPr>
+                              <w:spacing w:after="0"/>
+                              <w:rPr>
+                                <w:rFonts w:asciiTheme="majorBidi" w:hAnsiTheme="majorBidi" w:cstheme="majorBidi"/>
+                                <w:sz w:val="28"/>
+                                <w:szCs w:val="28"/>
+                              </w:rPr>
+                            </w:pPr>
+                            <w:r>
+                              <w:rPr>
+                                <w:rFonts w:asciiTheme="majorBidi" w:hAnsiTheme="majorBidi" w:cstheme="majorBidi"/>
+                                <w:sz w:val="28"/>
+                                <w:szCs w:val="28"/>
+                              </w:rPr>
+                              <w:t>spec:</w:t>
+                            </w:r>
+                          </w:p>
+                          <w:p>
+                            <w:pPr>
+                              <w:spacing w:after="0"/>
+                              <w:rPr>
+                                <w:rFonts w:asciiTheme="majorBidi" w:hAnsiTheme="majorBidi" w:cstheme="majorBidi"/>
+                                <w:sz w:val="28"/>
+                                <w:szCs w:val="28"/>
+                              </w:rPr>
+                            </w:pPr>
+                            <w:r>
+                              <w:rPr>
+                                <w:rFonts w:asciiTheme="majorBidi" w:hAnsiTheme="majorBidi" w:cstheme="majorBidi"/>
+                                <w:sz w:val="28"/>
+                                <w:szCs w:val="28"/>
+                              </w:rPr>
+                              <w:t xml:space="preserve">     </w:t>
+                            </w:r>
+                            <w:r>
+                              <w:rPr>
+                                <w:rFonts w:asciiTheme="majorBidi" w:hAnsiTheme="majorBidi" w:cstheme="majorBidi"/>
+                                <w:sz w:val="28"/>
+                                <w:szCs w:val="28"/>
+                              </w:rPr>
+                              <w:t>containers:</w:t>
+                            </w:r>
+                          </w:p>
+                          <w:p>
+                            <w:pPr>
+                              <w:spacing w:after="0"/>
+                              <w:rPr>
+                                <w:rFonts w:asciiTheme="majorBidi" w:hAnsiTheme="majorBidi" w:cstheme="majorBidi"/>
+                                <w:sz w:val="28"/>
+                                <w:szCs w:val="28"/>
+                              </w:rPr>
+                            </w:pPr>
+                            <w:r>
+                              <w:rPr>
+                                <w:rFonts w:asciiTheme="majorBidi" w:hAnsiTheme="majorBidi" w:cstheme="majorBidi"/>
+                                <w:sz w:val="28"/>
+                                <w:szCs w:val="28"/>
+                              </w:rPr>
+                              <w:t xml:space="preserve">          </w:t>
+                            </w:r>
+                            <w:r>
+                              <w:rPr>
+                                <w:rFonts w:asciiTheme="majorBidi" w:hAnsiTheme="majorBidi" w:cstheme="majorBidi"/>
+                                <w:sz w:val="28"/>
+                                <w:szCs w:val="28"/>
+                              </w:rPr>
+                              <w:t>- name: my-container</w:t>
+                            </w:r>
+                          </w:p>
+                          <w:p>
+                            <w:pPr>
+                              <w:spacing w:after="0"/>
+                              <w:rPr>
+                                <w:rFonts w:asciiTheme="majorBidi" w:hAnsiTheme="majorBidi" w:cstheme="majorBidi"/>
+                                <w:sz w:val="28"/>
+                                <w:szCs w:val="28"/>
+                              </w:rPr>
+                            </w:pPr>
+                            <w:r>
+                              <w:rPr>
+                                <w:rFonts w:asciiTheme="majorBidi" w:hAnsiTheme="majorBidi" w:cstheme="majorBidi"/>
+                                <w:sz w:val="28"/>
+                                <w:szCs w:val="28"/>
+                              </w:rPr>
+                              <w:t xml:space="preserve">          </w:t>
+                            </w:r>
+                            <w:r>
+                              <w:rPr>
+                                <w:rFonts w:asciiTheme="majorBidi" w:hAnsiTheme="majorBidi" w:cstheme="majorBidi"/>
+                                <w:sz w:val="28"/>
+                                <w:szCs w:val="28"/>
+                              </w:rPr>
+                              <w:t xml:space="preserve">  </w:t>
+                            </w:r>
+                            <w:r>
+                              <w:rPr>
+                                <w:rFonts w:asciiTheme="majorBidi" w:hAnsiTheme="majorBidi" w:cstheme="majorBidi"/>
+                                <w:sz w:val="28"/>
+                                <w:szCs w:val="28"/>
+                              </w:rPr>
+                              <w:t>image: nginx</w:t>
+                            </w:r>
+                          </w:p>
+                          <w:p>
+                            <w:pPr>
+                              <w:spacing w:after="0"/>
+                              <w:rPr>
+                                <w:rFonts w:asciiTheme="majorBidi" w:hAnsiTheme="majorBidi" w:cstheme="majorBidi"/>
+                                <w:sz w:val="28"/>
+                                <w:szCs w:val="28"/>
+                              </w:rPr>
+                            </w:pPr>
+                            <w:r>
+                              <w:rPr>
+                                <w:rFonts w:asciiTheme="majorBidi" w:hAnsiTheme="majorBidi" w:cstheme="majorBidi"/>
+                                <w:sz w:val="28"/>
+                                <w:szCs w:val="28"/>
+                              </w:rPr>
+                              <w:t xml:space="preserve">     </w:t>
+                            </w:r>
+                            <w:proofErr w:type="spellStart"/>
+                            <w:r>
+                              <w:rPr>
+                                <w:rFonts w:asciiTheme="majorBidi" w:hAnsiTheme="majorBidi" w:cstheme="majorBidi"/>
+                                <w:sz w:val="28"/>
+                                <w:szCs w:val="28"/>
+                              </w:rPr>
+                              <w:t>restartPolicy</w:t>
+                            </w:r>
+                            <w:proofErr w:type="spellEnd"/>
+                            <w:r>
+                              <w:rPr>
+                                <w:rFonts w:asciiTheme="majorBidi" w:hAnsiTheme="majorBidi" w:cstheme="majorBidi"/>
+                                <w:sz w:val="28"/>
+                                <w:szCs w:val="28"/>
+                              </w:rPr>
+                              <w:t>: Always</w:t>
+                            </w:r>
+                          </w:p>
+                        </w:txbxContent>
+                      </wps:txbx>
+                      <wps:bodyPr rot="0" spcFirstLastPara="0" vertOverflow="overflow" horzOverflow="overflow" vert="horz" wrap="square" lIns="91440" tIns="45720" rIns="91440" bIns="45720" numCol="1" spcCol="0" rtlCol="0" fromWordArt="0" anchor="ctr" anchorCtr="0" forceAA="0" compatLnSpc="1">
+                        <a:prstTxWarp prst="textNoShape">
+                          <a:avLst/>
+                        </a:prstTxWarp>
+                        <a:noAutofit/>
+                      </wps:bodyPr>
+                    </wps:wsp>
+                  </a:graphicData>
+                </a:graphic>
+                <wp14:sizeRelH relativeFrom="margin">
+                  <wp14:pctWidth>0</wp14:pctWidth>
+                </wp14:sizeRelH>
+                <wp14:sizeRelV relativeFrom="margin">
+                  <wp14:pctHeight>0</wp14:pctHeight>
+                </wp14:sizeRelV>
+              </wp:anchor>
+            </w:drawing>
+          </mc:Choice>
+          <mc:Fallback>
+            <w:pict>
+              <v:rect w14:anchorId="57A0EB02" id="Rectangle 13" o:spid="_x0000_s1037" style="position:absolute;left:0;text-align:left;margin-left:0;margin-top:24.9pt;width:241.2pt;height:176.4pt;z-index:251672576;visibility:visible;mso-wrap-style:square;mso-width-percent:0;mso-height-percent:0;mso-wrap-distance-left:9pt;mso-wrap-distance-top:0;mso-wrap-distance-right:9pt;mso-wrap-distance-bottom:0;mso-position-horizontal:left;mso-position-horizontal-relative:margin;mso-position-vertical:absolute;mso-position-vertical-relative:text;mso-width-percent:0;mso-height-percent:0;mso-width-relative:margin;mso-height-relative:margin;v-text-anchor:middle" o:gfxdata="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" fillcolor="black [3200]" strokecolor="black [480]" strokeweight="1pt">
+                <v:textbox>
+                  <w:txbxContent>
+                    <w:p>
+                      <w:pPr>
+                        <w:spacing w:after="0"/>
+                        <w:rPr>
+                          <w:rFonts w:asciiTheme="majorBidi" w:hAnsiTheme="majorBidi" w:cstheme="majorBidi"/>
+                          <w:sz w:val="28"/>
+                          <w:szCs w:val="28"/>
+                        </w:rPr>
+                      </w:pPr>
+                      <w:proofErr w:type="spellStart"/>
+                      <w:r>
+                        <w:rPr>
+                          <w:rFonts w:asciiTheme="majorBidi" w:hAnsiTheme="majorBidi" w:cstheme="majorBidi"/>
+                          <w:sz w:val="28"/>
+                          <w:szCs w:val="28"/>
+                        </w:rPr>
+                        <w:t>apiVersion</w:t>
+                      </w:r>
+                      <w:proofErr w:type="spellEnd"/>
+                      <w:r>
+                        <w:rPr>
+                          <w:rFonts w:asciiTheme="majorBidi" w:hAnsiTheme="majorBidi" w:cstheme="majorBidi"/>
+                          <w:sz w:val="28"/>
+                          <w:szCs w:val="28"/>
+                        </w:rPr>
+                        <w:t>: v1</w:t>
+                      </w:r>
+                    </w:p>
+                    <w:p>
+                      <w:pPr>
+                        <w:spacing w:after="0"/>
+                        <w:rPr>
+                          <w:rFonts w:asciiTheme="majorBidi" w:hAnsiTheme="majorBidi" w:cstheme="majorBidi"/>
+                          <w:sz w:val="28"/>
+                          <w:szCs w:val="28"/>
+                        </w:rPr>
+                      </w:pPr>
+                      <w:r>
+                        <w:rPr>
+                          <w:rFonts w:asciiTheme="majorBidi" w:hAnsiTheme="majorBidi" w:cstheme="majorBidi"/>
+                          <w:sz w:val="28"/>
+                          <w:szCs w:val="28"/>
+                        </w:rPr>
+                        <w:t>kind: Pod</w:t>
+                      </w:r>
+                    </w:p>
+                    <w:p>
+                      <w:pPr>
+                        <w:spacing w:after="0"/>
+                        <w:rPr>
+                          <w:rFonts w:asciiTheme="majorBidi" w:hAnsiTheme="majorBidi" w:cstheme="majorBidi"/>
+                          <w:sz w:val="28"/>
+                          <w:szCs w:val="28"/>
+                        </w:rPr>
+                      </w:pPr>
+                      <w:r>
+                        <w:rPr>
+                          <w:rFonts w:asciiTheme="majorBidi" w:hAnsiTheme="majorBidi" w:cstheme="majorBidi"/>
+                          <w:sz w:val="28"/>
+                          <w:szCs w:val="28"/>
+                        </w:rPr>
+                        <w:t>metadata:</w:t>
+                      </w:r>
+                    </w:p>
+                    <w:p>
+                      <w:pPr>
+                        <w:spacing w:after="0"/>
+                        <w:rPr>
+                          <w:rFonts w:asciiTheme="majorBidi" w:hAnsiTheme="majorBidi" w:cstheme="majorBidi"/>
+                          <w:sz w:val="28"/>
+                          <w:szCs w:val="28"/>
+                        </w:rPr>
+                      </w:pPr>
+                      <w:r>
+                        <w:rPr>
+                          <w:rFonts w:asciiTheme="majorBidi" w:hAnsiTheme="majorBidi" w:cstheme="majorBidi"/>
+                          <w:sz w:val="28"/>
+                          <w:szCs w:val="28"/>
+                        </w:rPr>
+                        <w:t xml:space="preserve">     </w:t>
+                      </w:r>
+                      <w:r>
+                        <w:rPr>
+                          <w:rFonts w:asciiTheme="majorBidi" w:hAnsiTheme="majorBidi" w:cstheme="majorBidi"/>
+                          <w:sz w:val="28"/>
+                          <w:szCs w:val="28"/>
+                        </w:rPr>
+                        <w:t>name: example-pod</w:t>
+                      </w:r>
+                    </w:p>
+                    <w:p>
+                      <w:pPr>
+                        <w:spacing w:after="0"/>
+                        <w:rPr>
+                          <w:rFonts w:asciiTheme="majorBidi" w:hAnsiTheme="majorBidi" w:cstheme="majorBidi"/>
+                          <w:sz w:val="28"/>
+                          <w:szCs w:val="28"/>
+                        </w:rPr>
+                      </w:pPr>
+                      <w:r>
+                        <w:rPr>
+                          <w:rFonts w:asciiTheme="majorBidi" w:hAnsiTheme="majorBidi" w:cstheme="majorBidi"/>
+                          <w:sz w:val="28"/>
+                          <w:szCs w:val="28"/>
+                        </w:rPr>
+                        <w:t>spec:</w:t>
+                      </w:r>
+                    </w:p>
+                    <w:p>
+                      <w:pPr>
+                        <w:spacing w:after="0"/>
+                        <w:rPr>
+                          <w:rFonts w:asciiTheme="majorBidi" w:hAnsiTheme="majorBidi" w:cstheme="majorBidi"/>
+                          <w:sz w:val="28"/>
+                          <w:szCs w:val="28"/>
+                        </w:rPr>
+                      </w:pPr>
+                      <w:r>
+                        <w:rPr>
+                          <w:rFonts w:asciiTheme="majorBidi" w:hAnsiTheme="majorBidi" w:cstheme="majorBidi"/>
+                          <w:sz w:val="28"/>
+                          <w:szCs w:val="28"/>
+                        </w:rPr>
+                        <w:t xml:space="preserve">     </w:t>
+                      </w:r>
+                      <w:r>
+                        <w:rPr>
+                          <w:rFonts w:asciiTheme="majorBidi" w:hAnsiTheme="majorBidi" w:cstheme="majorBidi"/>
+                          <w:sz w:val="28"/>
+                          <w:szCs w:val="28"/>
+                        </w:rPr>
+                        <w:t>containers:</w:t>
+                      </w:r>
+                    </w:p>
+                    <w:p>
+                      <w:pPr>
+                        <w:spacing w:after="0"/>
+                        <w:rPr>
+                          <w:rFonts w:asciiTheme="majorBidi" w:hAnsiTheme="majorBidi" w:cstheme="majorBidi"/>
+                          <w:sz w:val="28"/>
+                          <w:szCs w:val="28"/>
+                        </w:rPr>
+                      </w:pPr>
+                      <w:r>
+                        <w:rPr>
+                          <w:rFonts w:asciiTheme="majorBidi" w:hAnsiTheme="majorBidi" w:cstheme="majorBidi"/>
+                          <w:sz w:val="28"/>
+                          <w:szCs w:val="28"/>
+                        </w:rPr>
+                        <w:t xml:space="preserve">          </w:t>
+                      </w:r>
+                      <w:r>
+                        <w:rPr>
+                          <w:rFonts w:asciiTheme="majorBidi" w:hAnsiTheme="majorBidi" w:cstheme="majorBidi"/>
+                          <w:sz w:val="28"/>
+                          <w:szCs w:val="28"/>
+                        </w:rPr>
+                        <w:t>- name: my-container</w:t>
+                      </w:r>
+                    </w:p>
+                    <w:p>
+                      <w:pPr>
+                        <w:spacing w:after="0"/>
+                        <w:rPr>
+                          <w:rFonts w:asciiTheme="majorBidi" w:hAnsiTheme="majorBidi" w:cstheme="majorBidi"/>
+                          <w:sz w:val="28"/>
+                          <w:szCs w:val="28"/>
+                        </w:rPr>
+                      </w:pPr>
+                      <w:r>
+                        <w:rPr>
+                          <w:rFonts w:asciiTheme="majorBidi" w:hAnsiTheme="majorBidi" w:cstheme="majorBidi"/>
+                          <w:sz w:val="28"/>
+                          <w:szCs w:val="28"/>
+                        </w:rPr>
+                        <w:t xml:space="preserve">          </w:t>
+                      </w:r>
+                      <w:r>
+                        <w:rPr>
+                          <w:rFonts w:asciiTheme="majorBidi" w:hAnsiTheme="majorBidi" w:cstheme="majorBidi"/>
+                          <w:sz w:val="28"/>
+                          <w:szCs w:val="28"/>
+                        </w:rPr>
+                        <w:t xml:space="preserve">  </w:t>
+                      </w:r>
+                      <w:r>
+                        <w:rPr>
+                          <w:rFonts w:asciiTheme="majorBidi" w:hAnsiTheme="majorBidi" w:cstheme="majorBidi"/>
+                          <w:sz w:val="28"/>
+                          <w:szCs w:val="28"/>
+                        </w:rPr>
+                        <w:t>image: nginx</w:t>
+                      </w:r>
+                    </w:p>
+                    <w:p>
+                      <w:pPr>
+                        <w:spacing w:after="0"/>
+                        <w:rPr>
+                          <w:rFonts w:asciiTheme="majorBidi" w:hAnsiTheme="majorBidi" w:cstheme="majorBidi"/>
+                          <w:sz w:val="28"/>
+                          <w:szCs w:val="28"/>
+                        </w:rPr>
+                      </w:pPr>
+                      <w:r>
+                        <w:rPr>
+                          <w:rFonts w:asciiTheme="majorBidi" w:hAnsiTheme="majorBidi" w:cstheme="majorBidi"/>
+                          <w:sz w:val="28"/>
+                          <w:szCs w:val="28"/>
+                        </w:rPr>
+                        <w:t xml:space="preserve">     </w:t>
+                      </w:r>
+                      <w:proofErr w:type="spellStart"/>
+                      <w:r>
+                        <w:rPr>
+                          <w:rFonts w:asciiTheme="majorBidi" w:hAnsiTheme="majorBidi" w:cstheme="majorBidi"/>
+                          <w:sz w:val="28"/>
+                          <w:szCs w:val="28"/>
+                        </w:rPr>
+                        <w:t>restartPolicy</w:t>
+                      </w:r>
+                      <w:proofErr w:type="spellEnd"/>
+                      <w:r>
+                        <w:rPr>
+                          <w:rFonts w:asciiTheme="majorBidi" w:hAnsiTheme="majorBidi" w:cstheme="majorBidi"/>
+                          <w:sz w:val="28"/>
+                          <w:szCs w:val="28"/>
+                        </w:rPr>
+                        <w:t>: Always</w:t>
+                      </w:r>
+                    </w:p>
+                  </w:txbxContent>
+                </v:textbox>
+                <w10:wrap anchorx="margin"/>
+              </v:rect>
+            </w:pict>
+          </mc:Fallback>
+        </mc:AlternateContent>
+      </w:r>
+      <w:r>
+        <w:rPr>
+          <w:rFonts w:asciiTheme="majorBidi" w:hAnsiTheme="majorBidi" w:cstheme="majorBidi"/>
+          <w:sz w:val="28"/>
+          <w:szCs w:val="28"/>
+          <w:u w:val="single"/>
+        </w:rPr>
+        <w:t>Example:</w:t>
+      </w:r>
+    </w:p>
+    <w:p>
+      <w:pPr>
+        <w:jc w:val="both"/>
+        <w:rPr>
+          <w:rFonts w:asciiTheme="majorBidi" w:hAnsiTheme="majorBidi" w:cstheme="majorBidi"/>
+          <w:sz w:val="28"/>
+          <w:szCs w:val="28"/>
+        </w:rPr>
+      </w:pPr>
+    </w:p>
+    <w:p>
+      <w:pPr>
+        <w:jc w:val="both"/>
+        <w:rPr>
+          <w:rFonts w:asciiTheme="majorBidi" w:hAnsiTheme="majorBidi" w:cstheme="majorBidi"/>
+          <w:sz w:val="28"/>
+          <w:szCs w:val="28"/>
+        </w:rPr>
+      </w:pPr>
+    </w:p>
+    <w:p>
+      <w:pPr>
+        <w:jc w:val="both"/>
+        <w:rPr>
+          <w:rFonts w:asciiTheme="majorBidi" w:hAnsiTheme="majorBidi" w:cstheme="majorBidi"/>
+          <w:sz w:val="28"/>
+          <w:szCs w:val="28"/>
+        </w:rPr>
+      </w:pPr>
+    </w:p>
+    <w:p>
+      <w:pPr>
+        <w:jc w:val="both"/>
+        <w:rPr>
+          <w:rFonts w:asciiTheme="majorBidi" w:hAnsiTheme="majorBidi" w:cstheme="majorBidi"/>
+          <w:sz w:val="28"/>
+          <w:szCs w:val="28"/>
+        </w:rPr>
+      </w:pPr>
+    </w:p>
+    <w:p>
+      <w:pPr>
+        <w:jc w:val="both"/>
+        <w:rPr>
+          <w:rFonts w:asciiTheme="majorBidi" w:hAnsiTheme="majorBidi" w:cstheme="majorBidi"/>
+          <w:sz w:val="28"/>
+          <w:szCs w:val="28"/>
+        </w:rPr>
+      </w:pPr>
+    </w:p>
+    <w:p>
+      <w:pPr>
+        <w:jc w:val="both"/>
+        <w:rPr>
+          <w:rFonts w:asciiTheme="majorBidi" w:hAnsiTheme="majorBidi" w:cstheme="majorBidi"/>
+          <w:sz w:val="28"/>
+          <w:szCs w:val="28"/>
+        </w:rPr>
+      </w:pPr>
+    </w:p>
+    <w:p>
+      <w:pPr>
+        <w:jc w:val="both"/>
+        <w:rPr>
+          <w:rFonts w:asciiTheme="majorBidi" w:hAnsiTheme="majorBidi" w:cstheme="majorBidi"/>
+          <w:b/>
+          <w:bCs/>
+          <w:sz w:val="20"/>
+          <w:szCs w:val="20"/>
+        </w:rPr>
+      </w:pPr>
+    </w:p>
+    <w:p>
+      <w:pPr>
+        <w:jc w:val="both"/>
+        <w:rPr>
+          <w:rFonts w:asciiTheme="majorBidi" w:hAnsiTheme="majorBidi" w:cstheme="majorBidi"/>
+          <w:b/>
+          <w:bCs/>
+          <w:sz w:val="32"/>
+          <w:szCs w:val="32"/>
+        </w:rPr>
+      </w:pPr>
+      <w:r>
+        <w:rPr>
+          <w:rFonts w:asciiTheme="majorBidi" w:hAnsiTheme="majorBidi" w:cstheme="majorBidi"/>
+          <w:b/>
+          <w:bCs/>
+          <w:sz w:val="32"/>
+          <w:szCs w:val="32"/>
+        </w:rPr>
+        <w:t>Pod Termination Process</w:t>
+      </w:r>
+      <w:r>
+        <w:rPr>
+          <w:rFonts w:asciiTheme="majorBidi" w:hAnsiTheme="majorBidi" w:cstheme="majorBidi"/>
+          <w:b/>
+          <w:bCs/>
+          <w:sz w:val="32"/>
+          <w:szCs w:val="32"/>
+        </w:rPr>
+        <w:t>:</w:t>
+      </w:r>
+    </w:p>
+    <w:p>
+      <w:pPr>
+        <w:jc w:val="both"/>
+        <w:rPr>
+          <w:rFonts w:asciiTheme="majorBidi" w:hAnsiTheme="majorBidi" w:cstheme="majorBidi"/>
+          <w:sz w:val="28"/>
+          <w:szCs w:val="28"/>
+        </w:rPr>
+      </w:pPr>
+      <w:r>
+        <w:rPr>
+          <w:rFonts w:asciiTheme="majorBidi" w:hAnsiTheme="majorBidi" w:cstheme="majorBidi"/>
+          <w:sz w:val="28"/>
+          <w:szCs w:val="28"/>
+        </w:rPr>
+        <w:t>When a Pod is deleted or needs to be shut down, Kubernetes performs a graceful termination process.</w:t>
+      </w:r>
+    </w:p>
+    <w:p>
+      <w:pPr>
+        <w:pStyle w:val="ListParagraph"/>
+        <w:numPr>
+          <w:ilvl w:val="0"/>
+          <w:numId w:val="34"/>
+        </w:numPr>
+        <w:ind w:left="360"/>
+        <w:jc w:val="both"/>
+        <w:rPr>
+          <w:rFonts w:asciiTheme="majorBidi" w:hAnsiTheme="majorBidi" w:cstheme="majorBidi"/>
+          <w:sz w:val="28"/>
+          <w:szCs w:val="28"/>
+        </w:rPr>
+      </w:pPr>
+      <w:r>
+        <w:rPr>
+          <w:rFonts w:asciiTheme="majorBidi" w:hAnsiTheme="majorBidi" w:cstheme="majorBidi"/>
+          <w:sz w:val="28"/>
+          <w:szCs w:val="28"/>
+        </w:rPr>
+        <w:t>The Pod is marked for deletion in the API server.</w:t>
+      </w:r>
+    </w:p>
+    <w:p>
+      <w:pPr>
+        <w:pStyle w:val="ListParagraph"/>
+        <w:numPr>
+          <w:ilvl w:val="0"/>
+          <w:numId w:val="34"/>
+        </w:numPr>
+        <w:ind w:left="360"/>
+        <w:jc w:val="both"/>
+        <w:rPr>
+          <w:rFonts w:asciiTheme="majorBidi" w:hAnsiTheme="majorBidi" w:cstheme="majorBidi"/>
+          <w:sz w:val="28"/>
+          <w:szCs w:val="28"/>
+        </w:rPr>
+      </w:pPr>
+      <w:r>
+        <w:rPr>
+          <w:rFonts w:asciiTheme="majorBidi" w:hAnsiTheme="majorBidi" w:cstheme="majorBidi"/>
+          <w:sz w:val="28"/>
+          <w:szCs w:val="28"/>
+        </w:rPr>
+        <w:t>Kubernetes sends a SIGTERM signal to the containers in the Pod.</w:t>
+      </w:r>
+    </w:p>
+    <w:p>
+      <w:pPr>
+        <w:pStyle w:val="ListParagraph"/>
+        <w:numPr>
+          <w:ilvl w:val="0"/>
+          <w:numId w:val="34"/>
+        </w:numPr>
+        <w:ind w:left="360"/>
+        <w:jc w:val="both"/>
+        <w:rPr>
+          <w:rFonts w:asciiTheme="majorBidi" w:hAnsiTheme="majorBidi" w:cstheme="majorBidi"/>
+          <w:sz w:val="28"/>
+          <w:szCs w:val="28"/>
+        </w:rPr>
+      </w:pPr>
+      <w:r>
+        <w:rPr>
+          <w:rFonts w:asciiTheme="majorBidi" w:hAnsiTheme="majorBidi" w:cstheme="majorBidi"/>
+          <w:sz w:val="28"/>
+          <w:szCs w:val="28"/>
+        </w:rPr>
+        <w:t>The containers are given a configurable termination grace period (default 30 seconds) to shut down cleanly.</w:t>
+      </w:r>
+    </w:p>
+    <w:p>
+      <w:pPr>
+        <w:pStyle w:val="ListParagraph"/>
+        <w:numPr>
+          <w:ilvl w:val="0"/>
+          <w:numId w:val="34"/>
+        </w:numPr>
+        <w:ind w:left="360"/>
+        <w:jc w:val="both"/>
+        <w:rPr>
+          <w:rFonts w:asciiTheme="majorBidi" w:hAnsiTheme="majorBidi" w:cstheme="majorBidi"/>
+          <w:sz w:val="28"/>
+          <w:szCs w:val="28"/>
+        </w:rPr>
+      </w:pPr>
+      <w:r>
+        <w:rPr>
+          <w:rFonts w:asciiTheme="majorBidi" w:hAnsiTheme="majorBidi" w:cstheme="majorBidi"/>
+          <w:sz w:val="28"/>
+          <w:szCs w:val="28"/>
+        </w:rPr>
+        <w:t xml:space="preserve">If the containers do not </w:t>
+      </w:r>
+      <w:proofErr w:type="spellStart"/>
+      <w:r>
+        <w:rPr>
+          <w:rFonts w:asciiTheme="majorBidi" w:hAnsiTheme="majorBidi" w:cstheme="majorBidi"/>
+          <w:sz w:val="28"/>
+          <w:szCs w:val="28"/>
+        </w:rPr>
+        <w:t>exit</w:t>
+      </w:r>
+      <w:proofErr w:type="spellEnd"/>
+      <w:r>
+        <w:rPr>
+          <w:rFonts w:asciiTheme="majorBidi" w:hAnsiTheme="majorBidi" w:cstheme="majorBidi"/>
+          <w:sz w:val="28"/>
+          <w:szCs w:val="28"/>
+        </w:rPr>
+        <w:t xml:space="preserve"> within the grace period, Kubernetes sends SIGKILL, forcibly terminating them.</w:t>
+      </w:r>
+    </w:p>
+    <w:p>
+      <w:pPr>
+        <w:jc w:val="both"/>
+        <w:rPr>
+          <w:rFonts w:asciiTheme="majorBidi" w:hAnsiTheme="majorBidi" w:cstheme="majorBidi"/>
+          <w:sz w:val="28"/>
+          <w:szCs w:val="28"/>
+        </w:rPr>
+      </w:pPr>
+      <w:r>
+        <w:rPr>
+          <w:rFonts w:asciiTheme="majorBidi" w:hAnsiTheme="majorBidi" w:cstheme="majorBidi"/>
+          <w:sz w:val="28"/>
+          <w:szCs w:val="28"/>
+        </w:rPr>
+        <w:lastRenderedPageBreak/>
+        <w:t>During this process, the Pod is removed from service endpoints so that it no longer receives traffic.</w:t>
+      </w:r>
+    </w:p>
+    <w:p>
+      <w:pPr>
+        <w:jc w:val="both"/>
+        <w:rPr>
+          <w:rFonts w:asciiTheme="majorBidi" w:hAnsiTheme="majorBidi" w:cstheme="majorBidi"/>
+          <w:b/>
+          <w:bCs/>
+          <w:sz w:val="32"/>
+          <w:szCs w:val="32"/>
+        </w:rPr>
+      </w:pPr>
+      <w:r>
+        <w:rPr>
+          <w:rFonts w:asciiTheme="majorBidi" w:hAnsiTheme="majorBidi" w:cstheme="majorBidi"/>
+          <w:b/>
+          <w:bCs/>
+          <w:sz w:val="32"/>
+          <w:szCs w:val="32"/>
+        </w:rPr>
+        <w:t>Pod Lifecycle Hooks</w:t>
+      </w:r>
+      <w:r>
+        <w:rPr>
+          <w:rFonts w:asciiTheme="majorBidi" w:hAnsiTheme="majorBidi" w:cstheme="majorBidi"/>
+          <w:b/>
+          <w:bCs/>
+          <w:sz w:val="32"/>
+          <w:szCs w:val="32"/>
+        </w:rPr>
+        <w:t>:</w:t>
+      </w:r>
+    </w:p>
+    <w:p>
+      <w:pPr>
+        <w:jc w:val="both"/>
+        <w:rPr>
+          <w:rFonts w:asciiTheme="majorBidi" w:hAnsiTheme="majorBidi" w:cstheme="majorBidi"/>
+          <w:sz w:val="28"/>
+          <w:szCs w:val="28"/>
+        </w:rPr>
+      </w:pPr>
+      <w:r>
+        <w:rPr>
+          <w:rFonts w:asciiTheme="majorBidi" w:hAnsiTheme="majorBidi" w:cstheme="majorBidi"/>
+          <w:sz w:val="28"/>
+          <w:szCs w:val="28"/>
+        </w:rPr>
+        <w:t>Kubernetes provides lifecycle hooks that allow custom actions during container lifecycle events.</w:t>
+      </w:r>
+    </w:p>
+    <w:p>
+      <w:pPr>
+        <w:pStyle w:val="ListParagraph"/>
+        <w:numPr>
+          <w:ilvl w:val="0"/>
+          <w:numId w:val="35"/>
+        </w:numPr>
+        <w:ind w:left="360"/>
+        <w:jc w:val="both"/>
+        <w:rPr>
+          <w:rFonts w:asciiTheme="majorBidi" w:hAnsiTheme="majorBidi" w:cstheme="majorBidi"/>
+          <w:sz w:val="28"/>
+          <w:szCs w:val="28"/>
+        </w:rPr>
+      </w:pPr>
+      <w:proofErr w:type="spellStart"/>
+      <w:r>
+        <w:rPr>
+          <w:rFonts w:asciiTheme="majorBidi" w:hAnsiTheme="majorBidi" w:cstheme="majorBidi"/>
+          <w:b/>
+          <w:bCs/>
+          <w:i/>
+          <w:iCs/>
+          <w:sz w:val="28"/>
+          <w:szCs w:val="28"/>
+        </w:rPr>
+        <w:t>PostStart</w:t>
+      </w:r>
+      <w:proofErr w:type="spellEnd"/>
+      <w:r>
+        <w:rPr>
+          <w:rFonts w:asciiTheme="majorBidi" w:hAnsiTheme="majorBidi" w:cstheme="majorBidi"/>
+          <w:sz w:val="28"/>
+          <w:szCs w:val="28"/>
+        </w:rPr>
+        <w:t xml:space="preserve"> </w:t>
+      </w:r>
+      <w:r>
+        <w:rPr>
+          <w:rFonts w:asciiTheme="majorBidi" w:hAnsiTheme="majorBidi" w:cstheme="majorBidi"/>
+          <w:sz w:val="28"/>
+          <w:szCs w:val="28"/>
+        </w:rPr>
+        <w:t xml:space="preserve">→ </w:t>
+      </w:r>
+      <w:r>
+        <w:rPr>
+          <w:rFonts w:asciiTheme="majorBidi" w:hAnsiTheme="majorBidi" w:cstheme="majorBidi"/>
+          <w:sz w:val="28"/>
+          <w:szCs w:val="28"/>
+        </w:rPr>
+        <w:t>Executed immediately after a container is created.</w:t>
+      </w:r>
+    </w:p>
+    <w:p>
+      <w:pPr>
+        <w:pStyle w:val="ListParagraph"/>
+        <w:numPr>
+          <w:ilvl w:val="0"/>
+          <w:numId w:val="35"/>
+        </w:numPr>
+        <w:ind w:left="360"/>
+        <w:jc w:val="both"/>
+        <w:rPr>
+          <w:rFonts w:asciiTheme="majorBidi" w:hAnsiTheme="majorBidi" w:cstheme="majorBidi"/>
+          <w:sz w:val="28"/>
+          <w:szCs w:val="28"/>
+        </w:rPr>
+      </w:pPr>
+      <w:proofErr w:type="spellStart"/>
+      <w:r>
+        <w:rPr>
+          <w:rFonts w:asciiTheme="majorBidi" w:hAnsiTheme="majorBidi" w:cstheme="majorBidi"/>
+          <w:b/>
+          <w:bCs/>
+          <w:i/>
+          <w:iCs/>
+          <w:sz w:val="28"/>
+          <w:szCs w:val="28"/>
+        </w:rPr>
+        <w:t>PreStop</w:t>
+      </w:r>
+      <w:proofErr w:type="spellEnd"/>
+      <w:r>
+        <w:rPr>
+          <w:rFonts w:asciiTheme="majorBidi" w:hAnsiTheme="majorBidi" w:cstheme="majorBidi"/>
+          <w:sz w:val="28"/>
+          <w:szCs w:val="28"/>
+        </w:rPr>
+        <w:t xml:space="preserve"> </w:t>
+      </w:r>
+      <w:r>
+        <w:rPr>
+          <w:rFonts w:asciiTheme="majorBidi" w:hAnsiTheme="majorBidi" w:cstheme="majorBidi"/>
+          <w:sz w:val="28"/>
+          <w:szCs w:val="28"/>
+        </w:rPr>
+        <w:t xml:space="preserve">→ </w:t>
+      </w:r>
+      <w:r>
+        <w:rPr>
+          <w:rFonts w:asciiTheme="majorBidi" w:hAnsiTheme="majorBidi" w:cstheme="majorBidi"/>
+          <w:sz w:val="28"/>
+          <w:szCs w:val="28"/>
+        </w:rPr>
+        <w:t>Executed just before a container is terminated, allowing cleanup actions such as closing connections or saving state.</w:t>
+      </w:r>
+    </w:p>
+    <w:p>
+      <w:pPr>
+        <w:jc w:val="both"/>
+        <w:rPr>
+          <w:rFonts w:asciiTheme="majorBidi" w:hAnsiTheme="majorBidi" w:cstheme="majorBidi"/>
+          <w:sz w:val="28"/>
+          <w:szCs w:val="28"/>
+        </w:rPr>
+      </w:pPr>
+      <w:r>
+        <w:rPr>
+          <w:rFonts w:asciiTheme="majorBidi" w:hAnsiTheme="majorBidi" w:cstheme="majorBidi"/>
+          <w:sz w:val="28"/>
+          <w:szCs w:val="28"/>
+        </w:rPr>
+        <w:t>These hooks help ensure that applications shut down gracefully.</w:t>
+      </w:r>
+    </w:p>
+    <w:p>
+      <w:pPr>
+        <w:jc w:val="both"/>
+        <w:rPr>
+          <w:rFonts w:asciiTheme="majorBidi" w:hAnsiTheme="majorBidi" w:cstheme="majorBidi"/>
+          <w:b/>
+          <w:bCs/>
+          <w:sz w:val="32"/>
+          <w:szCs w:val="32"/>
+        </w:rPr>
+      </w:pPr>
+      <w:r>
+        <w:rPr>
+          <w:rFonts w:asciiTheme="majorBidi" w:hAnsiTheme="majorBidi" w:cstheme="majorBidi"/>
+          <w:b/>
+          <w:bCs/>
+          <w:sz w:val="32"/>
+          <w:szCs w:val="32"/>
+        </w:rPr>
+        <w:t>Pod Lifecycle Summary</w:t>
+      </w:r>
+      <w:r>
+        <w:rPr>
+          <w:rFonts w:asciiTheme="majorBidi" w:hAnsiTheme="majorBidi" w:cstheme="majorBidi"/>
+          <w:b/>
+          <w:bCs/>
+          <w:sz w:val="32"/>
+          <w:szCs w:val="32"/>
+        </w:rPr>
+        <w:t>:</w:t>
+      </w:r>
+    </w:p>
+    <w:p>
+      <w:pPr>
+        <w:jc w:val="both"/>
+        <w:rPr>
+          <w:rFonts w:asciiTheme="majorBidi" w:hAnsiTheme="majorBidi" w:cstheme="majorBidi"/>
+          <w:sz w:val="28"/>
+          <w:szCs w:val="28"/>
+        </w:rPr>
+      </w:pPr>
+      <w:r>
+        <w:rPr>
+          <w:rFonts w:asciiTheme="majorBidi" w:hAnsiTheme="majorBidi" w:cstheme="majorBidi"/>
+          <w:sz w:val="28"/>
+          <w:szCs w:val="28"/>
+        </w:rPr>
+        <w:t>The lifecycle of a Pod typically follows this sequence:</w:t>
+      </w:r>
+    </w:p>
+    <w:p>
+      <w:pPr>
+        <w:pStyle w:val="ListParagraph"/>
+        <w:numPr>
+          <w:ilvl w:val="0"/>
+          <w:numId w:val="36"/>
+        </w:numPr>
+        <w:ind w:left="360"/>
+        <w:jc w:val="both"/>
+        <w:rPr>
+          <w:rFonts w:asciiTheme="majorBidi" w:hAnsiTheme="majorBidi" w:cstheme="majorBidi"/>
+          <w:sz w:val="28"/>
+          <w:szCs w:val="28"/>
+        </w:rPr>
+      </w:pPr>
+      <w:r>
+        <w:rPr>
+          <w:rFonts w:asciiTheme="majorBidi" w:hAnsiTheme="majorBidi" w:cstheme="majorBidi"/>
+          <w:sz w:val="28"/>
+          <w:szCs w:val="28"/>
+        </w:rPr>
+        <w:t>Pod definition submitted to the API server.</w:t>
+      </w:r>
+    </w:p>
+    <w:p>
+      <w:pPr>
+        <w:pStyle w:val="ListParagraph"/>
+        <w:numPr>
+          <w:ilvl w:val="0"/>
+          <w:numId w:val="36"/>
+        </w:numPr>
+        <w:ind w:left="360"/>
+        <w:jc w:val="both"/>
+        <w:rPr>
+          <w:rFonts w:asciiTheme="majorBidi" w:hAnsiTheme="majorBidi" w:cstheme="majorBidi"/>
+          <w:sz w:val="28"/>
+          <w:szCs w:val="28"/>
+        </w:rPr>
+      </w:pPr>
+      <w:r>
+        <w:rPr>
+          <w:rFonts w:asciiTheme="majorBidi" w:hAnsiTheme="majorBidi" w:cstheme="majorBidi"/>
+          <w:sz w:val="28"/>
+          <w:szCs w:val="28"/>
+        </w:rPr>
+        <w:t xml:space="preserve">Pod stored in </w:t>
+      </w:r>
+      <w:proofErr w:type="spellStart"/>
+      <w:r>
+        <w:rPr>
+          <w:rFonts w:asciiTheme="majorBidi" w:hAnsiTheme="majorBidi" w:cstheme="majorBidi"/>
+          <w:sz w:val="28"/>
+          <w:szCs w:val="28"/>
+        </w:rPr>
+        <w:t>etcd</w:t>
+      </w:r>
+      <w:proofErr w:type="spellEnd"/>
+      <w:r>
+        <w:rPr>
+          <w:rFonts w:asciiTheme="majorBidi" w:hAnsiTheme="majorBidi" w:cstheme="majorBidi"/>
+          <w:sz w:val="28"/>
+          <w:szCs w:val="28"/>
+        </w:rPr>
+        <w:t>.</w:t>
+      </w:r>
+    </w:p>
+    <w:p>
+      <w:pPr>
+        <w:pStyle w:val="ListParagraph"/>
+        <w:numPr>
+          <w:ilvl w:val="0"/>
+          <w:numId w:val="36"/>
+        </w:numPr>
+        <w:ind w:left="360"/>
+        <w:jc w:val="both"/>
+        <w:rPr>
+          <w:rFonts w:asciiTheme="majorBidi" w:hAnsiTheme="majorBidi" w:cstheme="majorBidi"/>
+          <w:sz w:val="28"/>
+          <w:szCs w:val="28"/>
+        </w:rPr>
+      </w:pPr>
+      <w:r>
+        <w:rPr>
+          <w:rFonts w:asciiTheme="majorBidi" w:hAnsiTheme="majorBidi" w:cstheme="majorBidi"/>
+          <w:sz w:val="28"/>
+          <w:szCs w:val="28"/>
+        </w:rPr>
+        <w:t>Scheduler assigns the Pod to a node.</w:t>
+      </w:r>
+    </w:p>
+    <w:p>
+      <w:pPr>
+        <w:pStyle w:val="ListParagraph"/>
+        <w:numPr>
+          <w:ilvl w:val="0"/>
+          <w:numId w:val="36"/>
+        </w:numPr>
+        <w:ind w:left="360"/>
+        <w:jc w:val="both"/>
+        <w:rPr>
+          <w:rFonts w:asciiTheme="majorBidi" w:hAnsiTheme="majorBidi" w:cstheme="majorBidi"/>
+          <w:sz w:val="28"/>
+          <w:szCs w:val="28"/>
+        </w:rPr>
+      </w:pPr>
+      <w:proofErr w:type="spellStart"/>
+      <w:r>
+        <w:rPr>
+          <w:rFonts w:asciiTheme="majorBidi" w:hAnsiTheme="majorBidi" w:cstheme="majorBidi"/>
+          <w:sz w:val="28"/>
+          <w:szCs w:val="28"/>
+        </w:rPr>
+        <w:t>kubelet</w:t>
+      </w:r>
+      <w:proofErr w:type="spellEnd"/>
+      <w:r>
+        <w:rPr>
+          <w:rFonts w:asciiTheme="majorBidi" w:hAnsiTheme="majorBidi" w:cstheme="majorBidi"/>
+          <w:sz w:val="28"/>
+          <w:szCs w:val="28"/>
+        </w:rPr>
+        <w:t xml:space="preserve"> creates the Pod and pulls container images.</w:t>
+      </w:r>
+    </w:p>
+    <w:p>
+      <w:pPr>
+        <w:pStyle w:val="ListParagraph"/>
+        <w:numPr>
+          <w:ilvl w:val="0"/>
+          <w:numId w:val="36"/>
+        </w:numPr>
+        <w:ind w:left="360"/>
+        <w:jc w:val="both"/>
+        <w:rPr>
+          <w:rFonts w:asciiTheme="majorBidi" w:hAnsiTheme="majorBidi" w:cstheme="majorBidi"/>
+          <w:sz w:val="28"/>
+          <w:szCs w:val="28"/>
+        </w:rPr>
+      </w:pPr>
+      <w:r>
+        <w:rPr>
+          <w:rFonts w:asciiTheme="majorBidi" w:hAnsiTheme="majorBidi" w:cstheme="majorBidi"/>
+          <w:sz w:val="28"/>
+          <w:szCs w:val="28"/>
+        </w:rPr>
+        <w:t>Init containers run (if defined).</w:t>
+      </w:r>
+    </w:p>
+    <w:p>
+      <w:pPr>
+        <w:pStyle w:val="ListParagraph"/>
+        <w:numPr>
+          <w:ilvl w:val="0"/>
+          <w:numId w:val="36"/>
+        </w:numPr>
+        <w:ind w:left="360"/>
+        <w:jc w:val="both"/>
+        <w:rPr>
+          <w:rFonts w:asciiTheme="majorBidi" w:hAnsiTheme="majorBidi" w:cstheme="majorBidi"/>
+          <w:sz w:val="28"/>
+          <w:szCs w:val="28"/>
+        </w:rPr>
+      </w:pPr>
+      <w:r>
+        <w:rPr>
+          <w:rFonts w:asciiTheme="majorBidi" w:hAnsiTheme="majorBidi" w:cstheme="majorBidi"/>
+          <w:sz w:val="28"/>
+          <w:szCs w:val="28"/>
+        </w:rPr>
+        <w:t>Application containers start.</w:t>
+      </w:r>
+    </w:p>
+    <w:p>
+      <w:pPr>
+        <w:pStyle w:val="ListParagraph"/>
+        <w:numPr>
+          <w:ilvl w:val="0"/>
+          <w:numId w:val="36"/>
+        </w:numPr>
+        <w:ind w:left="360"/>
+        <w:jc w:val="both"/>
+        <w:rPr>
+          <w:rFonts w:asciiTheme="majorBidi" w:hAnsiTheme="majorBidi" w:cstheme="majorBidi"/>
+          <w:sz w:val="28"/>
+          <w:szCs w:val="28"/>
+        </w:rPr>
+      </w:pPr>
+      <w:r>
+        <w:rPr>
+          <w:rFonts w:asciiTheme="majorBidi" w:hAnsiTheme="majorBidi" w:cstheme="majorBidi"/>
+          <w:sz w:val="28"/>
+          <w:szCs w:val="28"/>
+        </w:rPr>
+        <w:t>Pod enters Running phase.</w:t>
+      </w:r>
+    </w:p>
+    <w:p>
+      <w:pPr>
+        <w:pStyle w:val="ListParagraph"/>
+        <w:numPr>
+          <w:ilvl w:val="0"/>
+          <w:numId w:val="36"/>
+        </w:numPr>
+        <w:ind w:left="360"/>
+        <w:jc w:val="both"/>
+        <w:rPr>
+          <w:rFonts w:asciiTheme="majorBidi" w:hAnsiTheme="majorBidi" w:cstheme="majorBidi"/>
+          <w:sz w:val="28"/>
+          <w:szCs w:val="28"/>
+        </w:rPr>
+      </w:pPr>
+      <w:r>
+        <w:rPr>
+          <w:rFonts w:asciiTheme="majorBidi" w:hAnsiTheme="majorBidi" w:cstheme="majorBidi"/>
+          <w:sz w:val="28"/>
+          <w:szCs w:val="28"/>
+        </w:rPr>
+        <w:t>Containers may restart according to restart policy.</w:t>
+      </w:r>
+    </w:p>
+    <w:p>
+      <w:pPr>
+        <w:pStyle w:val="ListParagraph"/>
+        <w:numPr>
+          <w:ilvl w:val="0"/>
+          <w:numId w:val="36"/>
+        </w:numPr>
+        <w:ind w:left="360"/>
+        <w:rPr>
+          <w:rFonts w:asciiTheme="majorBidi" w:hAnsiTheme="majorBidi" w:cstheme="majorBidi"/>
+          <w:sz w:val="28"/>
+          <w:szCs w:val="28"/>
+        </w:rPr>
+      </w:pPr>
+      <w:r>
+        <w:rPr>
+          <w:rFonts w:asciiTheme="majorBidi" w:hAnsiTheme="majorBidi" w:cstheme="majorBidi"/>
+          <w:sz w:val="28"/>
+          <w:szCs w:val="28"/>
+        </w:rPr>
+        <w:t>Pod eventually terminates and enters Succeeded or Failed state.</w:t>
+      </w:r>
+    </w:p>
+    <w:p>
+      <w:pPr>
+        <w:jc w:val="both"/>
+        <w:rPr>
+          <w:rFonts w:asciiTheme="majorBidi" w:hAnsiTheme="majorBidi" w:cstheme="majorBidi"/>
+          <w:sz w:val="28"/>
+          <w:szCs w:val="28"/>
+        </w:rPr>
+      </w:pPr>
     </w:p>
     <w:sectPr>
       <w:pgSz w:w="12240" w:h="15840"/>
@@ -15036,6 +17608,119 @@
     </w:lvl>
   </w:abstractNum>
   <w:abstractNum w:abstractNumId="6" w15:restartNumberingAfterBreak="0">
+    <w:nsid w:val="13333D8D"/>
+    <w:multiLevelType w:val="hybridMultilevel"/>
+    <w:tmpl w:val="270656F0"/>
+    <w:lvl w:ilvl="0" w:tplc="04090001">
+      <w:start w:val="1"/>
+      <w:numFmt w:val="bullet"/>
+      <w:lvlText w:val=""/>
+      <w:lvlJc w:val="left"/>
+      <w:pPr>
+        <w:ind w:left="720" w:hanging="360"/>
+      </w:pPr>
+      <w:rPr>
+        <w:rFonts w:ascii="Symbol" w:hAnsi="Symbol" w:hint="default"/>
+      </w:rPr>
+    </w:lvl>
+    <w:lvl w:ilvl="1" w:tplc="04090003" w:tentative="1">
+      <w:start w:val="1"/>
+      <w:numFmt w:val="bullet"/>
+      <w:lvlText w:val="o"/>
+      <w:lvlJc w:val="left"/>
+      <w:pPr>
+        <w:ind w:left="1440" w:hanging="360"/>
+      </w:pPr>
+      <w:rPr>
+        <w:rFonts w:ascii="Courier New" w:hAnsi="Courier New" w:cs="Courier New" w:hint="default"/>
+      </w:rPr>
+    </w:lvl>
+    <w:lvl w:ilvl="2" w:tplc="04090005" w:tentative="1">
+      <w:start w:val="1"/>
+      <w:numFmt w:val="bullet"/>
+      <w:lvlText w:val=""/>
+      <w:lvlJc w:val="left"/>
+      <w:pPr>
+        <w:ind w:left="2160" w:hanging="360"/>
+      </w:pPr>
+      <w:rPr>
+        <w:rFonts w:ascii="Wingdings" w:hAnsi="Wingdings" w:hint="default"/>
+      </w:rPr>
+    </w:lvl>
+    <w:lvl w:ilvl="3" w:tplc="04090001" w:tentative="1">
+      <w:start w:val="1"/>
+      <w:numFmt w:val="bullet"/>
+      <w:lvlText w:val=""/>
+      <w:lvlJc w:val="left"/>
+      <w:pPr>
+        <w:ind w:left="2880" w:hanging="360"/>
+      </w:pPr>
+      <w:rPr>
+        <w:rFonts w:ascii="Symbol" w:hAnsi="Symbol" w:hint="default"/>
+      </w:rPr>
+    </w:lvl>
+    <w:lvl w:ilvl="4" w:tplc="04090003" w:tentative="1">
+      <w:start w:val="1"/>
+      <w:numFmt w:val="bullet"/>
+      <w:lvlText w:val="o"/>
+      <w:lvlJc w:val="left"/>
+      <w:pPr>
+        <w:ind w:left="3600" w:hanging="360"/>
+      </w:pPr>
+      <w:rPr>
+        <w:rFonts w:ascii="Courier New" w:hAnsi="Courier New" w:cs="Courier New" w:hint="default"/>
+      </w:rPr>
+    </w:lvl>
+    <w:lvl w:ilvl="5" w:tplc="04090005" w:tentative="1">
+      <w:start w:val="1"/>
+      <w:numFmt w:val="bullet"/>
+      <w:lvlText w:val=""/>
+      <w:lvlJc w:val="left"/>
+      <w:pPr>
+        <w:ind w:left="4320" w:hanging="360"/>
+      </w:pPr>
+      <w:rPr>
+        <w:rFonts w:ascii="Wingdings" w:hAnsi="Wingdings" w:hint="default"/>
+      </w:rPr>
+    </w:lvl>
+    <w:lvl w:ilvl="6" w:tplc="04090001" w:tentative="1">
+      <w:start w:val="1"/>
+      <w:numFmt w:val="bullet"/>
+      <w:lvlText w:val=""/>
+      <w:lvlJc w:val="left"/>
+      <w:pPr>
+        <w:ind w:left="5040" w:hanging="360"/>
+      </w:pPr>
+      <w:rPr>
+        <w:rFonts w:ascii="Symbol" w:hAnsi="Symbol" w:hint="default"/>
+      </w:rPr>
+    </w:lvl>
+    <w:lvl w:ilvl="7" w:tplc="04090003" w:tentative="1">
+      <w:start w:val="1"/>
+      <w:numFmt w:val="bullet"/>
+      <w:lvlText w:val="o"/>
+      <w:lvlJc w:val="left"/>
+      <w:pPr>
+        <w:ind w:left="5760" w:hanging="360"/>
+      </w:pPr>
+      <w:rPr>
+        <w:rFonts w:ascii="Courier New" w:hAnsi="Courier New" w:cs="Courier New" w:hint="default"/>
+      </w:rPr>
+    </w:lvl>
+    <w:lvl w:ilvl="8" w:tplc="04090005" w:tentative="1">
+      <w:start w:val="1"/>
+      <w:numFmt w:val="bullet"/>
+      <w:lvlText w:val=""/>
+      <w:lvlJc w:val="left"/>
+      <w:pPr>
+        <w:ind w:left="6480" w:hanging="360"/>
+      </w:pPr>
+      <w:rPr>
+        <w:rFonts w:ascii="Wingdings" w:hAnsi="Wingdings" w:hint="default"/>
+      </w:rPr>
+    </w:lvl>
+  </w:abstractNum>
+  <w:abstractNum w:abstractNumId="7" w15:restartNumberingAfterBreak="0">
     <w:nsid w:val="13850A48"/>
     <w:multiLevelType w:val="hybridMultilevel"/>
     <w:tmpl w:val="53068A12"/>
@@ -15148,7 +17833,7 @@
       </w:rPr>
     </w:lvl>
   </w:abstractNum>
-  <w:abstractNum w:abstractNumId="7" w15:restartNumberingAfterBreak="0">
+  <w:abstractNum w:abstractNumId="8" w15:restartNumberingAfterBreak="0">
     <w:nsid w:val="14552F13"/>
     <w:multiLevelType w:val="hybridMultilevel"/>
     <w:tmpl w:val="50AC5050"/>
@@ -15234,7 +17919,7 @@
       </w:pPr>
     </w:lvl>
   </w:abstractNum>
-  <w:abstractNum w:abstractNumId="8" w15:restartNumberingAfterBreak="0">
+  <w:abstractNum w:abstractNumId="9" w15:restartNumberingAfterBreak="0">
     <w:nsid w:val="1AC47BC5"/>
     <w:multiLevelType w:val="hybridMultilevel"/>
     <w:tmpl w:val="F55ED52A"/>
@@ -15347,7 +18032,7 @@
       </w:rPr>
     </w:lvl>
   </w:abstractNum>
-  <w:abstractNum w:abstractNumId="9" w15:restartNumberingAfterBreak="0">
+  <w:abstractNum w:abstractNumId="10" w15:restartNumberingAfterBreak="0">
     <w:nsid w:val="1D67347B"/>
     <w:multiLevelType w:val="hybridMultilevel"/>
     <w:tmpl w:val="1DF6D484"/>
@@ -15460,7 +18145,7 @@
       </w:rPr>
     </w:lvl>
   </w:abstractNum>
-  <w:abstractNum w:abstractNumId="10" w15:restartNumberingAfterBreak="0">
+  <w:abstractNum w:abstractNumId="11" w15:restartNumberingAfterBreak="0">
     <w:nsid w:val="1E4623FD"/>
     <w:multiLevelType w:val="hybridMultilevel"/>
     <w:tmpl w:val="5CDE20BC"/>
@@ -15573,7 +18258,7 @@
       </w:rPr>
     </w:lvl>
   </w:abstractNum>
-  <w:abstractNum w:abstractNumId="11" w15:restartNumberingAfterBreak="0">
+  <w:abstractNum w:abstractNumId="12" w15:restartNumberingAfterBreak="0">
     <w:nsid w:val="20B73E64"/>
     <w:multiLevelType w:val="hybridMultilevel"/>
     <w:tmpl w:val="1D70A2CE"/>
@@ -15686,7 +18371,7 @@
       </w:rPr>
     </w:lvl>
   </w:abstractNum>
-  <w:abstractNum w:abstractNumId="12" w15:restartNumberingAfterBreak="0">
+  <w:abstractNum w:abstractNumId="13" w15:restartNumberingAfterBreak="0">
     <w:nsid w:val="21B00EB1"/>
     <w:multiLevelType w:val="hybridMultilevel"/>
     <w:tmpl w:val="7ACA0594"/>
@@ -15799,7 +18484,7 @@
       </w:rPr>
     </w:lvl>
   </w:abstractNum>
-  <w:abstractNum w:abstractNumId="13" w15:restartNumberingAfterBreak="0">
+  <w:abstractNum w:abstractNumId="14" w15:restartNumberingAfterBreak="0">
     <w:nsid w:val="279E2290"/>
     <w:multiLevelType w:val="hybridMultilevel"/>
     <w:tmpl w:val="DAA8F146"/>
@@ -15912,7 +18597,7 @@
       </w:rPr>
     </w:lvl>
   </w:abstractNum>
-  <w:abstractNum w:abstractNumId="14" w15:restartNumberingAfterBreak="0">
+  <w:abstractNum w:abstractNumId="15" w15:restartNumberingAfterBreak="0">
     <w:nsid w:val="29AB4277"/>
     <w:multiLevelType w:val="hybridMultilevel"/>
     <w:tmpl w:val="28BCFA3C"/>
@@ -16025,7 +18710,7 @@
       </w:rPr>
     </w:lvl>
   </w:abstractNum>
-  <w:abstractNum w:abstractNumId="15" w15:restartNumberingAfterBreak="0">
+  <w:abstractNum w:abstractNumId="16" w15:restartNumberingAfterBreak="0">
     <w:nsid w:val="307B0DB8"/>
     <w:multiLevelType w:val="hybridMultilevel"/>
     <w:tmpl w:val="DBDE5E72"/>
@@ -16138,7 +18823,7 @@
       </w:rPr>
     </w:lvl>
   </w:abstractNum>
-  <w:abstractNum w:abstractNumId="16" w15:restartNumberingAfterBreak="0">
+  <w:abstractNum w:abstractNumId="17" w15:restartNumberingAfterBreak="0">
     <w:nsid w:val="31B06D1D"/>
     <w:multiLevelType w:val="hybridMultilevel"/>
     <w:tmpl w:val="62141686"/>
@@ -16251,7 +18936,206 @@
       </w:rPr>
     </w:lvl>
   </w:abstractNum>
-  <w:abstractNum w:abstractNumId="17" w15:restartNumberingAfterBreak="0">
+  <w:abstractNum w:abstractNumId="18" w15:restartNumberingAfterBreak="0">
+    <w:nsid w:val="37463F6E"/>
+    <w:multiLevelType w:val="hybridMultilevel"/>
+    <w:tmpl w:val="419427CE"/>
+    <w:lvl w:ilvl="0" w:tplc="04090001">
+      <w:start w:val="1"/>
+      <w:numFmt w:val="bullet"/>
+      <w:lvlText w:val=""/>
+      <w:lvlJc w:val="left"/>
+      <w:pPr>
+        <w:ind w:left="720" w:hanging="360"/>
+      </w:pPr>
+      <w:rPr>
+        <w:rFonts w:ascii="Symbol" w:hAnsi="Symbol" w:hint="default"/>
+      </w:rPr>
+    </w:lvl>
+    <w:lvl w:ilvl="1" w:tplc="04090003" w:tentative="1">
+      <w:start w:val="1"/>
+      <w:numFmt w:val="bullet"/>
+      <w:lvlText w:val="o"/>
+      <w:lvlJc w:val="left"/>
+      <w:pPr>
+        <w:ind w:left="1440" w:hanging="360"/>
+      </w:pPr>
+      <w:rPr>
+        <w:rFonts w:ascii="Courier New" w:hAnsi="Courier New" w:cs="Courier New" w:hint="default"/>
+      </w:rPr>
+    </w:lvl>
+    <w:lvl w:ilvl="2" w:tplc="04090005" w:tentative="1">
+      <w:start w:val="1"/>
+      <w:numFmt w:val="bullet"/>
+      <w:lvlText w:val=""/>
+      <w:lvlJc w:val="left"/>
+      <w:pPr>
+        <w:ind w:left="2160" w:hanging="360"/>
+      </w:pPr>
+      <w:rPr>
+        <w:rFonts w:ascii="Wingdings" w:hAnsi="Wingdings" w:hint="default"/>
+      </w:rPr>
+    </w:lvl>
+    <w:lvl w:ilvl="3" w:tplc="04090001" w:tentative="1">
+      <w:start w:val="1"/>
+      <w:numFmt w:val="bullet"/>
+      <w:lvlText w:val=""/>
+      <w:lvlJc w:val="left"/>
+      <w:pPr>
+        <w:ind w:left="2880" w:hanging="360"/>
+      </w:pPr>
+      <w:rPr>
+        <w:rFonts w:ascii="Symbol" w:hAnsi="Symbol" w:hint="default"/>
+      </w:rPr>
+    </w:lvl>
+    <w:lvl w:ilvl="4" w:tplc="04090003" w:tentative="1">
+      <w:start w:val="1"/>
+      <w:numFmt w:val="bullet"/>
+      <w:lvlText w:val="o"/>
+      <w:lvlJc w:val="left"/>
+      <w:pPr>
+        <w:ind w:left="3600" w:hanging="360"/>
+      </w:pPr>
+      <w:rPr>
+        <w:rFonts w:ascii="Courier New" w:hAnsi="Courier New" w:cs="Courier New" w:hint="default"/>
+      </w:rPr>
+    </w:lvl>
+    <w:lvl w:ilvl="5" w:tplc="04090005" w:tentative="1">
+      <w:start w:val="1"/>
+      <w:numFmt w:val="bullet"/>
+      <w:lvlText w:val=""/>
+      <w:lvlJc w:val="left"/>
+      <w:pPr>
+        <w:ind w:left="4320" w:hanging="360"/>
+      </w:pPr>
+      <w:rPr>
+        <w:rFonts w:ascii="Wingdings" w:hAnsi="Wingdings" w:hint="default"/>
+      </w:rPr>
+    </w:lvl>
+    <w:lvl w:ilvl="6" w:tplc="04090001" w:tentative="1">
+      <w:start w:val="1"/>
+      <w:numFmt w:val="bullet"/>
+      <w:lvlText w:val=""/>
+      <w:lvlJc w:val="left"/>
+      <w:pPr>
+        <w:ind w:left="5040" w:hanging="360"/>
+      </w:pPr>
+      <w:rPr>
+        <w:rFonts w:ascii="Symbol" w:hAnsi="Symbol" w:hint="default"/>
+      </w:rPr>
+    </w:lvl>
+    <w:lvl w:ilvl="7" w:tplc="04090003" w:tentative="1">
+      <w:start w:val="1"/>
+      <w:numFmt w:val="bullet"/>
+      <w:lvlText w:val="o"/>
+      <w:lvlJc w:val="left"/>
+      <w:pPr>
+        <w:ind w:left="5760" w:hanging="360"/>
+      </w:pPr>
+      <w:rPr>
+        <w:rFonts w:ascii="Courier New" w:hAnsi="Courier New" w:cs="Courier New" w:hint="default"/>
+      </w:rPr>
+    </w:lvl>
+    <w:lvl w:ilvl="8" w:tplc="04090005" w:tentative="1">
+      <w:start w:val="1"/>
+      <w:numFmt w:val="bullet"/>
+      <w:lvlText w:val=""/>
+      <w:lvlJc w:val="left"/>
+      <w:pPr>
+        <w:ind w:left="6480" w:hanging="360"/>
+      </w:pPr>
+      <w:rPr>
+        <w:rFonts w:ascii="Wingdings" w:hAnsi="Wingdings" w:hint="default"/>
+      </w:rPr>
+    </w:lvl>
+  </w:abstractNum>
+  <w:abstractNum w:abstractNumId="19" w15:restartNumberingAfterBreak="0">
+    <w:nsid w:val="39733BA1"/>
+    <w:multiLevelType w:val="hybridMultilevel"/>
+    <w:tmpl w:val="ADEA753E"/>
+    <w:lvl w:ilvl="0" w:tplc="0409000F">
+      <w:start w:val="1"/>
+      <w:numFmt w:val="decimal"/>
+      <w:lvlText w:val="%1."/>
+      <w:lvlJc w:val="left"/>
+      <w:pPr>
+        <w:ind w:left="720" w:hanging="360"/>
+      </w:pPr>
+    </w:lvl>
+    <w:lvl w:ilvl="1" w:tplc="04090019" w:tentative="1">
+      <w:start w:val="1"/>
+      <w:numFmt w:val="lowerLetter"/>
+      <w:lvlText w:val="%2."/>
+      <w:lvlJc w:val="left"/>
+      <w:pPr>
+        <w:ind w:left="1440" w:hanging="360"/>
+      </w:pPr>
+    </w:lvl>
+    <w:lvl w:ilvl="2" w:tplc="0409001B" w:tentative="1">
+      <w:start w:val="1"/>
+      <w:numFmt w:val="lowerRoman"/>
+      <w:lvlText w:val="%3."/>
+      <w:lvlJc w:val="right"/>
+      <w:pPr>
+        <w:ind w:left="2160" w:hanging="180"/>
+      </w:pPr>
+    </w:lvl>
+    <w:lvl w:ilvl="3" w:tplc="0409000F" w:tentative="1">
+      <w:start w:val="1"/>
+      <w:numFmt w:val="decimal"/>
+      <w:lvlText w:val="%4."/>
+      <w:lvlJc w:val="left"/>
+      <w:pPr>
+        <w:ind w:left="2880" w:hanging="360"/>
+      </w:pPr>
+    </w:lvl>
+    <w:lvl w:ilvl="4" w:tplc="04090019" w:tentative="1">
+      <w:start w:val="1"/>
+      <w:numFmt w:val="lowerLetter"/>
+      <w:lvlText w:val="%5."/>
+      <w:lvlJc w:val="left"/>
+      <w:pPr>
+        <w:ind w:left="3600" w:hanging="360"/>
+      </w:pPr>
+    </w:lvl>
+    <w:lvl w:ilvl="5" w:tplc="0409001B" w:tentative="1">
+      <w:start w:val="1"/>
+      <w:numFmt w:val="lowerRoman"/>
+      <w:lvlText w:val="%6."/>
+      <w:lvlJc w:val="right"/>
+      <w:pPr>
+        <w:ind w:left="4320" w:hanging="180"/>
+      </w:pPr>
+    </w:lvl>
+    <w:lvl w:ilvl="6" w:tplc="0409000F" w:tentative="1">
+      <w:start w:val="1"/>
+      <w:numFmt w:val="decimal"/>
+      <w:lvlText w:val="%7."/>
+      <w:lvlJc w:val="left"/>
+      <w:pPr>
+        <w:ind w:left="5040" w:hanging="360"/>
+      </w:pPr>
+    </w:lvl>
+    <w:lvl w:ilvl="7" w:tplc="04090019" w:tentative="1">
+      <w:start w:val="1"/>
+      <w:numFmt w:val="lowerLetter"/>
+      <w:lvlText w:val="%8."/>
+      <w:lvlJc w:val="left"/>
+      <w:pPr>
+        <w:ind w:left="5760" w:hanging="360"/>
+      </w:pPr>
+    </w:lvl>
+    <w:lvl w:ilvl="8" w:tplc="0409001B" w:tentative="1">
+      <w:start w:val="1"/>
+      <w:numFmt w:val="lowerRoman"/>
+      <w:lvlText w:val="%9."/>
+      <w:lvlJc w:val="right"/>
+      <w:pPr>
+        <w:ind w:left="6480" w:hanging="180"/>
+      </w:pPr>
+    </w:lvl>
+  </w:abstractNum>
+  <w:abstractNum w:abstractNumId="20" w15:restartNumberingAfterBreak="0">
     <w:nsid w:val="3BA023F2"/>
     <w:multiLevelType w:val="hybridMultilevel"/>
     <w:tmpl w:val="4450241C"/>
@@ -16364,7 +19248,7 @@
       </w:rPr>
     </w:lvl>
   </w:abstractNum>
-  <w:abstractNum w:abstractNumId="18" w15:restartNumberingAfterBreak="0">
+  <w:abstractNum w:abstractNumId="21" w15:restartNumberingAfterBreak="0">
     <w:nsid w:val="3FB65E97"/>
     <w:multiLevelType w:val="hybridMultilevel"/>
     <w:tmpl w:val="CE26132A"/>
@@ -16477,7 +19361,7 @@
       </w:rPr>
     </w:lvl>
   </w:abstractNum>
-  <w:abstractNum w:abstractNumId="19" w15:restartNumberingAfterBreak="0">
+  <w:abstractNum w:abstractNumId="22" w15:restartNumberingAfterBreak="0">
     <w:nsid w:val="40292C1D"/>
     <w:multiLevelType w:val="hybridMultilevel"/>
     <w:tmpl w:val="088C44C4"/>
@@ -16590,7 +19474,233 @@
       </w:rPr>
     </w:lvl>
   </w:abstractNum>
-  <w:abstractNum w:abstractNumId="20" w15:restartNumberingAfterBreak="0">
+  <w:abstractNum w:abstractNumId="23" w15:restartNumberingAfterBreak="0">
+    <w:nsid w:val="41464B9E"/>
+    <w:multiLevelType w:val="hybridMultilevel"/>
+    <w:tmpl w:val="416E9C96"/>
+    <w:lvl w:ilvl="0" w:tplc="04090001">
+      <w:start w:val="1"/>
+      <w:numFmt w:val="bullet"/>
+      <w:lvlText w:val=""/>
+      <w:lvlJc w:val="left"/>
+      <w:pPr>
+        <w:ind w:left="720" w:hanging="360"/>
+      </w:pPr>
+      <w:rPr>
+        <w:rFonts w:ascii="Symbol" w:hAnsi="Symbol" w:hint="default"/>
+      </w:rPr>
+    </w:lvl>
+    <w:lvl w:ilvl="1" w:tplc="04090003" w:tentative="1">
+      <w:start w:val="1"/>
+      <w:numFmt w:val="bullet"/>
+      <w:lvlText w:val="o"/>
+      <w:lvlJc w:val="left"/>
+      <w:pPr>
+        <w:ind w:left="1440" w:hanging="360"/>
+      </w:pPr>
+      <w:rPr>
+        <w:rFonts w:ascii="Courier New" w:hAnsi="Courier New" w:cs="Courier New" w:hint="default"/>
+      </w:rPr>
+    </w:lvl>
+    <w:lvl w:ilvl="2" w:tplc="04090005" w:tentative="1">
+      <w:start w:val="1"/>
+      <w:numFmt w:val="bullet"/>
+      <w:lvlText w:val=""/>
+      <w:lvlJc w:val="left"/>
+      <w:pPr>
+        <w:ind w:left="2160" w:hanging="360"/>
+      </w:pPr>
+      <w:rPr>
+        <w:rFonts w:ascii="Wingdings" w:hAnsi="Wingdings" w:hint="default"/>
+      </w:rPr>
+    </w:lvl>
+    <w:lvl w:ilvl="3" w:tplc="04090001" w:tentative="1">
+      <w:start w:val="1"/>
+      <w:numFmt w:val="bullet"/>
+      <w:lvlText w:val=""/>
+      <w:lvlJc w:val="left"/>
+      <w:pPr>
+        <w:ind w:left="2880" w:hanging="360"/>
+      </w:pPr>
+      <w:rPr>
+        <w:rFonts w:ascii="Symbol" w:hAnsi="Symbol" w:hint="default"/>
+      </w:rPr>
+    </w:lvl>
+    <w:lvl w:ilvl="4" w:tplc="04090003" w:tentative="1">
+      <w:start w:val="1"/>
+      <w:numFmt w:val="bullet"/>
+      <w:lvlText w:val="o"/>
+      <w:lvlJc w:val="left"/>
+      <w:pPr>
+        <w:ind w:left="3600" w:hanging="360"/>
+      </w:pPr>
+      <w:rPr>
+        <w:rFonts w:ascii="Courier New" w:hAnsi="Courier New" w:cs="Courier New" w:hint="default"/>
+      </w:rPr>
+    </w:lvl>
+    <w:lvl w:ilvl="5" w:tplc="04090005" w:tentative="1">
+      <w:start w:val="1"/>
+      <w:numFmt w:val="bullet"/>
+      <w:lvlText w:val=""/>
+      <w:lvlJc w:val="left"/>
+      <w:pPr>
+        <w:ind w:left="4320" w:hanging="360"/>
+      </w:pPr>
+      <w:rPr>
+        <w:rFonts w:ascii="Wingdings" w:hAnsi="Wingdings" w:hint="default"/>
+      </w:rPr>
+    </w:lvl>
+    <w:lvl w:ilvl="6" w:tplc="04090001" w:tentative="1">
+      <w:start w:val="1"/>
+      <w:numFmt w:val="bullet"/>
+      <w:lvlText w:val=""/>
+      <w:lvlJc w:val="left"/>
+      <w:pPr>
+        <w:ind w:left="5040" w:hanging="360"/>
+      </w:pPr>
+      <w:rPr>
+        <w:rFonts w:ascii="Symbol" w:hAnsi="Symbol" w:hint="default"/>
+      </w:rPr>
+    </w:lvl>
+    <w:lvl w:ilvl="7" w:tplc="04090003" w:tentative="1">
+      <w:start w:val="1"/>
+      <w:numFmt w:val="bullet"/>
+      <w:lvlText w:val="o"/>
+      <w:lvlJc w:val="left"/>
+      <w:pPr>
+        <w:ind w:left="5760" w:hanging="360"/>
+      </w:pPr>
+      <w:rPr>
+        <w:rFonts w:ascii="Courier New" w:hAnsi="Courier New" w:cs="Courier New" w:hint="default"/>
+      </w:rPr>
+    </w:lvl>
+    <w:lvl w:ilvl="8" w:tplc="04090005" w:tentative="1">
+      <w:start w:val="1"/>
+      <w:numFmt w:val="bullet"/>
+      <w:lvlText w:val=""/>
+      <w:lvlJc w:val="left"/>
+      <w:pPr>
+        <w:ind w:left="6480" w:hanging="360"/>
+      </w:pPr>
+      <w:rPr>
+        <w:rFonts w:ascii="Wingdings" w:hAnsi="Wingdings" w:hint="default"/>
+      </w:rPr>
+    </w:lvl>
+  </w:abstractNum>
+  <w:abstractNum w:abstractNumId="24" w15:restartNumberingAfterBreak="0">
+    <w:nsid w:val="43EC77B9"/>
+    <w:multiLevelType w:val="hybridMultilevel"/>
+    <w:tmpl w:val="A0987284"/>
+    <w:lvl w:ilvl="0" w:tplc="0409000D">
+      <w:start w:val="1"/>
+      <w:numFmt w:val="bullet"/>
+      <w:lvlText w:val=""/>
+      <w:lvlJc w:val="left"/>
+      <w:pPr>
+        <w:ind w:left="720" w:hanging="360"/>
+      </w:pPr>
+      <w:rPr>
+        <w:rFonts w:ascii="Wingdings" w:hAnsi="Wingdings" w:hint="default"/>
+      </w:rPr>
+    </w:lvl>
+    <w:lvl w:ilvl="1" w:tplc="04090003" w:tentative="1">
+      <w:start w:val="1"/>
+      <w:numFmt w:val="bullet"/>
+      <w:lvlText w:val="o"/>
+      <w:lvlJc w:val="left"/>
+      <w:pPr>
+        <w:ind w:left="1440" w:hanging="360"/>
+      </w:pPr>
+      <w:rPr>
+        <w:rFonts w:ascii="Courier New" w:hAnsi="Courier New" w:cs="Courier New" w:hint="default"/>
+      </w:rPr>
+    </w:lvl>
+    <w:lvl w:ilvl="2" w:tplc="04090005" w:tentative="1">
+      <w:start w:val="1"/>
+      <w:numFmt w:val="bullet"/>
+      <w:lvlText w:val=""/>
+      <w:lvlJc w:val="left"/>
+      <w:pPr>
+        <w:ind w:left="2160" w:hanging="360"/>
+      </w:pPr>
+      <w:rPr>
+        <w:rFonts w:ascii="Wingdings" w:hAnsi="Wingdings" w:hint="default"/>
+      </w:rPr>
+    </w:lvl>
+    <w:lvl w:ilvl="3" w:tplc="04090001" w:tentative="1">
+      <w:start w:val="1"/>
+      <w:numFmt w:val="bullet"/>
+      <w:lvlText w:val=""/>
+      <w:lvlJc w:val="left"/>
+      <w:pPr>
+        <w:ind w:left="2880" w:hanging="360"/>
+      </w:pPr>
+      <w:rPr>
+        <w:rFonts w:ascii="Symbol" w:hAnsi="Symbol" w:hint="default"/>
+      </w:rPr>
+    </w:lvl>
+    <w:lvl w:ilvl="4" w:tplc="04090003" w:tentative="1">
+      <w:start w:val="1"/>
+      <w:numFmt w:val="bullet"/>
+      <w:lvlText w:val="o"/>
+      <w:lvlJc w:val="left"/>
+      <w:pPr>
+        <w:ind w:left="3600" w:hanging="360"/>
+      </w:pPr>
+      <w:rPr>
+        <w:rFonts w:ascii="Courier New" w:hAnsi="Courier New" w:cs="Courier New" w:hint="default"/>
+      </w:rPr>
+    </w:lvl>
+    <w:lvl w:ilvl="5" w:tplc="04090005" w:tentative="1">
+      <w:start w:val="1"/>
+      <w:numFmt w:val="bullet"/>
+      <w:lvlText w:val=""/>
+      <w:lvlJc w:val="left"/>
+      <w:pPr>
+        <w:ind w:left="4320" w:hanging="360"/>
+      </w:pPr>
+      <w:rPr>
+        <w:rFonts w:ascii="Wingdings" w:hAnsi="Wingdings" w:hint="default"/>
+      </w:rPr>
+    </w:lvl>
+    <w:lvl w:ilvl="6" w:tplc="04090001" w:tentative="1">
+      <w:start w:val="1"/>
+      <w:numFmt w:val="bullet"/>
+      <w:lvlText w:val=""/>
+      <w:lvlJc w:val="left"/>
+      <w:pPr>
+        <w:ind w:left="5040" w:hanging="360"/>
+      </w:pPr>
+      <w:rPr>
+        <w:rFonts w:ascii="Symbol" w:hAnsi="Symbol" w:hint="default"/>
+      </w:rPr>
+    </w:lvl>
+    <w:lvl w:ilvl="7" w:tplc="04090003" w:tentative="1">
+      <w:start w:val="1"/>
+      <w:numFmt w:val="bullet"/>
+      <w:lvlText w:val="o"/>
+      <w:lvlJc w:val="left"/>
+      <w:pPr>
+        <w:ind w:left="5760" w:hanging="360"/>
+      </w:pPr>
+      <w:rPr>
+        <w:rFonts w:ascii="Courier New" w:hAnsi="Courier New" w:cs="Courier New" w:hint="default"/>
+      </w:rPr>
+    </w:lvl>
+    <w:lvl w:ilvl="8" w:tplc="04090005" w:tentative="1">
+      <w:start w:val="1"/>
+      <w:numFmt w:val="bullet"/>
+      <w:lvlText w:val=""/>
+      <w:lvlJc w:val="left"/>
+      <w:pPr>
+        <w:ind w:left="6480" w:hanging="360"/>
+      </w:pPr>
+      <w:rPr>
+        <w:rFonts w:ascii="Wingdings" w:hAnsi="Wingdings" w:hint="default"/>
+      </w:rPr>
+    </w:lvl>
+  </w:abstractNum>
+  <w:abstractNum w:abstractNumId="25" w15:restartNumberingAfterBreak="0">
     <w:nsid w:val="4D8240E4"/>
     <w:multiLevelType w:val="hybridMultilevel"/>
     <w:tmpl w:val="DC86B8A6"/>
@@ -16703,7 +19813,7 @@
       </w:rPr>
     </w:lvl>
   </w:abstractNum>
-  <w:abstractNum w:abstractNumId="21" w15:restartNumberingAfterBreak="0">
+  <w:abstractNum w:abstractNumId="26" w15:restartNumberingAfterBreak="0">
     <w:nsid w:val="55FD1528"/>
     <w:multiLevelType w:val="hybridMultilevel"/>
     <w:tmpl w:val="B5680EB4"/>
@@ -16816,7 +19926,7 @@
       </w:rPr>
     </w:lvl>
   </w:abstractNum>
-  <w:abstractNum w:abstractNumId="22" w15:restartNumberingAfterBreak="0">
+  <w:abstractNum w:abstractNumId="27" w15:restartNumberingAfterBreak="0">
     <w:nsid w:val="61C87F02"/>
     <w:multiLevelType w:val="hybridMultilevel"/>
     <w:tmpl w:val="7E981BBA"/>
@@ -16929,7 +20039,7 @@
       </w:rPr>
     </w:lvl>
   </w:abstractNum>
-  <w:abstractNum w:abstractNumId="23" w15:restartNumberingAfterBreak="0">
+  <w:abstractNum w:abstractNumId="28" w15:restartNumberingAfterBreak="0">
     <w:nsid w:val="631149AB"/>
     <w:multiLevelType w:val="hybridMultilevel"/>
     <w:tmpl w:val="B0CE3CD8"/>
@@ -17042,7 +20152,93 @@
       </w:rPr>
     </w:lvl>
   </w:abstractNum>
-  <w:abstractNum w:abstractNumId="24" w15:restartNumberingAfterBreak="0">
+  <w:abstractNum w:abstractNumId="29" w15:restartNumberingAfterBreak="0">
+    <w:nsid w:val="673F2F2B"/>
+    <w:multiLevelType w:val="hybridMultilevel"/>
+    <w:tmpl w:val="7EFE6A9C"/>
+    <w:lvl w:ilvl="0" w:tplc="0409000F">
+      <w:start w:val="1"/>
+      <w:numFmt w:val="decimal"/>
+      <w:lvlText w:val="%1."/>
+      <w:lvlJc w:val="left"/>
+      <w:pPr>
+        <w:ind w:left="720" w:hanging="360"/>
+      </w:pPr>
+    </w:lvl>
+    <w:lvl w:ilvl="1" w:tplc="04090019" w:tentative="1">
+      <w:start w:val="1"/>
+      <w:numFmt w:val="lowerLetter"/>
+      <w:lvlText w:val="%2."/>
+      <w:lvlJc w:val="left"/>
+      <w:pPr>
+        <w:ind w:left="1440" w:hanging="360"/>
+      </w:pPr>
+    </w:lvl>
+    <w:lvl w:ilvl="2" w:tplc="0409001B" w:tentative="1">
+      <w:start w:val="1"/>
+      <w:numFmt w:val="lowerRoman"/>
+      <w:lvlText w:val="%3."/>
+      <w:lvlJc w:val="right"/>
+      <w:pPr>
+        <w:ind w:left="2160" w:hanging="180"/>
+      </w:pPr>
+    </w:lvl>
+    <w:lvl w:ilvl="3" w:tplc="0409000F" w:tentative="1">
+      <w:start w:val="1"/>
+      <w:numFmt w:val="decimal"/>
+      <w:lvlText w:val="%4."/>
+      <w:lvlJc w:val="left"/>
+      <w:pPr>
+        <w:ind w:left="2880" w:hanging="360"/>
+      </w:pPr>
+    </w:lvl>
+    <w:lvl w:ilvl="4" w:tplc="04090019" w:tentative="1">
+      <w:start w:val="1"/>
+      <w:numFmt w:val="lowerLetter"/>
+      <w:lvlText w:val="%5."/>
+      <w:lvlJc w:val="left"/>
+      <w:pPr>
+        <w:ind w:left="3600" w:hanging="360"/>
+      </w:pPr>
+    </w:lvl>
+    <w:lvl w:ilvl="5" w:tplc="0409001B" w:tentative="1">
+      <w:start w:val="1"/>
+      <w:numFmt w:val="lowerRoman"/>
+      <w:lvlText w:val="%6."/>
+      <w:lvlJc w:val="right"/>
+      <w:pPr>
+        <w:ind w:left="4320" w:hanging="180"/>
+      </w:pPr>
+    </w:lvl>
+    <w:lvl w:ilvl="6" w:tplc="0409000F" w:tentative="1">
+      <w:start w:val="1"/>
+      <w:numFmt w:val="decimal"/>
+      <w:lvlText w:val="%7."/>
+      <w:lvlJc w:val="left"/>
+      <w:pPr>
+        <w:ind w:left="5040" w:hanging="360"/>
+      </w:pPr>
+    </w:lvl>
+    <w:lvl w:ilvl="7" w:tplc="04090019" w:tentative="1">
+      <w:start w:val="1"/>
+      <w:numFmt w:val="lowerLetter"/>
+      <w:lvlText w:val="%8."/>
+      <w:lvlJc w:val="left"/>
+      <w:pPr>
+        <w:ind w:left="5760" w:hanging="360"/>
+      </w:pPr>
+    </w:lvl>
+    <w:lvl w:ilvl="8" w:tplc="0409001B" w:tentative="1">
+      <w:start w:val="1"/>
+      <w:numFmt w:val="lowerRoman"/>
+      <w:lvlText w:val="%9."/>
+      <w:lvlJc w:val="right"/>
+      <w:pPr>
+        <w:ind w:left="6480" w:hanging="180"/>
+      </w:pPr>
+    </w:lvl>
+  </w:abstractNum>
+  <w:abstractNum w:abstractNumId="30" w15:restartNumberingAfterBreak="0">
     <w:nsid w:val="68F53A0A"/>
     <w:multiLevelType w:val="hybridMultilevel"/>
     <w:tmpl w:val="ABC66F12"/>
@@ -17155,7 +20351,7 @@
       </w:rPr>
     </w:lvl>
   </w:abstractNum>
-  <w:abstractNum w:abstractNumId="25" w15:restartNumberingAfterBreak="0">
+  <w:abstractNum w:abstractNumId="31" w15:restartNumberingAfterBreak="0">
     <w:nsid w:val="692F73D6"/>
     <w:multiLevelType w:val="hybridMultilevel"/>
     <w:tmpl w:val="6368E990"/>
@@ -17268,7 +20464,7 @@
       </w:rPr>
     </w:lvl>
   </w:abstractNum>
-  <w:abstractNum w:abstractNumId="26" w15:restartNumberingAfterBreak="0">
+  <w:abstractNum w:abstractNumId="32" w15:restartNumberingAfterBreak="0">
     <w:nsid w:val="6CD457DD"/>
     <w:multiLevelType w:val="hybridMultilevel"/>
     <w:tmpl w:val="E8E672DA"/>
@@ -17381,7 +20577,7 @@
       </w:rPr>
     </w:lvl>
   </w:abstractNum>
-  <w:abstractNum w:abstractNumId="27" w15:restartNumberingAfterBreak="0">
+  <w:abstractNum w:abstractNumId="33" w15:restartNumberingAfterBreak="0">
     <w:nsid w:val="76CE1445"/>
     <w:multiLevelType w:val="hybridMultilevel"/>
     <w:tmpl w:val="B69ACF90"/>
@@ -17494,7 +20690,7 @@
       </w:rPr>
     </w:lvl>
   </w:abstractNum>
-  <w:abstractNum w:abstractNumId="28" w15:restartNumberingAfterBreak="0">
+  <w:abstractNum w:abstractNumId="34" w15:restartNumberingAfterBreak="0">
     <w:nsid w:val="7846635A"/>
     <w:multiLevelType w:val="hybridMultilevel"/>
     <w:tmpl w:val="1E5C3AA0"/>
@@ -17607,7 +20803,120 @@
       </w:rPr>
     </w:lvl>
   </w:abstractNum>
-  <w:abstractNum w:abstractNumId="29" w15:restartNumberingAfterBreak="0">
+  <w:abstractNum w:abstractNumId="35" w15:restartNumberingAfterBreak="0">
+    <w:nsid w:val="7A9D2409"/>
+    <w:multiLevelType w:val="hybridMultilevel"/>
+    <w:tmpl w:val="84AEA7C0"/>
+    <w:lvl w:ilvl="0" w:tplc="04090001">
+      <w:start w:val="1"/>
+      <w:numFmt w:val="bullet"/>
+      <w:lvlText w:val=""/>
+      <w:lvlJc w:val="left"/>
+      <w:pPr>
+        <w:ind w:left="720" w:hanging="360"/>
+      </w:pPr>
+      <w:rPr>
+        <w:rFonts w:ascii="Symbol" w:hAnsi="Symbol" w:hint="default"/>
+      </w:rPr>
+    </w:lvl>
+    <w:lvl w:ilvl="1" w:tplc="04090003" w:tentative="1">
+      <w:start w:val="1"/>
+      <w:numFmt w:val="bullet"/>
+      <w:lvlText w:val="o"/>
+      <w:lvlJc w:val="left"/>
+      <w:pPr>
+        <w:ind w:left="1440" w:hanging="360"/>
+      </w:pPr>
+      <w:rPr>
+        <w:rFonts w:ascii="Courier New" w:hAnsi="Courier New" w:cs="Courier New" w:hint="default"/>
+      </w:rPr>
+    </w:lvl>
+    <w:lvl w:ilvl="2" w:tplc="04090005" w:tentative="1">
+      <w:start w:val="1"/>
+      <w:numFmt w:val="bullet"/>
+      <w:lvlText w:val=""/>
+      <w:lvlJc w:val="left"/>
+      <w:pPr>
+        <w:ind w:left="2160" w:hanging="360"/>
+      </w:pPr>
+      <w:rPr>
+        <w:rFonts w:ascii="Wingdings" w:hAnsi="Wingdings" w:hint="default"/>
+      </w:rPr>
+    </w:lvl>
+    <w:lvl w:ilvl="3" w:tplc="04090001" w:tentative="1">
+      <w:start w:val="1"/>
+      <w:numFmt w:val="bullet"/>
+      <w:lvlText w:val=""/>
+      <w:lvlJc w:val="left"/>
+      <w:pPr>
+        <w:ind w:left="2880" w:hanging="360"/>
+      </w:pPr>
+      <w:rPr>
+        <w:rFonts w:ascii="Symbol" w:hAnsi="Symbol" w:hint="default"/>
+      </w:rPr>
+    </w:lvl>
+    <w:lvl w:ilvl="4" w:tplc="04090003" w:tentative="1">
+      <w:start w:val="1"/>
+      <w:numFmt w:val="bullet"/>
+      <w:lvlText w:val="o"/>
+      <w:lvlJc w:val="left"/>
+      <w:pPr>
+        <w:ind w:left="3600" w:hanging="360"/>
+      </w:pPr>
+      <w:rPr>
+        <w:rFonts w:ascii="Courier New" w:hAnsi="Courier New" w:cs="Courier New" w:hint="default"/>
+      </w:rPr>
+    </w:lvl>
+    <w:lvl w:ilvl="5" w:tplc="04090005" w:tentative="1">
+      <w:start w:val="1"/>
+      <w:numFmt w:val="bullet"/>
+      <w:lvlText w:val=""/>
+      <w:lvlJc w:val="left"/>
+      <w:pPr>
+        <w:ind w:left="4320" w:hanging="360"/>
+      </w:pPr>
+      <w:rPr>
+        <w:rFonts w:ascii="Wingdings" w:hAnsi="Wingdings" w:hint="default"/>
+      </w:rPr>
+    </w:lvl>
+    <w:lvl w:ilvl="6" w:tplc="04090001" w:tentative="1">
+      <w:start w:val="1"/>
+      <w:numFmt w:val="bullet"/>
+      <w:lvlText w:val=""/>
+      <w:lvlJc w:val="left"/>
+      <w:pPr>
+        <w:ind w:left="5040" w:hanging="360"/>
+      </w:pPr>
+      <w:rPr>
+        <w:rFonts w:ascii="Symbol" w:hAnsi="Symbol" w:hint="default"/>
+      </w:rPr>
+    </w:lvl>
+    <w:lvl w:ilvl="7" w:tplc="04090003" w:tentative="1">
+      <w:start w:val="1"/>
+      <w:numFmt w:val="bullet"/>
+      <w:lvlText w:val="o"/>
+      <w:lvlJc w:val="left"/>
+      <w:pPr>
+        <w:ind w:left="5760" w:hanging="360"/>
+      </w:pPr>
+      <w:rPr>
+        <w:rFonts w:ascii="Courier New" w:hAnsi="Courier New" w:cs="Courier New" w:hint="default"/>
+      </w:rPr>
+    </w:lvl>
+    <w:lvl w:ilvl="8" w:tplc="04090005" w:tentative="1">
+      <w:start w:val="1"/>
+      <w:numFmt w:val="bullet"/>
+      <w:lvlText w:val=""/>
+      <w:lvlJc w:val="left"/>
+      <w:pPr>
+        <w:ind w:left="6480" w:hanging="360"/>
+      </w:pPr>
+      <w:rPr>
+        <w:rFonts w:ascii="Wingdings" w:hAnsi="Wingdings" w:hint="default"/>
+      </w:rPr>
+    </w:lvl>
+  </w:abstractNum>
+  <w:abstractNum w:abstractNumId="36" w15:restartNumberingAfterBreak="0">
     <w:nsid w:val="7E9B5381"/>
     <w:multiLevelType w:val="hybridMultilevel"/>
     <w:tmpl w:val="8F30C92E"/>
@@ -17694,49 +21003,49 @@
     </w:lvl>
   </w:abstractNum>
   <w:num w:numId="1" w16cid:durableId="2129350270">
-    <w:abstractNumId w:val="28"/>
+    <w:abstractNumId w:val="34"/>
   </w:num>
   <w:num w:numId="2" w16cid:durableId="1507986212">
-    <w:abstractNumId w:val="8"/>
+    <w:abstractNumId w:val="9"/>
   </w:num>
   <w:num w:numId="3" w16cid:durableId="633608864">
-    <w:abstractNumId w:val="6"/>
+    <w:abstractNumId w:val="7"/>
   </w:num>
   <w:num w:numId="4" w16cid:durableId="1884174538">
-    <w:abstractNumId w:val="22"/>
+    <w:abstractNumId w:val="27"/>
   </w:num>
   <w:num w:numId="5" w16cid:durableId="232936823">
-    <w:abstractNumId w:val="19"/>
+    <w:abstractNumId w:val="22"/>
   </w:num>
   <w:num w:numId="6" w16cid:durableId="807744815">
     <w:abstractNumId w:val="4"/>
   </w:num>
   <w:num w:numId="7" w16cid:durableId="1361205449">
-    <w:abstractNumId w:val="21"/>
+    <w:abstractNumId w:val="26"/>
   </w:num>
   <w:num w:numId="8" w16cid:durableId="320081310">
-    <w:abstractNumId w:val="14"/>
+    <w:abstractNumId w:val="15"/>
   </w:num>
   <w:num w:numId="9" w16cid:durableId="877354264">
+    <w:abstractNumId w:val="20"/>
+  </w:num>
+  <w:num w:numId="10" w16cid:durableId="228540988">
     <w:abstractNumId w:val="17"/>
   </w:num>
-  <w:num w:numId="10" w16cid:durableId="228540988">
-    <w:abstractNumId w:val="16"/>
-  </w:num>
   <w:num w:numId="11" w16cid:durableId="85812690">
-    <w:abstractNumId w:val="27"/>
+    <w:abstractNumId w:val="33"/>
   </w:num>
   <w:num w:numId="12" w16cid:durableId="1007052913">
-    <w:abstractNumId w:val="11"/>
+    <w:abstractNumId w:val="12"/>
   </w:num>
   <w:num w:numId="13" w16cid:durableId="1970015505">
-    <w:abstractNumId w:val="24"/>
+    <w:abstractNumId w:val="30"/>
   </w:num>
   <w:num w:numId="14" w16cid:durableId="808284517">
     <w:abstractNumId w:val="5"/>
   </w:num>
   <w:num w:numId="15" w16cid:durableId="1667440909">
-    <w:abstractNumId w:val="10"/>
+    <w:abstractNumId w:val="11"/>
   </w:num>
   <w:num w:numId="16" w16cid:durableId="1898973340">
     <w:abstractNumId w:val="2"/>
@@ -17745,43 +21054,64 @@
     <w:abstractNumId w:val="3"/>
   </w:num>
   <w:num w:numId="18" w16cid:durableId="1400907114">
-    <w:abstractNumId w:val="9"/>
+    <w:abstractNumId w:val="10"/>
   </w:num>
   <w:num w:numId="19" w16cid:durableId="672609443">
     <w:abstractNumId w:val="1"/>
   </w:num>
   <w:num w:numId="20" w16cid:durableId="1061490202">
-    <w:abstractNumId w:val="18"/>
+    <w:abstractNumId w:val="21"/>
   </w:num>
   <w:num w:numId="21" w16cid:durableId="119963362">
-    <w:abstractNumId w:val="29"/>
+    <w:abstractNumId w:val="36"/>
   </w:num>
   <w:num w:numId="22" w16cid:durableId="512843405">
     <w:abstractNumId w:val="0"/>
   </w:num>
   <w:num w:numId="23" w16cid:durableId="1961062915">
-    <w:abstractNumId w:val="15"/>
+    <w:abstractNumId w:val="16"/>
   </w:num>
   <w:num w:numId="24" w16cid:durableId="758604051">
-    <w:abstractNumId w:val="20"/>
+    <w:abstractNumId w:val="25"/>
   </w:num>
   <w:num w:numId="25" w16cid:durableId="1606646357">
-    <w:abstractNumId w:val="25"/>
+    <w:abstractNumId w:val="31"/>
   </w:num>
   <w:num w:numId="26" w16cid:durableId="729427127">
-    <w:abstractNumId w:val="12"/>
+    <w:abstractNumId w:val="13"/>
   </w:num>
   <w:num w:numId="27" w16cid:durableId="1424105424">
-    <w:abstractNumId w:val="7"/>
+    <w:abstractNumId w:val="8"/>
   </w:num>
   <w:num w:numId="28" w16cid:durableId="147744123">
+    <w:abstractNumId w:val="28"/>
+  </w:num>
+  <w:num w:numId="29" w16cid:durableId="998967972">
+    <w:abstractNumId w:val="32"/>
+  </w:num>
+  <w:num w:numId="30" w16cid:durableId="1125076600">
+    <w:abstractNumId w:val="14"/>
+  </w:num>
+  <w:num w:numId="31" w16cid:durableId="342781838">
+    <w:abstractNumId w:val="35"/>
+  </w:num>
+  <w:num w:numId="32" w16cid:durableId="110826735">
     <w:abstractNumId w:val="23"/>
   </w:num>
-  <w:num w:numId="29" w16cid:durableId="998967972">
-    <w:abstractNumId w:val="26"/>
+  <w:num w:numId="33" w16cid:durableId="44988380">
+    <w:abstractNumId w:val="6"/>
   </w:num>
-  <w:num w:numId="30" w16cid:durableId="1125076600">
-    <w:abstractNumId w:val="13"/>
+  <w:num w:numId="34" w16cid:durableId="760760175">
+    <w:abstractNumId w:val="19"/>
+  </w:num>
+  <w:num w:numId="35" w16cid:durableId="15274973">
+    <w:abstractNumId w:val="18"/>
+  </w:num>
+  <w:num w:numId="36" w16cid:durableId="726613905">
+    <w:abstractNumId w:val="29"/>
+  </w:num>
+  <w:num w:numId="37" w16cid:durableId="1294559564">
+    <w:abstractNumId w:val="24"/>
   </w:num>
 </w:numbering>
 </file>
@@ -18389,6 +21719,7 @@
   <w:style w:type="character" w:default="1" w:styleId="DefaultParagraphFont">
     <w:name w:val="Default Paragraph Font"/>
     <w:uiPriority w:val="1"/>
+    <w:semiHidden/>
     <w:unhideWhenUsed/>
   </w:style>
   <w:style w:type="table" w:default="1" w:styleId="TableNormal">

</xml_diff>

<commit_message>
kubernetes - objects updated
</commit_message>
<xml_diff>
--- a/Kubernetes/3-objects.docx
+++ b/Kubernetes/3-objects.docx
@@ -13973,6 +13973,7 @@
     <w:p>
       <w:pPr>
         <w:spacing w:after="60"/>
+        <w:jc w:val="both"/>
         <w:rPr>
           <w:rFonts w:asciiTheme="majorBidi" w:hAnsiTheme="majorBidi" w:cstheme="majorBidi"/>
           <w:b/>
@@ -14182,6 +14183,7 @@
     <w:p>
       <w:pPr>
         <w:spacing w:after="60"/>
+        <w:jc w:val="both"/>
         <w:rPr>
           <w:rFonts w:asciiTheme="majorBidi" w:hAnsiTheme="majorBidi" w:cstheme="majorBidi"/>
           <w:b/>
@@ -14377,6 +14379,7 @@
     <w:p>
       <w:pPr>
         <w:spacing w:after="60"/>
+        <w:jc w:val="both"/>
         <w:rPr>
           <w:rFonts w:asciiTheme="majorBidi" w:hAnsiTheme="majorBidi" w:cstheme="majorBidi"/>
           <w:b/>
@@ -14409,6 +14412,7 @@
     <w:p>
       <w:pPr>
         <w:spacing w:after="80"/>
+        <w:jc w:val="both"/>
         <w:rPr>
           <w:rFonts w:asciiTheme="majorBidi" w:hAnsiTheme="majorBidi" w:cstheme="majorBidi"/>
           <w:sz w:val="28"/>
@@ -14689,6 +14693,7 @@
     </w:p>
     <w:p>
       <w:pPr>
+        <w:jc w:val="both"/>
         <w:rPr>
           <w:rFonts w:asciiTheme="majorBidi" w:hAnsiTheme="majorBidi" w:cstheme="majorBidi"/>
           <w:sz w:val="2"/>
@@ -15905,6 +15910,7 @@
         </w:numPr>
         <w:spacing w:after="60"/>
         <w:ind w:left="360"/>
+        <w:jc w:val="both"/>
         <w:rPr>
           <w:rFonts w:asciiTheme="majorBidi" w:hAnsiTheme="majorBidi" w:cstheme="majorBidi"/>
           <w:b/>
@@ -15978,6 +15984,7 @@
       <w:pPr>
         <w:spacing w:after="60"/>
         <w:ind w:left="360"/>
+        <w:jc w:val="both"/>
         <w:rPr>
           <w:rFonts w:asciiTheme="majorBidi" w:hAnsiTheme="majorBidi" w:cstheme="majorBidi"/>
           <w:b/>
@@ -16004,6 +16011,7 @@
           <w:ilvl w:val="0"/>
           <w:numId w:val="46"/>
         </w:numPr>
+        <w:jc w:val="both"/>
         <w:rPr>
           <w:rFonts w:asciiTheme="majorBidi" w:hAnsiTheme="majorBidi" w:cstheme="majorBidi"/>
           <w:sz w:val="28"/>
@@ -16026,6 +16034,7 @@
           <w:ilvl w:val="0"/>
           <w:numId w:val="46"/>
         </w:numPr>
+        <w:jc w:val="both"/>
         <w:rPr>
           <w:rFonts w:asciiTheme="majorBidi" w:hAnsiTheme="majorBidi" w:cstheme="majorBidi"/>
           <w:sz w:val="28"/>
@@ -16049,6 +16058,7 @@
           <w:numId w:val="46"/>
         </w:numPr>
         <w:spacing w:after="60"/>
+        <w:jc w:val="both"/>
         <w:rPr>
           <w:rFonts w:asciiTheme="majorBidi" w:hAnsiTheme="majorBidi" w:cstheme="majorBidi"/>
           <w:sz w:val="28"/>
@@ -16068,6 +16078,7 @@
       <w:pPr>
         <w:spacing w:after="60"/>
         <w:ind w:left="360"/>
+        <w:jc w:val="both"/>
         <w:rPr>
           <w:rFonts w:asciiTheme="majorBidi" w:hAnsiTheme="majorBidi" w:cstheme="majorBidi"/>
           <w:b/>
@@ -16093,6 +16104,7 @@
       <w:pPr>
         <w:spacing w:after="80"/>
         <w:ind w:left="360"/>
+        <w:jc w:val="both"/>
         <w:rPr>
           <w:rFonts w:asciiTheme="majorBidi" w:hAnsiTheme="majorBidi" w:cstheme="majorBidi"/>
           <w:sz w:val="28"/>
@@ -16145,6 +16157,7 @@
         </w:numPr>
         <w:spacing w:after="60"/>
         <w:ind w:left="360"/>
+        <w:jc w:val="both"/>
         <w:rPr>
           <w:rFonts w:asciiTheme="majorBidi" w:hAnsiTheme="majorBidi" w:cstheme="majorBidi"/>
           <w:b/>
@@ -16170,6 +16183,7 @@
       <w:pPr>
         <w:spacing w:after="60"/>
         <w:ind w:left="360"/>
+        <w:jc w:val="both"/>
         <w:rPr>
           <w:rFonts w:asciiTheme="majorBidi" w:hAnsiTheme="majorBidi" w:cstheme="majorBidi"/>
           <w:sz w:val="28"/>
@@ -16189,6 +16203,7 @@
       <w:pPr>
         <w:spacing w:after="60"/>
         <w:ind w:left="360"/>
+        <w:jc w:val="both"/>
         <w:rPr>
           <w:rFonts w:asciiTheme="majorBidi" w:hAnsiTheme="majorBidi" w:cstheme="majorBidi"/>
           <w:b/>
@@ -16215,6 +16230,7 @@
           <w:ilvl w:val="0"/>
           <w:numId w:val="48"/>
         </w:numPr>
+        <w:jc w:val="both"/>
         <w:rPr>
           <w:rFonts w:asciiTheme="majorBidi" w:hAnsiTheme="majorBidi" w:cstheme="majorBidi"/>
           <w:sz w:val="28"/>
@@ -16255,6 +16271,7 @@
           <w:ilvl w:val="0"/>
           <w:numId w:val="48"/>
         </w:numPr>
+        <w:jc w:val="both"/>
         <w:rPr>
           <w:rFonts w:asciiTheme="majorBidi" w:hAnsiTheme="majorBidi" w:cstheme="majorBidi"/>
           <w:sz w:val="28"/>
@@ -16277,6 +16294,7 @@
           <w:ilvl w:val="0"/>
           <w:numId w:val="48"/>
         </w:numPr>
+        <w:jc w:val="both"/>
         <w:rPr>
           <w:rFonts w:asciiTheme="majorBidi" w:hAnsiTheme="majorBidi" w:cstheme="majorBidi"/>
           <w:sz w:val="28"/>
@@ -16300,6 +16318,7 @@
           <w:numId w:val="48"/>
         </w:numPr>
         <w:spacing w:after="60"/>
+        <w:jc w:val="both"/>
         <w:rPr>
           <w:rFonts w:asciiTheme="majorBidi" w:hAnsiTheme="majorBidi" w:cstheme="majorBidi"/>
           <w:sz w:val="28"/>
@@ -16320,6 +16339,7 @@
       <w:pPr>
         <w:spacing w:after="60"/>
         <w:ind w:left="360"/>
+        <w:jc w:val="both"/>
         <w:rPr>
           <w:rFonts w:asciiTheme="majorBidi" w:hAnsiTheme="majorBidi" w:cstheme="majorBidi"/>
           <w:b/>
@@ -16343,6 +16363,7 @@
       <w:pPr>
         <w:spacing w:after="80"/>
         <w:ind w:left="360"/>
+        <w:jc w:val="both"/>
         <w:rPr>
           <w:rFonts w:asciiTheme="majorBidi" w:hAnsiTheme="majorBidi" w:cstheme="majorBidi"/>
           <w:sz w:val="28"/>
@@ -16389,7 +16410,25 @@
           <w:sz w:val="28"/>
           <w:szCs w:val="28"/>
         </w:rPr>
-        <w:t xml:space="preserve"> and carefully read the Events section</w:t>
+        <w:t xml:space="preserve"> and carefully read the </w:t>
+      </w:r>
+      <w:r>
+        <w:rPr>
+          <w:rFonts w:asciiTheme="majorBidi" w:hAnsiTheme="majorBidi" w:cstheme="majorBidi"/>
+          <w:b/>
+          <w:bCs/>
+          <w:sz w:val="28"/>
+          <w:szCs w:val="28"/>
+        </w:rPr>
+        <w:t>Events</w:t>
+      </w:r>
+      <w:r>
+        <w:rPr>
+          <w:rFonts w:asciiTheme="majorBidi" w:hAnsiTheme="majorBidi" w:cstheme="majorBidi"/>
+          <w:sz w:val="28"/>
+          <w:szCs w:val="28"/>
+        </w:rPr>
+        <w:t xml:space="preserve"> section</w:t>
       </w:r>
       <w:r>
         <w:rPr>
@@ -16417,6 +16456,7 @@
         </w:numPr>
         <w:spacing w:after="60"/>
         <w:ind w:left="360"/>
+        <w:jc w:val="both"/>
         <w:rPr>
           <w:rFonts w:asciiTheme="majorBidi" w:hAnsiTheme="majorBidi" w:cstheme="majorBidi"/>
           <w:b/>
@@ -16442,6 +16482,7 @@
       <w:pPr>
         <w:spacing w:after="60"/>
         <w:ind w:left="360"/>
+        <w:jc w:val="both"/>
         <w:rPr>
           <w:rFonts w:asciiTheme="majorBidi" w:hAnsiTheme="majorBidi" w:cstheme="majorBidi"/>
           <w:sz w:val="28"/>
@@ -16479,6 +16520,7 @@
       <w:pPr>
         <w:spacing w:after="60"/>
         <w:ind w:left="360"/>
+        <w:jc w:val="both"/>
         <w:rPr>
           <w:rFonts w:asciiTheme="majorBidi" w:hAnsiTheme="majorBidi" w:cstheme="majorBidi"/>
           <w:b/>
@@ -16505,6 +16547,7 @@
           <w:ilvl w:val="0"/>
           <w:numId w:val="50"/>
         </w:numPr>
+        <w:jc w:val="both"/>
         <w:rPr>
           <w:rFonts w:asciiTheme="majorBidi" w:hAnsiTheme="majorBidi" w:cstheme="majorBidi"/>
           <w:sz w:val="28"/>
@@ -16537,6 +16580,7 @@
           <w:ilvl w:val="0"/>
           <w:numId w:val="50"/>
         </w:numPr>
+        <w:jc w:val="both"/>
         <w:rPr>
           <w:rFonts w:asciiTheme="majorBidi" w:hAnsiTheme="majorBidi" w:cstheme="majorBidi"/>
           <w:sz w:val="28"/>
@@ -16559,6 +16603,7 @@
           <w:ilvl w:val="0"/>
           <w:numId w:val="50"/>
         </w:numPr>
+        <w:jc w:val="both"/>
         <w:rPr>
           <w:rFonts w:asciiTheme="majorBidi" w:hAnsiTheme="majorBidi" w:cstheme="majorBidi"/>
           <w:sz w:val="28"/>
@@ -16582,6 +16627,7 @@
           <w:numId w:val="50"/>
         </w:numPr>
         <w:spacing w:after="60"/>
+        <w:jc w:val="both"/>
         <w:rPr>
           <w:rFonts w:asciiTheme="majorBidi" w:hAnsiTheme="majorBidi" w:cstheme="majorBidi"/>
           <w:sz w:val="28"/>
@@ -16601,6 +16647,7 @@
       <w:pPr>
         <w:spacing w:after="80"/>
         <w:ind w:left="360"/>
+        <w:jc w:val="both"/>
         <w:rPr>
           <w:rFonts w:asciiTheme="majorBidi" w:hAnsiTheme="majorBidi" w:cstheme="majorBidi"/>
           <w:sz w:val="28"/>
@@ -16643,6 +16690,7 @@
         </w:numPr>
         <w:spacing w:after="60"/>
         <w:ind w:left="360"/>
+        <w:jc w:val="both"/>
         <w:rPr>
           <w:rFonts w:asciiTheme="majorBidi" w:hAnsiTheme="majorBidi" w:cstheme="majorBidi"/>
           <w:b/>
@@ -16668,6 +16716,7 @@
       <w:pPr>
         <w:spacing w:after="60"/>
         <w:ind w:left="360"/>
+        <w:jc w:val="both"/>
         <w:rPr>
           <w:rFonts w:asciiTheme="majorBidi" w:hAnsiTheme="majorBidi" w:cstheme="majorBidi"/>
           <w:sz w:val="28"/>
@@ -16713,6 +16762,7 @@
       <w:pPr>
         <w:spacing w:after="60"/>
         <w:ind w:left="360"/>
+        <w:jc w:val="both"/>
         <w:rPr>
           <w:rFonts w:asciiTheme="majorBidi" w:hAnsiTheme="majorBidi" w:cstheme="majorBidi"/>
           <w:sz w:val="28"/>
@@ -16735,6 +16785,7 @@
           <w:ilvl w:val="0"/>
           <w:numId w:val="52"/>
         </w:numPr>
+        <w:jc w:val="both"/>
         <w:rPr>
           <w:rFonts w:asciiTheme="majorBidi" w:hAnsiTheme="majorBidi" w:cstheme="majorBidi"/>
           <w:sz w:val="28"/>
@@ -16757,6 +16808,7 @@
           <w:ilvl w:val="0"/>
           <w:numId w:val="52"/>
         </w:numPr>
+        <w:jc w:val="both"/>
         <w:rPr>
           <w:rFonts w:asciiTheme="majorBidi" w:hAnsiTheme="majorBidi" w:cstheme="majorBidi"/>
           <w:sz w:val="28"/>
@@ -16779,6 +16831,7 @@
           <w:ilvl w:val="0"/>
           <w:numId w:val="52"/>
         </w:numPr>
+        <w:jc w:val="both"/>
         <w:rPr>
           <w:rFonts w:asciiTheme="majorBidi" w:hAnsiTheme="majorBidi" w:cstheme="majorBidi"/>
           <w:sz w:val="28"/>
@@ -18414,23 +18467,22 @@
     </w:p>
     <w:p>
       <w:pPr>
-        <w:rPr>
-          <w:rFonts w:asciiTheme="majorBidi" w:hAnsiTheme="majorBidi" w:cstheme="majorBidi"/>
-          <w:b/>
-          <w:bCs/>
-          <w:sz w:val="28"/>
-          <w:szCs w:val="28"/>
-          <w:u w:val="single"/>
-        </w:rPr>
-      </w:pPr>
-      <w:r>
-        <w:rPr>
-          <w:rFonts w:asciiTheme="majorBidi" w:hAnsiTheme="majorBidi" w:cstheme="majorBidi"/>
-          <w:b/>
-          <w:bCs/>
-          <w:sz w:val="28"/>
-          <w:szCs w:val="28"/>
-          <w:u w:val="single"/>
+        <w:spacing w:after="80"/>
+        <w:rPr>
+          <w:rFonts w:asciiTheme="majorBidi" w:hAnsiTheme="majorBidi" w:cstheme="majorBidi"/>
+          <w:b/>
+          <w:bCs/>
+          <w:sz w:val="28"/>
+          <w:szCs w:val="28"/>
+        </w:rPr>
+      </w:pPr>
+      <w:r>
+        <w:rPr>
+          <w:rFonts w:asciiTheme="majorBidi" w:hAnsiTheme="majorBidi" w:cstheme="majorBidi"/>
+          <w:b/>
+          <w:bCs/>
+          <w:sz w:val="28"/>
+          <w:szCs w:val="28"/>
         </w:rPr>
         <w:t>Quick Mental Model</w:t>
       </w:r>
@@ -27485,6 +27537,7 @@
           <w:ilvl w:val="5"/>
           <w:numId w:val="35"/>
         </w:numPr>
+        <w:spacing w:after="120"/>
         <w:ind w:left="720"/>
         <w:rPr>
           <w:rFonts w:asciiTheme="majorBidi" w:hAnsiTheme="majorBidi" w:cstheme="majorBidi"/>

</xml_diff>